<commit_message>
Modificacion de doc plan de pruebas
</commit_message>
<xml_diff>
--- a/Documentación/Plan_Pruebas/3.1.2 Plan Pruebas Funcionales.v2.docx
+++ b/Documentación/Plan_Pruebas/3.1.2 Plan Pruebas Funcionales.v2.docx
@@ -174,7 +174,15 @@
         </w:rPr>
       </w:pPr>
       <w:r>
-        <w:t>Grupo N° XX</w:t>
+        <w:t xml:space="preserve">Grupo </w:t>
+      </w:r>
+      <w:proofErr w:type="spellStart"/>
+      <w:r>
+        <w:t>N°</w:t>
+      </w:r>
+      <w:proofErr w:type="spellEnd"/>
+      <w:r>
+        <w:t xml:space="preserve"> XX</w:t>
       </w:r>
     </w:p>
     <w:p>
@@ -334,7 +342,7 @@
               </w:rPr>
             </w:pPr>
             <w:r>
-              <w:t>&lt;Nombre del cliente o público objetivo&gt;</w:t>
+              <w:t>Usuarios dueños de mascotas, empresas prestadoras de servicios y administrador del sistema</w:t>
             </w:r>
           </w:p>
         </w:tc>
@@ -532,11 +540,11 @@
                 <w:rFonts w:hint="eastAsia"/>
               </w:rPr>
             </w:pPr>
-            <w:fldSimple w:instr=" DOCPROPERTY &quot;Autor&quot; ">
-              <w:r>
-                <w:t>&lt;Nombre de la Empresa&gt;</w:t>
-              </w:r>
-            </w:fldSimple>
+            <w:proofErr w:type="spellStart"/>
+            <w:r>
+              <w:t>PetDate</w:t>
+            </w:r>
+            <w:proofErr w:type="spellEnd"/>
           </w:p>
         </w:tc>
       </w:tr>
@@ -597,11 +605,9 @@
                 <w:rFonts w:hint="eastAsia"/>
               </w:rPr>
             </w:pPr>
-            <w:proofErr w:type="spellStart"/>
-            <w:r>
-              <w:t>xxxx</w:t>
-            </w:r>
-            <w:proofErr w:type="spellEnd"/>
+            <w:r>
+              <w:t>1.0</w:t>
+            </w:r>
           </w:p>
         </w:tc>
         <w:tc>
@@ -663,7 +669,7 @@
               </w:rPr>
             </w:pPr>
             <w:r>
-              <w:t>DD/MM/AAAA</w:t>
+              <w:t>23/06/2026</w:t>
             </w:r>
           </w:p>
         </w:tc>
@@ -725,6 +731,9 @@
                 <w:rFonts w:hint="eastAsia"/>
               </w:rPr>
             </w:pPr>
+            <w:r>
+              <w:t>Docente guía / pendiente de aprobación</w:t>
+            </w:r>
           </w:p>
         </w:tc>
         <w:tc>
@@ -786,7 +795,7 @@
               </w:rPr>
             </w:pPr>
             <w:r>
-              <w:t>DD/MM/AAAA</w:t>
+              <w:t>Pendiente</w:t>
             </w:r>
           </w:p>
         </w:tc>
@@ -1086,7 +1095,7 @@
               </w:rPr>
             </w:pPr>
             <w:r>
-              <w:t>&lt;Nombre Apellido1 Apellido2&gt;</w:t>
+              <w:t>Camila González</w:t>
             </w:r>
           </w:p>
         </w:tc>
@@ -1115,7 +1124,7 @@
               </w:rPr>
             </w:pPr>
             <w:r>
-              <w:t>DD/MM/AAAA</w:t>
+              <w:t>22/06/2026</w:t>
             </w:r>
           </w:p>
         </w:tc>
@@ -1265,6 +1274,9 @@
                 <w:rFonts w:hint="eastAsia"/>
               </w:rPr>
             </w:pPr>
+            <w:r>
+              <w:t>003</w:t>
+            </w:r>
           </w:p>
         </w:tc>
         <w:tc>
@@ -1290,6 +1302,9 @@
                 <w:rFonts w:hint="eastAsia"/>
               </w:rPr>
             </w:pPr>
+            <w:r>
+              <w:t>Redacción y ajuste según planilla de casos de prueba</w:t>
+            </w:r>
           </w:p>
         </w:tc>
         <w:tc>
@@ -1315,6 +1330,14 @@
                 <w:rFonts w:hint="eastAsia"/>
               </w:rPr>
             </w:pPr>
+            <w:r>
+              <w:t xml:space="preserve">Equipo </w:t>
+            </w:r>
+            <w:proofErr w:type="spellStart"/>
+            <w:r>
+              <w:t>PetDate</w:t>
+            </w:r>
+            <w:proofErr w:type="spellEnd"/>
           </w:p>
         </w:tc>
         <w:tc>
@@ -1341,6 +1364,9 @@
                 <w:rFonts w:hint="eastAsia"/>
               </w:rPr>
             </w:pPr>
+            <w:r>
+              <w:t>24/06/2026</w:t>
+            </w:r>
           </w:p>
         </w:tc>
       </w:tr>
@@ -1462,7 +1488,7 @@
               </w:rPr>
             </w:pPr>
             <w:r>
-              <w:t>&lt;Nombre Apellido1 Apellido2&gt;</w:t>
+              <w:t>Camila González</w:t>
             </w:r>
           </w:p>
         </w:tc>
@@ -1491,6 +1517,9 @@
                 <w:rFonts w:hint="eastAsia"/>
               </w:rPr>
             </w:pPr>
+            <w:r>
+              <w:t>Francisco Agüero</w:t>
+            </w:r>
           </w:p>
         </w:tc>
       </w:tr>
@@ -1518,60 +1547,9 @@
                 <w:rFonts w:hint="eastAsia"/>
               </w:rPr>
             </w:pPr>
-          </w:p>
-        </w:tc>
-      </w:tr>
-      <w:tr>
-        <w:tc>
-          <w:tcPr>
-            <w:tcW w:w="9071" w:type="dxa"/>
-            <w:tcBorders>
-              <w:left w:val="single" w:sz="4" w:space="0" w:color="808080"/>
-              <w:bottom w:val="single" w:sz="4" w:space="0" w:color="808080"/>
-              <w:right w:val="single" w:sz="4" w:space="0" w:color="808080"/>
-            </w:tcBorders>
-            <w:tcMar>
-              <w:top w:w="55" w:type="dxa"/>
-              <w:left w:w="55" w:type="dxa"/>
-              <w:bottom w:w="55" w:type="dxa"/>
-              <w:right w:w="55" w:type="dxa"/>
-            </w:tcMar>
-            <w:vAlign w:val="center"/>
-          </w:tcPr>
-          <w:p>
-            <w:pPr>
-              <w:pStyle w:val="TableContents"/>
-              <w:rPr>
-                <w:rFonts w:hint="eastAsia"/>
-              </w:rPr>
-            </w:pPr>
-          </w:p>
-        </w:tc>
-      </w:tr>
-      <w:tr>
-        <w:tc>
-          <w:tcPr>
-            <w:tcW w:w="9071" w:type="dxa"/>
-            <w:tcBorders>
-              <w:left w:val="single" w:sz="4" w:space="0" w:color="808080"/>
-              <w:bottom w:val="single" w:sz="4" w:space="0" w:color="808080"/>
-              <w:right w:val="single" w:sz="4" w:space="0" w:color="808080"/>
-            </w:tcBorders>
-            <w:tcMar>
-              <w:top w:w="55" w:type="dxa"/>
-              <w:left w:w="55" w:type="dxa"/>
-              <w:bottom w:w="55" w:type="dxa"/>
-              <w:right w:w="55" w:type="dxa"/>
-            </w:tcMar>
-            <w:vAlign w:val="center"/>
-          </w:tcPr>
-          <w:p>
-            <w:pPr>
-              <w:pStyle w:val="TableContents"/>
-              <w:rPr>
-                <w:rFonts w:hint="eastAsia"/>
-              </w:rPr>
-            </w:pPr>
+            <w:r>
+              <w:t>Eliecer Salgado</w:t>
+            </w:r>
           </w:p>
         </w:tc>
       </w:tr>
@@ -1658,51 +1636,17 @@
     </w:p>
     <w:p>
       <w:pPr>
-        <w:pStyle w:val="Standard"/>
+        <w:rPr>
+          <w:rFonts w:ascii="NewsGotT" w:hAnsi="NewsGotT" w:hint="eastAsia"/>
+          <w:sz w:val="20"/>
+        </w:rPr>
+      </w:pPr>
+      <w:r>
         <w:rPr>
           <w:rFonts w:hint="eastAsia"/>
         </w:rPr>
-      </w:pPr>
-    </w:p>
-    <w:p>
-      <w:pPr>
-        <w:pStyle w:val="Standard"/>
-        <w:rPr>
-          <w:rFonts w:hint="eastAsia"/>
-        </w:rPr>
-      </w:pPr>
-    </w:p>
-    <w:p>
-      <w:pPr>
-        <w:pStyle w:val="Standard"/>
-        <w:rPr>
-          <w:rFonts w:hint="eastAsia"/>
-        </w:rPr>
-      </w:pPr>
-    </w:p>
-    <w:p>
-      <w:pPr>
-        <w:pStyle w:val="Standard"/>
-        <w:rPr>
-          <w:rFonts w:hint="eastAsia"/>
-        </w:rPr>
-      </w:pPr>
-    </w:p>
-    <w:p>
-      <w:pPr>
-        <w:pStyle w:val="Standard"/>
-        <w:rPr>
-          <w:rFonts w:hint="eastAsia"/>
-        </w:rPr>
-      </w:pPr>
-    </w:p>
-    <w:p>
-      <w:pPr>
-        <w:pStyle w:val="Standard"/>
-        <w:rPr>
-          <w:rFonts w:hint="eastAsia"/>
-        </w:rPr>
-      </w:pPr>
+        <w:br w:type="page"/>
+      </w:r>
     </w:p>
     <w:p>
       <w:pPr>
@@ -2063,7 +2007,21 @@
         <w:rPr>
           <w:lang w:val="es-CL"/>
         </w:rPr>
-        <w:t>. Las pruebas se ejecutan desde el frontend, validando que las acciones realizadas por los usuarios generen una respuesta correcta del sistema.</w:t>
+        <w:t xml:space="preserve">. Las pruebas se ejecutan desde el </w:t>
+      </w:r>
+      <w:proofErr w:type="spellStart"/>
+      <w:r>
+        <w:rPr>
+          <w:lang w:val="es-CL"/>
+        </w:rPr>
+        <w:t>frontend</w:t>
+      </w:r>
+      <w:proofErr w:type="spellEnd"/>
+      <w:r>
+        <w:rPr>
+          <w:lang w:val="es-CL"/>
+        </w:rPr>
+        <w:t>, validando que las acciones realizadas por los usuarios generen una respuesta correcta del sistema.</w:t>
       </w:r>
     </w:p>
     <w:p>
@@ -2093,7 +2051,35 @@
         <w:rPr>
           <w:lang w:val="es-CL"/>
         </w:rPr>
-        <w:t>No se consideran pruebas unitarias, pruebas de carga, pruebas de rendimiento ni pruebas profundas del backend. La validación del backend se realiza de forma indirecta, comprobando que las operaciones ejecutadas desde la interfaz sean procesadas correctamente y reflejadas en el comportamiento general de la aplicación.</w:t>
+        <w:t xml:space="preserve">No se consideran pruebas unitarias, pruebas de carga, pruebas de rendimiento ni pruebas profundas del </w:t>
+      </w:r>
+      <w:proofErr w:type="spellStart"/>
+      <w:r>
+        <w:rPr>
+          <w:lang w:val="es-CL"/>
+        </w:rPr>
+        <w:t>backend</w:t>
+      </w:r>
+      <w:proofErr w:type="spellEnd"/>
+      <w:r>
+        <w:rPr>
+          <w:lang w:val="es-CL"/>
+        </w:rPr>
+        <w:t xml:space="preserve">. La validación del </w:t>
+      </w:r>
+      <w:proofErr w:type="spellStart"/>
+      <w:r>
+        <w:rPr>
+          <w:lang w:val="es-CL"/>
+        </w:rPr>
+        <w:t>backend</w:t>
+      </w:r>
+      <w:proofErr w:type="spellEnd"/>
+      <w:r>
+        <w:rPr>
+          <w:lang w:val="es-CL"/>
+        </w:rPr>
+        <w:t xml:space="preserve"> se realiza de forma indirecta, comprobando que las operaciones ejecutadas desde la interfaz sean procesadas correctamente y reflejadas en el comportamiento general de la aplicación.</w:t>
       </w:r>
     </w:p>
     <w:p>
@@ -2106,10 +2092,855 @@
     </w:p>
     <w:p>
       <w:pPr>
+        <w:pStyle w:val="Ttulo2"/>
+        <w:rPr>
+          <w:rFonts w:ascii="NewsGotT" w:hAnsi="NewsGotT"/>
+        </w:rPr>
+      </w:pPr>
+      <w:r>
+        <w:rPr>
+          <w:rFonts w:ascii="NewsGotT" w:hAnsi="NewsGotT"/>
+        </w:rPr>
+        <w:t>Ambiente y datos de prueba</w:t>
+      </w:r>
+    </w:p>
+    <w:p>
+      <w:pPr>
+        <w:rPr>
+          <w:rFonts w:ascii="NewsGotT" w:hAnsi="NewsGotT"/>
+          <w:sz w:val="22"/>
+          <w:szCs w:val="22"/>
+        </w:rPr>
+      </w:pPr>
+      <w:r>
+        <w:rPr>
+          <w:rFonts w:ascii="NewsGotT" w:hAnsi="NewsGotT"/>
+          <w:sz w:val="22"/>
+          <w:szCs w:val="22"/>
+        </w:rPr>
+        <w:t xml:space="preserve">Las pruebas fueron diseñadas para ejecutarse en un ambiente local/controlado de desarrollo, con la aplicación web levantada mediante </w:t>
+      </w:r>
+      <w:proofErr w:type="spellStart"/>
+      <w:r>
+        <w:rPr>
+          <w:rFonts w:ascii="NewsGotT" w:hAnsi="NewsGotT"/>
+          <w:sz w:val="22"/>
+          <w:szCs w:val="22"/>
+        </w:rPr>
+        <w:t>frontend</w:t>
+      </w:r>
+      <w:proofErr w:type="spellEnd"/>
+      <w:r>
+        <w:rPr>
+          <w:rFonts w:ascii="NewsGotT" w:hAnsi="NewsGotT"/>
+          <w:sz w:val="22"/>
+          <w:szCs w:val="22"/>
+        </w:rPr>
+        <w:t xml:space="preserve"> </w:t>
+      </w:r>
+      <w:proofErr w:type="spellStart"/>
+      <w:r>
+        <w:rPr>
+          <w:rFonts w:ascii="NewsGotT" w:hAnsi="NewsGotT"/>
+          <w:sz w:val="22"/>
+          <w:szCs w:val="22"/>
+        </w:rPr>
+        <w:t>React</w:t>
+      </w:r>
+      <w:proofErr w:type="spellEnd"/>
+      <w:r>
+        <w:rPr>
+          <w:rFonts w:ascii="NewsGotT" w:hAnsi="NewsGotT"/>
+          <w:sz w:val="22"/>
+          <w:szCs w:val="22"/>
+        </w:rPr>
+        <w:t xml:space="preserve">, </w:t>
+      </w:r>
+      <w:proofErr w:type="spellStart"/>
+      <w:r>
+        <w:rPr>
+          <w:rFonts w:ascii="NewsGotT" w:hAnsi="NewsGotT"/>
+          <w:sz w:val="22"/>
+          <w:szCs w:val="22"/>
+        </w:rPr>
+        <w:t>backend</w:t>
+      </w:r>
+      <w:proofErr w:type="spellEnd"/>
+      <w:r>
+        <w:rPr>
+          <w:rFonts w:ascii="NewsGotT" w:hAnsi="NewsGotT"/>
+          <w:sz w:val="22"/>
+          <w:szCs w:val="22"/>
+        </w:rPr>
+        <w:t xml:space="preserve"> Spring Boot, API Gateway, microservicios y base de datos MongoDB.</w:t>
+      </w:r>
+    </w:p>
+    <w:p>
+      <w:pPr>
+        <w:rPr>
+          <w:rFonts w:ascii="NewsGotT" w:hAnsi="NewsGotT"/>
+          <w:sz w:val="22"/>
+          <w:szCs w:val="22"/>
+        </w:rPr>
+      </w:pPr>
+    </w:p>
+    <w:tbl>
+      <w:tblPr>
+        <w:tblStyle w:val="Tablaconcuadrcula"/>
+        <w:tblW w:w="0" w:type="auto"/>
+        <w:jc w:val="center"/>
+        <w:tblLook w:val="04A0" w:firstRow="1" w:lastRow="0" w:firstColumn="1" w:lastColumn="0" w:noHBand="0" w:noVBand="1"/>
+      </w:tblPr>
+      <w:tblGrid>
+        <w:gridCol w:w="4525"/>
+        <w:gridCol w:w="4536"/>
+      </w:tblGrid>
+      <w:tr>
+        <w:trPr>
+          <w:jc w:val="center"/>
+        </w:trPr>
+        <w:tc>
+          <w:tcPr>
+            <w:tcW w:w="5184" w:type="dxa"/>
+            <w:shd w:val="clear" w:color="auto" w:fill="808080"/>
+          </w:tcPr>
+          <w:p>
+            <w:pPr>
+              <w:rPr>
+                <w:rFonts w:ascii="NewsGotT" w:hAnsi="NewsGotT"/>
+              </w:rPr>
+            </w:pPr>
+            <w:proofErr w:type="spellStart"/>
+            <w:r>
+              <w:rPr>
+                <w:rFonts w:ascii="NewsGotT" w:hAnsi="NewsGotT"/>
+                <w:b/>
+                <w:color w:val="FFFFFF"/>
+              </w:rPr>
+              <w:t>Elemento</w:t>
+            </w:r>
+            <w:proofErr w:type="spellEnd"/>
+          </w:p>
+        </w:tc>
+        <w:tc>
+          <w:tcPr>
+            <w:tcW w:w="5184" w:type="dxa"/>
+            <w:shd w:val="clear" w:color="auto" w:fill="808080"/>
+          </w:tcPr>
+          <w:p>
+            <w:pPr>
+              <w:rPr>
+                <w:rFonts w:ascii="NewsGotT" w:hAnsi="NewsGotT"/>
+              </w:rPr>
+            </w:pPr>
+            <w:proofErr w:type="spellStart"/>
+            <w:r>
+              <w:rPr>
+                <w:rFonts w:ascii="NewsGotT" w:hAnsi="NewsGotT"/>
+                <w:b/>
+                <w:color w:val="FFFFFF"/>
+              </w:rPr>
+              <w:t>Descripción</w:t>
+            </w:r>
+            <w:proofErr w:type="spellEnd"/>
+          </w:p>
+        </w:tc>
+      </w:tr>
+      <w:tr>
+        <w:trPr>
+          <w:jc w:val="center"/>
+        </w:trPr>
+        <w:tc>
+          <w:tcPr>
+            <w:tcW w:w="5184" w:type="dxa"/>
+          </w:tcPr>
+          <w:p>
+            <w:pPr>
+              <w:rPr>
+                <w:rFonts w:ascii="NewsGotT" w:hAnsi="NewsGotT"/>
+              </w:rPr>
+            </w:pPr>
+            <w:r>
+              <w:rPr>
+                <w:rFonts w:ascii="NewsGotT" w:hAnsi="NewsGotT"/>
+              </w:rPr>
+              <w:t>Frontend</w:t>
+            </w:r>
+          </w:p>
+        </w:tc>
+        <w:tc>
+          <w:tcPr>
+            <w:tcW w:w="5184" w:type="dxa"/>
+          </w:tcPr>
+          <w:p>
+            <w:pPr>
+              <w:rPr>
+                <w:rFonts w:ascii="NewsGotT" w:hAnsi="NewsGotT"/>
+              </w:rPr>
+            </w:pPr>
+            <w:proofErr w:type="spellStart"/>
+            <w:r>
+              <w:rPr>
+                <w:rFonts w:ascii="NewsGotT" w:hAnsi="NewsGotT"/>
+              </w:rPr>
+              <w:t>Aplicación</w:t>
+            </w:r>
+            <w:proofErr w:type="spellEnd"/>
+            <w:r>
+              <w:rPr>
+                <w:rFonts w:ascii="NewsGotT" w:hAnsi="NewsGotT"/>
+              </w:rPr>
+              <w:t xml:space="preserve"> web React + Vite con CSS </w:t>
+            </w:r>
+            <w:proofErr w:type="spellStart"/>
+            <w:r>
+              <w:rPr>
+                <w:rFonts w:ascii="NewsGotT" w:hAnsi="NewsGotT"/>
+              </w:rPr>
+              <w:t>propio</w:t>
+            </w:r>
+            <w:proofErr w:type="spellEnd"/>
+            <w:r>
+              <w:rPr>
+                <w:rFonts w:ascii="NewsGotT" w:hAnsi="NewsGotT"/>
+              </w:rPr>
+              <w:t xml:space="preserve"> </w:t>
+            </w:r>
+            <w:proofErr w:type="spellStart"/>
+            <w:r>
+              <w:rPr>
+                <w:rFonts w:ascii="NewsGotT" w:hAnsi="NewsGotT"/>
+              </w:rPr>
+              <w:t>por</w:t>
+            </w:r>
+            <w:proofErr w:type="spellEnd"/>
+            <w:r>
+              <w:rPr>
+                <w:rFonts w:ascii="NewsGotT" w:hAnsi="NewsGotT"/>
+              </w:rPr>
+              <w:t xml:space="preserve"> </w:t>
+            </w:r>
+            <w:proofErr w:type="spellStart"/>
+            <w:r>
+              <w:rPr>
+                <w:rFonts w:ascii="NewsGotT" w:hAnsi="NewsGotT"/>
+              </w:rPr>
+              <w:t>componente</w:t>
+            </w:r>
+            <w:proofErr w:type="spellEnd"/>
+            <w:r>
+              <w:rPr>
+                <w:rFonts w:ascii="NewsGotT" w:hAnsi="NewsGotT"/>
+              </w:rPr>
+              <w:t>.</w:t>
+            </w:r>
+          </w:p>
+        </w:tc>
+      </w:tr>
+      <w:tr>
+        <w:trPr>
+          <w:jc w:val="center"/>
+        </w:trPr>
+        <w:tc>
+          <w:tcPr>
+            <w:tcW w:w="5184" w:type="dxa"/>
+            <w:shd w:val="clear" w:color="auto" w:fill="F2F2F2"/>
+          </w:tcPr>
+          <w:p>
+            <w:pPr>
+              <w:rPr>
+                <w:rFonts w:ascii="NewsGotT" w:hAnsi="NewsGotT"/>
+              </w:rPr>
+            </w:pPr>
+            <w:r>
+              <w:rPr>
+                <w:rFonts w:ascii="NewsGotT" w:hAnsi="NewsGotT"/>
+              </w:rPr>
+              <w:t>Backend</w:t>
+            </w:r>
+          </w:p>
+        </w:tc>
+        <w:tc>
+          <w:tcPr>
+            <w:tcW w:w="5184" w:type="dxa"/>
+            <w:shd w:val="clear" w:color="auto" w:fill="F2F2F2"/>
+          </w:tcPr>
+          <w:p>
+            <w:pPr>
+              <w:rPr>
+                <w:rFonts w:ascii="NewsGotT" w:hAnsi="NewsGotT"/>
+              </w:rPr>
+            </w:pPr>
+            <w:proofErr w:type="spellStart"/>
+            <w:r>
+              <w:rPr>
+                <w:rFonts w:ascii="NewsGotT" w:hAnsi="NewsGotT"/>
+              </w:rPr>
+              <w:t>Microservicios</w:t>
+            </w:r>
+            <w:proofErr w:type="spellEnd"/>
+            <w:r>
+              <w:rPr>
+                <w:rFonts w:ascii="NewsGotT" w:hAnsi="NewsGotT"/>
+              </w:rPr>
+              <w:t xml:space="preserve"> Spring Boot </w:t>
+            </w:r>
+            <w:proofErr w:type="spellStart"/>
+            <w:r>
+              <w:rPr>
+                <w:rFonts w:ascii="NewsGotT" w:hAnsi="NewsGotT"/>
+              </w:rPr>
+              <w:t>expuestos</w:t>
+            </w:r>
+            <w:proofErr w:type="spellEnd"/>
+            <w:r>
+              <w:rPr>
+                <w:rFonts w:ascii="NewsGotT" w:hAnsi="NewsGotT"/>
+              </w:rPr>
+              <w:t xml:space="preserve"> </w:t>
+            </w:r>
+            <w:proofErr w:type="spellStart"/>
+            <w:r>
+              <w:rPr>
+                <w:rFonts w:ascii="NewsGotT" w:hAnsi="NewsGotT"/>
+              </w:rPr>
+              <w:t>mediante</w:t>
+            </w:r>
+            <w:proofErr w:type="spellEnd"/>
+            <w:r>
+              <w:rPr>
+                <w:rFonts w:ascii="NewsGotT" w:hAnsi="NewsGotT"/>
+              </w:rPr>
+              <w:t xml:space="preserve"> API Gateway.</w:t>
+            </w:r>
+          </w:p>
+        </w:tc>
+      </w:tr>
+      <w:tr>
+        <w:trPr>
+          <w:jc w:val="center"/>
+        </w:trPr>
+        <w:tc>
+          <w:tcPr>
+            <w:tcW w:w="5184" w:type="dxa"/>
+          </w:tcPr>
+          <w:p>
+            <w:pPr>
+              <w:rPr>
+                <w:rFonts w:ascii="NewsGotT" w:hAnsi="NewsGotT"/>
+              </w:rPr>
+            </w:pPr>
+            <w:r>
+              <w:rPr>
+                <w:rFonts w:ascii="NewsGotT" w:hAnsi="NewsGotT"/>
+              </w:rPr>
+              <w:t xml:space="preserve">Base de </w:t>
+            </w:r>
+            <w:proofErr w:type="spellStart"/>
+            <w:r>
+              <w:rPr>
+                <w:rFonts w:ascii="NewsGotT" w:hAnsi="NewsGotT"/>
+              </w:rPr>
+              <w:t>datos</w:t>
+            </w:r>
+            <w:proofErr w:type="spellEnd"/>
+          </w:p>
+        </w:tc>
+        <w:tc>
+          <w:tcPr>
+            <w:tcW w:w="5184" w:type="dxa"/>
+          </w:tcPr>
+          <w:p>
+            <w:pPr>
+              <w:rPr>
+                <w:rFonts w:ascii="NewsGotT" w:hAnsi="NewsGotT"/>
+              </w:rPr>
+            </w:pPr>
+            <w:r>
+              <w:rPr>
+                <w:rFonts w:ascii="NewsGotT" w:hAnsi="NewsGotT"/>
+              </w:rPr>
+              <w:t xml:space="preserve">MongoDB con </w:t>
+            </w:r>
+            <w:proofErr w:type="spellStart"/>
+            <w:r>
+              <w:rPr>
+                <w:rFonts w:ascii="NewsGotT" w:hAnsi="NewsGotT"/>
+              </w:rPr>
+              <w:t>datos</w:t>
+            </w:r>
+            <w:proofErr w:type="spellEnd"/>
+            <w:r>
+              <w:rPr>
+                <w:rFonts w:ascii="NewsGotT" w:hAnsi="NewsGotT"/>
+              </w:rPr>
+              <w:t xml:space="preserve"> </w:t>
+            </w:r>
+            <w:proofErr w:type="spellStart"/>
+            <w:r>
+              <w:rPr>
+                <w:rFonts w:ascii="NewsGotT" w:hAnsi="NewsGotT"/>
+              </w:rPr>
+              <w:t>ficticios</w:t>
+            </w:r>
+            <w:proofErr w:type="spellEnd"/>
+            <w:r>
+              <w:rPr>
+                <w:rFonts w:ascii="NewsGotT" w:hAnsi="NewsGotT"/>
+              </w:rPr>
+              <w:t xml:space="preserve"> de </w:t>
+            </w:r>
+            <w:proofErr w:type="spellStart"/>
+            <w:r>
+              <w:rPr>
+                <w:rFonts w:ascii="NewsGotT" w:hAnsi="NewsGotT"/>
+              </w:rPr>
+              <w:t>usuarios</w:t>
+            </w:r>
+            <w:proofErr w:type="spellEnd"/>
+            <w:r>
+              <w:rPr>
+                <w:rFonts w:ascii="NewsGotT" w:hAnsi="NewsGotT"/>
+              </w:rPr>
+              <w:t xml:space="preserve">, </w:t>
+            </w:r>
+            <w:proofErr w:type="spellStart"/>
+            <w:r>
+              <w:rPr>
+                <w:rFonts w:ascii="NewsGotT" w:hAnsi="NewsGotT"/>
+              </w:rPr>
+              <w:t>mascotas</w:t>
+            </w:r>
+            <w:proofErr w:type="spellEnd"/>
+            <w:r>
+              <w:rPr>
+                <w:rFonts w:ascii="NewsGotT" w:hAnsi="NewsGotT"/>
+              </w:rPr>
+              <w:t xml:space="preserve">, </w:t>
+            </w:r>
+            <w:proofErr w:type="spellStart"/>
+            <w:r>
+              <w:rPr>
+                <w:rFonts w:ascii="NewsGotT" w:hAnsi="NewsGotT"/>
+              </w:rPr>
+              <w:t>empresas</w:t>
+            </w:r>
+            <w:proofErr w:type="spellEnd"/>
+            <w:r>
+              <w:rPr>
+                <w:rFonts w:ascii="NewsGotT" w:hAnsi="NewsGotT"/>
+              </w:rPr>
+              <w:t xml:space="preserve">, </w:t>
+            </w:r>
+            <w:proofErr w:type="spellStart"/>
+            <w:r>
+              <w:rPr>
+                <w:rFonts w:ascii="NewsGotT" w:hAnsi="NewsGotT"/>
+              </w:rPr>
+              <w:t>citas</w:t>
+            </w:r>
+            <w:proofErr w:type="spellEnd"/>
+            <w:r>
+              <w:rPr>
+                <w:rFonts w:ascii="NewsGotT" w:hAnsi="NewsGotT"/>
+              </w:rPr>
+              <w:t xml:space="preserve">, blogs, </w:t>
+            </w:r>
+            <w:proofErr w:type="spellStart"/>
+            <w:r>
+              <w:rPr>
+                <w:rFonts w:ascii="NewsGotT" w:hAnsi="NewsGotT"/>
+              </w:rPr>
+              <w:t>promociones</w:t>
+            </w:r>
+            <w:proofErr w:type="spellEnd"/>
+            <w:r>
+              <w:rPr>
+                <w:rFonts w:ascii="NewsGotT" w:hAnsi="NewsGotT"/>
+              </w:rPr>
+              <w:t xml:space="preserve"> y </w:t>
+            </w:r>
+            <w:proofErr w:type="spellStart"/>
+            <w:r>
+              <w:rPr>
+                <w:rFonts w:ascii="NewsGotT" w:hAnsi="NewsGotT"/>
+              </w:rPr>
+              <w:t>comentarios</w:t>
+            </w:r>
+            <w:proofErr w:type="spellEnd"/>
+            <w:r>
+              <w:rPr>
+                <w:rFonts w:ascii="NewsGotT" w:hAnsi="NewsGotT"/>
+              </w:rPr>
+              <w:t>.</w:t>
+            </w:r>
+          </w:p>
+        </w:tc>
+      </w:tr>
+      <w:tr>
+        <w:trPr>
+          <w:jc w:val="center"/>
+        </w:trPr>
+        <w:tc>
+          <w:tcPr>
+            <w:tcW w:w="5184" w:type="dxa"/>
+            <w:shd w:val="clear" w:color="auto" w:fill="F2F2F2"/>
+          </w:tcPr>
+          <w:p>
+            <w:pPr>
+              <w:rPr>
+                <w:rFonts w:ascii="NewsGotT" w:hAnsi="NewsGotT"/>
+              </w:rPr>
+            </w:pPr>
+            <w:r>
+              <w:rPr>
+                <w:rFonts w:ascii="NewsGotT" w:hAnsi="NewsGotT"/>
+              </w:rPr>
+              <w:t xml:space="preserve">Tipo de </w:t>
+            </w:r>
+            <w:proofErr w:type="spellStart"/>
+            <w:r>
+              <w:rPr>
+                <w:rFonts w:ascii="NewsGotT" w:hAnsi="NewsGotT"/>
+              </w:rPr>
+              <w:t>prueba</w:t>
+            </w:r>
+            <w:proofErr w:type="spellEnd"/>
+          </w:p>
+        </w:tc>
+        <w:tc>
+          <w:tcPr>
+            <w:tcW w:w="5184" w:type="dxa"/>
+            <w:shd w:val="clear" w:color="auto" w:fill="F2F2F2"/>
+          </w:tcPr>
+          <w:p>
+            <w:pPr>
+              <w:rPr>
+                <w:rFonts w:ascii="NewsGotT" w:hAnsi="NewsGotT"/>
+              </w:rPr>
+            </w:pPr>
+            <w:proofErr w:type="spellStart"/>
+            <w:r>
+              <w:rPr>
+                <w:rFonts w:ascii="NewsGotT" w:hAnsi="NewsGotT"/>
+              </w:rPr>
+              <w:t>Pruebas</w:t>
+            </w:r>
+            <w:proofErr w:type="spellEnd"/>
+            <w:r>
+              <w:rPr>
+                <w:rFonts w:ascii="NewsGotT" w:hAnsi="NewsGotT"/>
+              </w:rPr>
+              <w:t xml:space="preserve"> </w:t>
+            </w:r>
+            <w:proofErr w:type="spellStart"/>
+            <w:r>
+              <w:rPr>
+                <w:rFonts w:ascii="NewsGotT" w:hAnsi="NewsGotT"/>
+              </w:rPr>
+              <w:t>funcionales</w:t>
+            </w:r>
+            <w:proofErr w:type="spellEnd"/>
+            <w:r>
+              <w:rPr>
+                <w:rFonts w:ascii="NewsGotT" w:hAnsi="NewsGotT"/>
+              </w:rPr>
+              <w:t xml:space="preserve"> </w:t>
+            </w:r>
+            <w:proofErr w:type="spellStart"/>
+            <w:r>
+              <w:rPr>
+                <w:rFonts w:ascii="NewsGotT" w:hAnsi="NewsGotT"/>
+              </w:rPr>
+              <w:t>manuales</w:t>
+            </w:r>
+            <w:proofErr w:type="spellEnd"/>
+            <w:r>
+              <w:rPr>
+                <w:rFonts w:ascii="NewsGotT" w:hAnsi="NewsGotT"/>
+              </w:rPr>
+              <w:t>/</w:t>
+            </w:r>
+            <w:proofErr w:type="spellStart"/>
+            <w:r>
+              <w:rPr>
+                <w:rFonts w:ascii="NewsGotT" w:hAnsi="NewsGotT"/>
+              </w:rPr>
+              <w:t>globales</w:t>
+            </w:r>
+            <w:proofErr w:type="spellEnd"/>
+            <w:r>
+              <w:rPr>
+                <w:rFonts w:ascii="NewsGotT" w:hAnsi="NewsGotT"/>
+              </w:rPr>
+              <w:t xml:space="preserve"> </w:t>
+            </w:r>
+            <w:proofErr w:type="spellStart"/>
+            <w:r>
+              <w:rPr>
+                <w:rFonts w:ascii="NewsGotT" w:hAnsi="NewsGotT"/>
+              </w:rPr>
+              <w:t>desde</w:t>
+            </w:r>
+            <w:proofErr w:type="spellEnd"/>
+            <w:r>
+              <w:rPr>
+                <w:rFonts w:ascii="NewsGotT" w:hAnsi="NewsGotT"/>
+              </w:rPr>
+              <w:t xml:space="preserve"> la </w:t>
+            </w:r>
+            <w:proofErr w:type="spellStart"/>
+            <w:r>
+              <w:rPr>
+                <w:rFonts w:ascii="NewsGotT" w:hAnsi="NewsGotT"/>
+              </w:rPr>
+              <w:t>interfaz</w:t>
+            </w:r>
+            <w:proofErr w:type="spellEnd"/>
+            <w:r>
+              <w:rPr>
+                <w:rFonts w:ascii="NewsGotT" w:hAnsi="NewsGotT"/>
+              </w:rPr>
+              <w:t xml:space="preserve"> web.</w:t>
+            </w:r>
+          </w:p>
+        </w:tc>
+      </w:tr>
+      <w:tr>
+        <w:trPr>
+          <w:jc w:val="center"/>
+        </w:trPr>
+        <w:tc>
+          <w:tcPr>
+            <w:tcW w:w="5184" w:type="dxa"/>
+          </w:tcPr>
+          <w:p>
+            <w:pPr>
+              <w:rPr>
+                <w:rFonts w:ascii="NewsGotT" w:hAnsi="NewsGotT"/>
+              </w:rPr>
+            </w:pPr>
+            <w:proofErr w:type="spellStart"/>
+            <w:r>
+              <w:rPr>
+                <w:rFonts w:ascii="NewsGotT" w:hAnsi="NewsGotT"/>
+              </w:rPr>
+              <w:t>Evidencias</w:t>
+            </w:r>
+            <w:proofErr w:type="spellEnd"/>
+          </w:p>
+        </w:tc>
+        <w:tc>
+          <w:tcPr>
+            <w:tcW w:w="5184" w:type="dxa"/>
+          </w:tcPr>
+          <w:p>
+            <w:pPr>
+              <w:rPr>
+                <w:rFonts w:ascii="NewsGotT" w:hAnsi="NewsGotT"/>
+              </w:rPr>
+            </w:pPr>
+            <w:proofErr w:type="spellStart"/>
+            <w:r>
+              <w:rPr>
+                <w:rFonts w:ascii="NewsGotT" w:hAnsi="NewsGotT"/>
+              </w:rPr>
+              <w:t>Capturas</w:t>
+            </w:r>
+            <w:proofErr w:type="spellEnd"/>
+            <w:r>
+              <w:rPr>
+                <w:rFonts w:ascii="NewsGotT" w:hAnsi="NewsGotT"/>
+              </w:rPr>
+              <w:t xml:space="preserve"> </w:t>
+            </w:r>
+            <w:proofErr w:type="spellStart"/>
+            <w:r>
+              <w:rPr>
+                <w:rFonts w:ascii="NewsGotT" w:hAnsi="NewsGotT"/>
+              </w:rPr>
+              <w:t>identificadas</w:t>
+            </w:r>
+            <w:proofErr w:type="spellEnd"/>
+            <w:r>
+              <w:rPr>
+                <w:rFonts w:ascii="NewsGotT" w:hAnsi="NewsGotT"/>
+              </w:rPr>
+              <w:t xml:space="preserve"> </w:t>
+            </w:r>
+            <w:proofErr w:type="spellStart"/>
+            <w:r>
+              <w:rPr>
+                <w:rFonts w:ascii="NewsGotT" w:hAnsi="NewsGotT"/>
+              </w:rPr>
+              <w:t>por</w:t>
+            </w:r>
+            <w:proofErr w:type="spellEnd"/>
+            <w:r>
+              <w:rPr>
+                <w:rFonts w:ascii="NewsGotT" w:hAnsi="NewsGotT"/>
+              </w:rPr>
+              <w:t xml:space="preserve"> </w:t>
+            </w:r>
+            <w:proofErr w:type="spellStart"/>
+            <w:r>
+              <w:rPr>
+                <w:rFonts w:ascii="NewsGotT" w:hAnsi="NewsGotT"/>
+              </w:rPr>
+              <w:t>código</w:t>
+            </w:r>
+            <w:proofErr w:type="spellEnd"/>
+            <w:r>
+              <w:rPr>
+                <w:rFonts w:ascii="NewsGotT" w:hAnsi="NewsGotT"/>
+              </w:rPr>
+              <w:t xml:space="preserve"> de </w:t>
+            </w:r>
+            <w:proofErr w:type="spellStart"/>
+            <w:r>
+              <w:rPr>
+                <w:rFonts w:ascii="NewsGotT" w:hAnsi="NewsGotT"/>
+              </w:rPr>
+              <w:t>caso</w:t>
+            </w:r>
+            <w:proofErr w:type="spellEnd"/>
+            <w:r>
+              <w:rPr>
+                <w:rFonts w:ascii="NewsGotT" w:hAnsi="NewsGotT"/>
+              </w:rPr>
+              <w:t xml:space="preserve"> de </w:t>
+            </w:r>
+            <w:proofErr w:type="spellStart"/>
+            <w:r>
+              <w:rPr>
+                <w:rFonts w:ascii="NewsGotT" w:hAnsi="NewsGotT"/>
+              </w:rPr>
+              <w:t>prueba</w:t>
+            </w:r>
+            <w:proofErr w:type="spellEnd"/>
+            <w:r>
+              <w:rPr>
+                <w:rFonts w:ascii="NewsGotT" w:hAnsi="NewsGotT"/>
+              </w:rPr>
+              <w:t xml:space="preserve">, </w:t>
+            </w:r>
+            <w:proofErr w:type="spellStart"/>
+            <w:r>
+              <w:rPr>
+                <w:rFonts w:ascii="NewsGotT" w:hAnsi="NewsGotT"/>
+              </w:rPr>
+              <w:t>por</w:t>
+            </w:r>
+            <w:proofErr w:type="spellEnd"/>
+            <w:r>
+              <w:rPr>
+                <w:rFonts w:ascii="NewsGotT" w:hAnsi="NewsGotT"/>
+              </w:rPr>
+              <w:t xml:space="preserve"> </w:t>
+            </w:r>
+            <w:proofErr w:type="spellStart"/>
+            <w:r>
+              <w:rPr>
+                <w:rFonts w:ascii="NewsGotT" w:hAnsi="NewsGotT"/>
+              </w:rPr>
+              <w:t>ejemplo</w:t>
+            </w:r>
+            <w:proofErr w:type="spellEnd"/>
+            <w:r>
+              <w:rPr>
+                <w:rFonts w:ascii="NewsGotT" w:hAnsi="NewsGotT"/>
+              </w:rPr>
+              <w:t xml:space="preserve"> CP-01, CP-02, CP-03.</w:t>
+            </w:r>
+          </w:p>
+        </w:tc>
+      </w:tr>
+    </w:tbl>
+    <w:p>
+      <w:pPr>
         <w:pStyle w:val="Standard"/>
         <w:jc w:val="both"/>
         <w:rPr>
-          <w:rFonts w:cs="Arial" w:hint="eastAsia"/>
+          <w:rFonts w:cs="Arial"/>
+          <w:sz w:val="22"/>
+          <w:szCs w:val="22"/>
+        </w:rPr>
+      </w:pPr>
+    </w:p>
+    <w:p>
+      <w:pPr>
+        <w:pStyle w:val="Standard"/>
+        <w:jc w:val="both"/>
+        <w:rPr>
+          <w:rFonts w:cs="Arial"/>
+          <w:sz w:val="22"/>
+          <w:szCs w:val="22"/>
+        </w:rPr>
+      </w:pPr>
+    </w:p>
+    <w:p>
+      <w:pPr>
+        <w:pStyle w:val="Standard"/>
+        <w:jc w:val="both"/>
+        <w:rPr>
+          <w:rFonts w:cs="Arial"/>
+          <w:sz w:val="22"/>
+          <w:szCs w:val="22"/>
+        </w:rPr>
+      </w:pPr>
+    </w:p>
+    <w:p>
+      <w:pPr>
+        <w:pStyle w:val="Standard"/>
+        <w:jc w:val="both"/>
+        <w:rPr>
+          <w:rFonts w:cs="Arial"/>
+          <w:sz w:val="22"/>
+          <w:szCs w:val="22"/>
+        </w:rPr>
+      </w:pPr>
+    </w:p>
+    <w:p>
+      <w:pPr>
+        <w:pStyle w:val="Standard"/>
+        <w:jc w:val="both"/>
+        <w:rPr>
+          <w:rFonts w:cs="Arial"/>
+          <w:sz w:val="22"/>
+          <w:szCs w:val="22"/>
+        </w:rPr>
+      </w:pPr>
+    </w:p>
+    <w:p>
+      <w:pPr>
+        <w:pStyle w:val="Standard"/>
+        <w:jc w:val="both"/>
+        <w:rPr>
+          <w:rFonts w:cs="Arial"/>
+          <w:sz w:val="22"/>
+          <w:szCs w:val="22"/>
+        </w:rPr>
+      </w:pPr>
+    </w:p>
+    <w:p>
+      <w:pPr>
+        <w:pStyle w:val="Standard"/>
+        <w:jc w:val="both"/>
+        <w:rPr>
+          <w:rFonts w:cs="Arial"/>
+          <w:sz w:val="22"/>
+          <w:szCs w:val="22"/>
+        </w:rPr>
+      </w:pPr>
+    </w:p>
+    <w:p>
+      <w:pPr>
+        <w:pStyle w:val="Standard"/>
+        <w:jc w:val="both"/>
+        <w:rPr>
+          <w:rFonts w:cs="Arial"/>
+          <w:sz w:val="22"/>
+          <w:szCs w:val="22"/>
         </w:rPr>
       </w:pPr>
     </w:p>
@@ -2118,17 +2949,757 @@
         <w:pStyle w:val="Textbody"/>
         <w:rPr>
           <w:rFonts w:hint="eastAsia"/>
+          <w:szCs w:val="22"/>
         </w:rPr>
       </w:pPr>
+      <w:r>
+        <w:rPr>
+          <w:szCs w:val="22"/>
+        </w:rPr>
+        <w:t>Los datos utilizados corresponden a información ficticia y controlada, evitando el uso de datos personales reales. Se emplean usuarios de prueba, empresas de prueba, mascotas ficticias, servicios de ejemplo, promociones, blogs y comentarios.</w:t>
+      </w:r>
     </w:p>
     <w:p>
       <w:pPr>
-        <w:pStyle w:val="Textbody"/>
+        <w:pStyle w:val="Ttulo2"/>
         <w:rPr>
-          <w:rFonts w:hint="eastAsia"/>
+          <w:rFonts w:ascii="NewsGotT" w:hAnsi="NewsGotT"/>
         </w:rPr>
       </w:pPr>
+      <w:r>
+        <w:rPr>
+          <w:rFonts w:ascii="NewsGotT" w:hAnsi="NewsGotT"/>
+        </w:rPr>
+        <w:t>Criterios de aprobación</w:t>
+      </w:r>
     </w:p>
+    <w:tbl>
+      <w:tblPr>
+        <w:tblStyle w:val="Tablaconcuadrcula"/>
+        <w:tblW w:w="0" w:type="auto"/>
+        <w:jc w:val="center"/>
+        <w:tblLook w:val="04A0" w:firstRow="1" w:lastRow="0" w:firstColumn="1" w:lastColumn="0" w:noHBand="0" w:noVBand="1"/>
+      </w:tblPr>
+      <w:tblGrid>
+        <w:gridCol w:w="4533"/>
+        <w:gridCol w:w="4528"/>
+      </w:tblGrid>
+      <w:tr>
+        <w:trPr>
+          <w:jc w:val="center"/>
+        </w:trPr>
+        <w:tc>
+          <w:tcPr>
+            <w:tcW w:w="5184" w:type="dxa"/>
+            <w:shd w:val="clear" w:color="auto" w:fill="808080"/>
+          </w:tcPr>
+          <w:p>
+            <w:pPr>
+              <w:rPr>
+                <w:rFonts w:ascii="NewsGotT" w:hAnsi="NewsGotT"/>
+              </w:rPr>
+            </w:pPr>
+            <w:proofErr w:type="spellStart"/>
+            <w:r>
+              <w:rPr>
+                <w:rFonts w:ascii="NewsGotT" w:hAnsi="NewsGotT"/>
+                <w:b/>
+                <w:color w:val="FFFFFF"/>
+              </w:rPr>
+              <w:t>Criterio</w:t>
+            </w:r>
+            <w:proofErr w:type="spellEnd"/>
+          </w:p>
+        </w:tc>
+        <w:tc>
+          <w:tcPr>
+            <w:tcW w:w="5184" w:type="dxa"/>
+            <w:shd w:val="clear" w:color="auto" w:fill="808080"/>
+          </w:tcPr>
+          <w:p>
+            <w:pPr>
+              <w:rPr>
+                <w:rFonts w:ascii="NewsGotT" w:hAnsi="NewsGotT"/>
+              </w:rPr>
+            </w:pPr>
+            <w:proofErr w:type="spellStart"/>
+            <w:r>
+              <w:rPr>
+                <w:rFonts w:ascii="NewsGotT" w:hAnsi="NewsGotT"/>
+                <w:b/>
+                <w:color w:val="FFFFFF"/>
+              </w:rPr>
+              <w:t>Descripción</w:t>
+            </w:r>
+            <w:proofErr w:type="spellEnd"/>
+          </w:p>
+        </w:tc>
+      </w:tr>
+      <w:tr>
+        <w:trPr>
+          <w:jc w:val="center"/>
+        </w:trPr>
+        <w:tc>
+          <w:tcPr>
+            <w:tcW w:w="5184" w:type="dxa"/>
+          </w:tcPr>
+          <w:p>
+            <w:pPr>
+              <w:rPr>
+                <w:rFonts w:ascii="NewsGotT" w:hAnsi="NewsGotT"/>
+              </w:rPr>
+            </w:pPr>
+            <w:proofErr w:type="spellStart"/>
+            <w:r>
+              <w:rPr>
+                <w:rFonts w:ascii="NewsGotT" w:hAnsi="NewsGotT"/>
+              </w:rPr>
+              <w:t>Aprobado</w:t>
+            </w:r>
+            <w:proofErr w:type="spellEnd"/>
+          </w:p>
+        </w:tc>
+        <w:tc>
+          <w:tcPr>
+            <w:tcW w:w="5184" w:type="dxa"/>
+          </w:tcPr>
+          <w:p>
+            <w:pPr>
+              <w:rPr>
+                <w:rFonts w:ascii="NewsGotT" w:hAnsi="NewsGotT"/>
+              </w:rPr>
+            </w:pPr>
+            <w:r>
+              <w:rPr>
+                <w:rFonts w:ascii="NewsGotT" w:hAnsi="NewsGotT"/>
+              </w:rPr>
+              <w:t xml:space="preserve">El </w:t>
+            </w:r>
+            <w:proofErr w:type="spellStart"/>
+            <w:r>
+              <w:rPr>
+                <w:rFonts w:ascii="NewsGotT" w:hAnsi="NewsGotT"/>
+              </w:rPr>
+              <w:t>sistema</w:t>
+            </w:r>
+            <w:proofErr w:type="spellEnd"/>
+            <w:r>
+              <w:rPr>
+                <w:rFonts w:ascii="NewsGotT" w:hAnsi="NewsGotT"/>
+              </w:rPr>
+              <w:t xml:space="preserve"> </w:t>
+            </w:r>
+            <w:proofErr w:type="spellStart"/>
+            <w:r>
+              <w:rPr>
+                <w:rFonts w:ascii="NewsGotT" w:hAnsi="NewsGotT"/>
+              </w:rPr>
+              <w:t>ejecuta</w:t>
+            </w:r>
+            <w:proofErr w:type="spellEnd"/>
+            <w:r>
+              <w:rPr>
+                <w:rFonts w:ascii="NewsGotT" w:hAnsi="NewsGotT"/>
+              </w:rPr>
+              <w:t xml:space="preserve"> la </w:t>
+            </w:r>
+            <w:proofErr w:type="spellStart"/>
+            <w:r>
+              <w:rPr>
+                <w:rFonts w:ascii="NewsGotT" w:hAnsi="NewsGotT"/>
+              </w:rPr>
+              <w:t>acción</w:t>
+            </w:r>
+            <w:proofErr w:type="spellEnd"/>
+            <w:r>
+              <w:rPr>
+                <w:rFonts w:ascii="NewsGotT" w:hAnsi="NewsGotT"/>
+              </w:rPr>
+              <w:t xml:space="preserve"> </w:t>
+            </w:r>
+            <w:proofErr w:type="spellStart"/>
+            <w:r>
+              <w:rPr>
+                <w:rFonts w:ascii="NewsGotT" w:hAnsi="NewsGotT"/>
+              </w:rPr>
+              <w:t>solicitada</w:t>
+            </w:r>
+            <w:proofErr w:type="spellEnd"/>
+            <w:r>
+              <w:rPr>
+                <w:rFonts w:ascii="NewsGotT" w:hAnsi="NewsGotT"/>
+              </w:rPr>
+              <w:t xml:space="preserve">, </w:t>
+            </w:r>
+            <w:proofErr w:type="spellStart"/>
+            <w:r>
+              <w:rPr>
+                <w:rFonts w:ascii="NewsGotT" w:hAnsi="NewsGotT"/>
+              </w:rPr>
+              <w:t>muestra</w:t>
+            </w:r>
+            <w:proofErr w:type="spellEnd"/>
+            <w:r>
+              <w:rPr>
+                <w:rFonts w:ascii="NewsGotT" w:hAnsi="NewsGotT"/>
+              </w:rPr>
+              <w:t xml:space="preserve"> </w:t>
+            </w:r>
+            <w:proofErr w:type="spellStart"/>
+            <w:r>
+              <w:rPr>
+                <w:rFonts w:ascii="NewsGotT" w:hAnsi="NewsGotT"/>
+              </w:rPr>
+              <w:t>una</w:t>
+            </w:r>
+            <w:proofErr w:type="spellEnd"/>
+            <w:r>
+              <w:rPr>
+                <w:rFonts w:ascii="NewsGotT" w:hAnsi="NewsGotT"/>
+              </w:rPr>
+              <w:t xml:space="preserve"> </w:t>
+            </w:r>
+            <w:proofErr w:type="spellStart"/>
+            <w:r>
+              <w:rPr>
+                <w:rFonts w:ascii="NewsGotT" w:hAnsi="NewsGotT"/>
+              </w:rPr>
+              <w:t>respuesta</w:t>
+            </w:r>
+            <w:proofErr w:type="spellEnd"/>
+            <w:r>
+              <w:rPr>
+                <w:rFonts w:ascii="NewsGotT" w:hAnsi="NewsGotT"/>
+              </w:rPr>
+              <w:t xml:space="preserve"> </w:t>
+            </w:r>
+            <w:proofErr w:type="spellStart"/>
+            <w:r>
+              <w:rPr>
+                <w:rFonts w:ascii="NewsGotT" w:hAnsi="NewsGotT"/>
+              </w:rPr>
+              <w:t>coherente</w:t>
+            </w:r>
+            <w:proofErr w:type="spellEnd"/>
+            <w:r>
+              <w:rPr>
+                <w:rFonts w:ascii="NewsGotT" w:hAnsi="NewsGotT"/>
+              </w:rPr>
+              <w:t xml:space="preserve"> y </w:t>
+            </w:r>
+            <w:proofErr w:type="spellStart"/>
+            <w:r>
+              <w:rPr>
+                <w:rFonts w:ascii="NewsGotT" w:hAnsi="NewsGotT"/>
+              </w:rPr>
+              <w:t>mantiene</w:t>
+            </w:r>
+            <w:proofErr w:type="spellEnd"/>
+            <w:r>
+              <w:rPr>
+                <w:rFonts w:ascii="NewsGotT" w:hAnsi="NewsGotT"/>
+              </w:rPr>
+              <w:t xml:space="preserve"> </w:t>
+            </w:r>
+            <w:proofErr w:type="spellStart"/>
+            <w:r>
+              <w:rPr>
+                <w:rFonts w:ascii="NewsGotT" w:hAnsi="NewsGotT"/>
+              </w:rPr>
+              <w:t>el</w:t>
+            </w:r>
+            <w:proofErr w:type="spellEnd"/>
+            <w:r>
+              <w:rPr>
+                <w:rFonts w:ascii="NewsGotT" w:hAnsi="NewsGotT"/>
+              </w:rPr>
+              <w:t xml:space="preserve"> </w:t>
+            </w:r>
+            <w:proofErr w:type="spellStart"/>
+            <w:r>
+              <w:rPr>
+                <w:rFonts w:ascii="NewsGotT" w:hAnsi="NewsGotT"/>
+              </w:rPr>
+              <w:t>flujo</w:t>
+            </w:r>
+            <w:proofErr w:type="spellEnd"/>
+            <w:r>
+              <w:rPr>
+                <w:rFonts w:ascii="NewsGotT" w:hAnsi="NewsGotT"/>
+              </w:rPr>
+              <w:t xml:space="preserve"> </w:t>
+            </w:r>
+            <w:proofErr w:type="spellStart"/>
+            <w:r>
+              <w:rPr>
+                <w:rFonts w:ascii="NewsGotT" w:hAnsi="NewsGotT"/>
+              </w:rPr>
+              <w:t>funcional</w:t>
+            </w:r>
+            <w:proofErr w:type="spellEnd"/>
+            <w:r>
+              <w:rPr>
+                <w:rFonts w:ascii="NewsGotT" w:hAnsi="NewsGotT"/>
+              </w:rPr>
+              <w:t xml:space="preserve"> </w:t>
+            </w:r>
+            <w:proofErr w:type="spellStart"/>
+            <w:r>
+              <w:rPr>
+                <w:rFonts w:ascii="NewsGotT" w:hAnsi="NewsGotT"/>
+              </w:rPr>
+              <w:t>esperado</w:t>
+            </w:r>
+            <w:proofErr w:type="spellEnd"/>
+            <w:r>
+              <w:rPr>
+                <w:rFonts w:ascii="NewsGotT" w:hAnsi="NewsGotT"/>
+              </w:rPr>
+              <w:t>.</w:t>
+            </w:r>
+          </w:p>
+        </w:tc>
+      </w:tr>
+      <w:tr>
+        <w:trPr>
+          <w:jc w:val="center"/>
+        </w:trPr>
+        <w:tc>
+          <w:tcPr>
+            <w:tcW w:w="5184" w:type="dxa"/>
+            <w:shd w:val="clear" w:color="auto" w:fill="F2F2F2"/>
+          </w:tcPr>
+          <w:p>
+            <w:pPr>
+              <w:rPr>
+                <w:rFonts w:ascii="NewsGotT" w:hAnsi="NewsGotT"/>
+              </w:rPr>
+            </w:pPr>
+            <w:r>
+              <w:rPr>
+                <w:rFonts w:ascii="NewsGotT" w:hAnsi="NewsGotT"/>
+              </w:rPr>
+              <w:t xml:space="preserve">No </w:t>
+            </w:r>
+            <w:proofErr w:type="spellStart"/>
+            <w:r>
+              <w:rPr>
+                <w:rFonts w:ascii="NewsGotT" w:hAnsi="NewsGotT"/>
+              </w:rPr>
+              <w:t>aprobado</w:t>
+            </w:r>
+            <w:proofErr w:type="spellEnd"/>
+          </w:p>
+        </w:tc>
+        <w:tc>
+          <w:tcPr>
+            <w:tcW w:w="5184" w:type="dxa"/>
+            <w:shd w:val="clear" w:color="auto" w:fill="F2F2F2"/>
+          </w:tcPr>
+          <w:p>
+            <w:pPr>
+              <w:rPr>
+                <w:rFonts w:ascii="NewsGotT" w:hAnsi="NewsGotT"/>
+              </w:rPr>
+            </w:pPr>
+            <w:r>
+              <w:rPr>
+                <w:rFonts w:ascii="NewsGotT" w:hAnsi="NewsGotT"/>
+              </w:rPr>
+              <w:t xml:space="preserve">La </w:t>
+            </w:r>
+            <w:proofErr w:type="spellStart"/>
+            <w:r>
+              <w:rPr>
+                <w:rFonts w:ascii="NewsGotT" w:hAnsi="NewsGotT"/>
+              </w:rPr>
+              <w:t>funcionalidad</w:t>
+            </w:r>
+            <w:proofErr w:type="spellEnd"/>
+            <w:r>
+              <w:rPr>
+                <w:rFonts w:ascii="NewsGotT" w:hAnsi="NewsGotT"/>
+              </w:rPr>
+              <w:t xml:space="preserve"> no se </w:t>
+            </w:r>
+            <w:proofErr w:type="spellStart"/>
+            <w:r>
+              <w:rPr>
+                <w:rFonts w:ascii="NewsGotT" w:hAnsi="NewsGotT"/>
+              </w:rPr>
+              <w:t>ejecuta</w:t>
+            </w:r>
+            <w:proofErr w:type="spellEnd"/>
+            <w:r>
+              <w:rPr>
+                <w:rFonts w:ascii="NewsGotT" w:hAnsi="NewsGotT"/>
+              </w:rPr>
+              <w:t xml:space="preserve">, </w:t>
+            </w:r>
+            <w:proofErr w:type="spellStart"/>
+            <w:r>
+              <w:rPr>
+                <w:rFonts w:ascii="NewsGotT" w:hAnsi="NewsGotT"/>
+              </w:rPr>
+              <w:t>presenta</w:t>
+            </w:r>
+            <w:proofErr w:type="spellEnd"/>
+            <w:r>
+              <w:rPr>
+                <w:rFonts w:ascii="NewsGotT" w:hAnsi="NewsGotT"/>
+              </w:rPr>
+              <w:t xml:space="preserve"> error </w:t>
+            </w:r>
+            <w:proofErr w:type="spellStart"/>
+            <w:r>
+              <w:rPr>
+                <w:rFonts w:ascii="NewsGotT" w:hAnsi="NewsGotT"/>
+              </w:rPr>
+              <w:t>crítico</w:t>
+            </w:r>
+            <w:proofErr w:type="spellEnd"/>
+            <w:r>
+              <w:rPr>
+                <w:rFonts w:ascii="NewsGotT" w:hAnsi="NewsGotT"/>
+              </w:rPr>
+              <w:t xml:space="preserve"> o </w:t>
+            </w:r>
+            <w:proofErr w:type="spellStart"/>
+            <w:r>
+              <w:rPr>
+                <w:rFonts w:ascii="NewsGotT" w:hAnsi="NewsGotT"/>
+              </w:rPr>
+              <w:t>impide</w:t>
+            </w:r>
+            <w:proofErr w:type="spellEnd"/>
+            <w:r>
+              <w:rPr>
+                <w:rFonts w:ascii="NewsGotT" w:hAnsi="NewsGotT"/>
+              </w:rPr>
+              <w:t xml:space="preserve"> </w:t>
+            </w:r>
+            <w:proofErr w:type="spellStart"/>
+            <w:r>
+              <w:rPr>
+                <w:rFonts w:ascii="NewsGotT" w:hAnsi="NewsGotT"/>
+              </w:rPr>
+              <w:t>completar</w:t>
+            </w:r>
+            <w:proofErr w:type="spellEnd"/>
+            <w:r>
+              <w:rPr>
+                <w:rFonts w:ascii="NewsGotT" w:hAnsi="NewsGotT"/>
+              </w:rPr>
+              <w:t xml:space="preserve"> </w:t>
+            </w:r>
+            <w:proofErr w:type="spellStart"/>
+            <w:r>
+              <w:rPr>
+                <w:rFonts w:ascii="NewsGotT" w:hAnsi="NewsGotT"/>
+              </w:rPr>
+              <w:t>el</w:t>
+            </w:r>
+            <w:proofErr w:type="spellEnd"/>
+            <w:r>
+              <w:rPr>
+                <w:rFonts w:ascii="NewsGotT" w:hAnsi="NewsGotT"/>
+              </w:rPr>
+              <w:t xml:space="preserve"> </w:t>
+            </w:r>
+            <w:proofErr w:type="spellStart"/>
+            <w:r>
+              <w:rPr>
+                <w:rFonts w:ascii="NewsGotT" w:hAnsi="NewsGotT"/>
+              </w:rPr>
+              <w:t>flujo</w:t>
+            </w:r>
+            <w:proofErr w:type="spellEnd"/>
+            <w:r>
+              <w:rPr>
+                <w:rFonts w:ascii="NewsGotT" w:hAnsi="NewsGotT"/>
+              </w:rPr>
+              <w:t xml:space="preserve"> </w:t>
+            </w:r>
+            <w:proofErr w:type="spellStart"/>
+            <w:r>
+              <w:rPr>
+                <w:rFonts w:ascii="NewsGotT" w:hAnsi="NewsGotT"/>
+              </w:rPr>
+              <w:t>esperado</w:t>
+            </w:r>
+            <w:proofErr w:type="spellEnd"/>
+            <w:r>
+              <w:rPr>
+                <w:rFonts w:ascii="NewsGotT" w:hAnsi="NewsGotT"/>
+              </w:rPr>
+              <w:t>.</w:t>
+            </w:r>
+          </w:p>
+        </w:tc>
+      </w:tr>
+      <w:tr>
+        <w:trPr>
+          <w:jc w:val="center"/>
+        </w:trPr>
+        <w:tc>
+          <w:tcPr>
+            <w:tcW w:w="5184" w:type="dxa"/>
+          </w:tcPr>
+          <w:p>
+            <w:pPr>
+              <w:rPr>
+                <w:rFonts w:ascii="NewsGotT" w:hAnsi="NewsGotT"/>
+              </w:rPr>
+            </w:pPr>
+            <w:r>
+              <w:rPr>
+                <w:rFonts w:ascii="NewsGotT" w:hAnsi="NewsGotT"/>
+              </w:rPr>
+              <w:t xml:space="preserve">No </w:t>
+            </w:r>
+            <w:proofErr w:type="spellStart"/>
+            <w:r>
+              <w:rPr>
+                <w:rFonts w:ascii="NewsGotT" w:hAnsi="NewsGotT"/>
+              </w:rPr>
+              <w:t>aplica</w:t>
+            </w:r>
+            <w:proofErr w:type="spellEnd"/>
+          </w:p>
+        </w:tc>
+        <w:tc>
+          <w:tcPr>
+            <w:tcW w:w="5184" w:type="dxa"/>
+          </w:tcPr>
+          <w:p>
+            <w:pPr>
+              <w:rPr>
+                <w:rFonts w:ascii="NewsGotT" w:hAnsi="NewsGotT"/>
+              </w:rPr>
+            </w:pPr>
+            <w:r>
+              <w:rPr>
+                <w:rFonts w:ascii="NewsGotT" w:hAnsi="NewsGotT"/>
+              </w:rPr>
+              <w:t xml:space="preserve">El </w:t>
+            </w:r>
+            <w:proofErr w:type="spellStart"/>
+            <w:r>
+              <w:rPr>
+                <w:rFonts w:ascii="NewsGotT" w:hAnsi="NewsGotT"/>
+              </w:rPr>
+              <w:t>caso</w:t>
+            </w:r>
+            <w:proofErr w:type="spellEnd"/>
+            <w:r>
+              <w:rPr>
+                <w:rFonts w:ascii="NewsGotT" w:hAnsi="NewsGotT"/>
+              </w:rPr>
+              <w:t xml:space="preserve"> no </w:t>
+            </w:r>
+            <w:proofErr w:type="spellStart"/>
+            <w:r>
+              <w:rPr>
+                <w:rFonts w:ascii="NewsGotT" w:hAnsi="NewsGotT"/>
+              </w:rPr>
+              <w:t>corresponde</w:t>
+            </w:r>
+            <w:proofErr w:type="spellEnd"/>
+            <w:r>
+              <w:rPr>
+                <w:rFonts w:ascii="NewsGotT" w:hAnsi="NewsGotT"/>
+              </w:rPr>
+              <w:t xml:space="preserve"> a la </w:t>
+            </w:r>
+            <w:proofErr w:type="spellStart"/>
+            <w:r>
+              <w:rPr>
+                <w:rFonts w:ascii="NewsGotT" w:hAnsi="NewsGotT"/>
+              </w:rPr>
+              <w:t>versión</w:t>
+            </w:r>
+            <w:proofErr w:type="spellEnd"/>
+            <w:r>
+              <w:rPr>
+                <w:rFonts w:ascii="NewsGotT" w:hAnsi="NewsGotT"/>
+              </w:rPr>
+              <w:t xml:space="preserve"> </w:t>
+            </w:r>
+            <w:proofErr w:type="spellStart"/>
+            <w:r>
+              <w:rPr>
+                <w:rFonts w:ascii="NewsGotT" w:hAnsi="NewsGotT"/>
+              </w:rPr>
+              <w:t>evaluada</w:t>
+            </w:r>
+            <w:proofErr w:type="spellEnd"/>
+            <w:r>
+              <w:rPr>
+                <w:rFonts w:ascii="NewsGotT" w:hAnsi="NewsGotT"/>
+              </w:rPr>
+              <w:t xml:space="preserve"> o se </w:t>
+            </w:r>
+            <w:proofErr w:type="spellStart"/>
+            <w:r>
+              <w:rPr>
+                <w:rFonts w:ascii="NewsGotT" w:hAnsi="NewsGotT"/>
+              </w:rPr>
+              <w:t>encuentra</w:t>
+            </w:r>
+            <w:proofErr w:type="spellEnd"/>
+            <w:r>
+              <w:rPr>
+                <w:rFonts w:ascii="NewsGotT" w:hAnsi="NewsGotT"/>
+              </w:rPr>
+              <w:t xml:space="preserve"> fuera del </w:t>
+            </w:r>
+            <w:proofErr w:type="spellStart"/>
+            <w:r>
+              <w:rPr>
+                <w:rFonts w:ascii="NewsGotT" w:hAnsi="NewsGotT"/>
+              </w:rPr>
+              <w:t>alcance</w:t>
+            </w:r>
+            <w:proofErr w:type="spellEnd"/>
+            <w:r>
+              <w:rPr>
+                <w:rFonts w:ascii="NewsGotT" w:hAnsi="NewsGotT"/>
+              </w:rPr>
+              <w:t xml:space="preserve"> del plan.</w:t>
+            </w:r>
+          </w:p>
+        </w:tc>
+      </w:tr>
+      <w:tr>
+        <w:trPr>
+          <w:jc w:val="center"/>
+        </w:trPr>
+        <w:tc>
+          <w:tcPr>
+            <w:tcW w:w="5184" w:type="dxa"/>
+            <w:shd w:val="clear" w:color="auto" w:fill="F2F2F2"/>
+          </w:tcPr>
+          <w:p>
+            <w:pPr>
+              <w:rPr>
+                <w:rFonts w:ascii="NewsGotT" w:hAnsi="NewsGotT"/>
+              </w:rPr>
+            </w:pPr>
+            <w:proofErr w:type="spellStart"/>
+            <w:r>
+              <w:rPr>
+                <w:rFonts w:ascii="NewsGotT" w:hAnsi="NewsGotT"/>
+              </w:rPr>
+              <w:t>Pendiente</w:t>
+            </w:r>
+            <w:proofErr w:type="spellEnd"/>
+          </w:p>
+        </w:tc>
+        <w:tc>
+          <w:tcPr>
+            <w:tcW w:w="5184" w:type="dxa"/>
+            <w:shd w:val="clear" w:color="auto" w:fill="F2F2F2"/>
+          </w:tcPr>
+          <w:p>
+            <w:pPr>
+              <w:rPr>
+                <w:rFonts w:ascii="NewsGotT" w:hAnsi="NewsGotT"/>
+              </w:rPr>
+            </w:pPr>
+            <w:r>
+              <w:rPr>
+                <w:rFonts w:ascii="NewsGotT" w:hAnsi="NewsGotT"/>
+              </w:rPr>
+              <w:t xml:space="preserve">El </w:t>
+            </w:r>
+            <w:proofErr w:type="spellStart"/>
+            <w:r>
+              <w:rPr>
+                <w:rFonts w:ascii="NewsGotT" w:hAnsi="NewsGotT"/>
+              </w:rPr>
+              <w:t>caso</w:t>
+            </w:r>
+            <w:proofErr w:type="spellEnd"/>
+            <w:r>
+              <w:rPr>
+                <w:rFonts w:ascii="NewsGotT" w:hAnsi="NewsGotT"/>
+              </w:rPr>
+              <w:t xml:space="preserve"> </w:t>
+            </w:r>
+            <w:proofErr w:type="spellStart"/>
+            <w:r>
+              <w:rPr>
+                <w:rFonts w:ascii="NewsGotT" w:hAnsi="NewsGotT"/>
+              </w:rPr>
+              <w:t>requiere</w:t>
+            </w:r>
+            <w:proofErr w:type="spellEnd"/>
+            <w:r>
+              <w:rPr>
+                <w:rFonts w:ascii="NewsGotT" w:hAnsi="NewsGotT"/>
+              </w:rPr>
+              <w:t xml:space="preserve"> </w:t>
+            </w:r>
+            <w:proofErr w:type="spellStart"/>
+            <w:r>
+              <w:rPr>
+                <w:rFonts w:ascii="NewsGotT" w:hAnsi="NewsGotT"/>
+              </w:rPr>
+              <w:t>nueva</w:t>
+            </w:r>
+            <w:proofErr w:type="spellEnd"/>
+            <w:r>
+              <w:rPr>
+                <w:rFonts w:ascii="NewsGotT" w:hAnsi="NewsGotT"/>
+              </w:rPr>
+              <w:t xml:space="preserve"> </w:t>
+            </w:r>
+            <w:proofErr w:type="spellStart"/>
+            <w:r>
+              <w:rPr>
+                <w:rFonts w:ascii="NewsGotT" w:hAnsi="NewsGotT"/>
+              </w:rPr>
+              <w:t>ejecución</w:t>
+            </w:r>
+            <w:proofErr w:type="spellEnd"/>
+            <w:r>
+              <w:rPr>
+                <w:rFonts w:ascii="NewsGotT" w:hAnsi="NewsGotT"/>
+              </w:rPr>
+              <w:t xml:space="preserve"> o </w:t>
+            </w:r>
+            <w:proofErr w:type="spellStart"/>
+            <w:r>
+              <w:rPr>
+                <w:rFonts w:ascii="NewsGotT" w:hAnsi="NewsGotT"/>
+              </w:rPr>
+              <w:t>evidencia</w:t>
+            </w:r>
+            <w:proofErr w:type="spellEnd"/>
+            <w:r>
+              <w:rPr>
+                <w:rFonts w:ascii="NewsGotT" w:hAnsi="NewsGotT"/>
+              </w:rPr>
+              <w:t xml:space="preserve"> </w:t>
+            </w:r>
+            <w:proofErr w:type="spellStart"/>
+            <w:r>
+              <w:rPr>
+                <w:rFonts w:ascii="NewsGotT" w:hAnsi="NewsGotT"/>
+              </w:rPr>
+              <w:t>complementaria</w:t>
+            </w:r>
+            <w:proofErr w:type="spellEnd"/>
+            <w:r>
+              <w:rPr>
+                <w:rFonts w:ascii="NewsGotT" w:hAnsi="NewsGotT"/>
+              </w:rPr>
+              <w:t>.</w:t>
+            </w:r>
+          </w:p>
+        </w:tc>
+      </w:tr>
+    </w:tbl>
     <w:p>
       <w:pPr>
         <w:pStyle w:val="Ttulo1"/>
@@ -2242,6 +3813,9 @@
           <w:rFonts w:hint="eastAsia"/>
         </w:rPr>
       </w:pPr>
+      <w:r>
+        <w:t>En este apartado se describen los casos de prueba funcionales definidos para validar el comportamiento global del sistema. Cada caso considera actor, módulo, prerrequisitos, pasos generales, resultado esperado y resultado obtenido.</w:t>
+      </w:r>
     </w:p>
     <w:tbl>
       <w:tblPr>
@@ -2586,44 +4160,6 @@
               <w:t>El usuario debe contar con datos válidos para completar el formulario.</w:t>
             </w:r>
           </w:p>
-          <w:p>
-            <w:pPr>
-              <w:pStyle w:val="TableContents"/>
-              <w:rPr>
-                <w:rFonts w:hint="eastAsia"/>
-                <w:b/>
-                <w:bCs/>
-              </w:rPr>
-            </w:pPr>
-          </w:p>
-          <w:p>
-            <w:pPr>
-              <w:pStyle w:val="TableContents"/>
-              <w:rPr>
-                <w:rFonts w:hint="eastAsia"/>
-                <w:b/>
-                <w:bCs/>
-              </w:rPr>
-            </w:pPr>
-          </w:p>
-          <w:p>
-            <w:pPr>
-              <w:pStyle w:val="TableContents"/>
-              <w:rPr>
-                <w:rFonts w:hint="eastAsia"/>
-                <w:b/>
-                <w:bCs/>
-              </w:rPr>
-            </w:pPr>
-          </w:p>
-          <w:p>
-            <w:pPr>
-              <w:pStyle w:val="TableContents"/>
-              <w:rPr>
-                <w:rFonts w:hint="eastAsia"/>
-              </w:rPr>
-            </w:pPr>
-          </w:p>
         </w:tc>
       </w:tr>
       <w:tr>
@@ -2917,16 +4453,6 @@
               </w:rPr>
               <w:t>El sistema debe registrar correctamente al usuario y permitir la creación de la cuenta.</w:t>
             </w:r>
-          </w:p>
-          <w:p>
-            <w:pPr>
-              <w:pStyle w:val="TableContents"/>
-              <w:rPr>
-                <w:rFonts w:hint="eastAsia"/>
-                <w:b/>
-                <w:bCs/>
-              </w:rPr>
-            </w:pPr>
           </w:p>
           <w:p>
             <w:pPr>
@@ -2999,29 +4525,25 @@
               </w:rPr>
             </w:pPr>
           </w:p>
-          <w:p>
-            <w:pPr>
-              <w:pStyle w:val="TableContents"/>
-              <w:rPr>
-                <w:rFonts w:hint="eastAsia"/>
-                <w:b/>
-                <w:bCs/>
-              </w:rPr>
-            </w:pPr>
-          </w:p>
-          <w:p>
-            <w:pPr>
-              <w:pStyle w:val="TableContents"/>
-              <w:rPr>
-                <w:rFonts w:hint="eastAsia"/>
-                <w:b/>
-                <w:bCs/>
-              </w:rPr>
-            </w:pPr>
-          </w:p>
         </w:tc>
       </w:tr>
     </w:tbl>
+    <w:p>
+      <w:pPr>
+        <w:pStyle w:val="Textbody"/>
+        <w:rPr>
+          <w:u w:val="single"/>
+        </w:rPr>
+      </w:pPr>
+    </w:p>
+    <w:p>
+      <w:pPr>
+        <w:pStyle w:val="Textbody"/>
+        <w:rPr>
+          <w:u w:val="single"/>
+        </w:rPr>
+      </w:pPr>
+    </w:p>
     <w:p>
       <w:pPr>
         <w:pStyle w:val="Textbody"/>
@@ -3348,34 +4870,6 @@
               <w:t>El usuario debe encontrarse en el formulario de registro.</w:t>
             </w:r>
           </w:p>
-          <w:p>
-            <w:pPr>
-              <w:pStyle w:val="TableContents"/>
-              <w:rPr>
-                <w:rFonts w:hint="eastAsia"/>
-                <w:b/>
-                <w:bCs/>
-              </w:rPr>
-            </w:pPr>
-          </w:p>
-          <w:p>
-            <w:pPr>
-              <w:pStyle w:val="TableContents"/>
-              <w:rPr>
-                <w:rFonts w:hint="eastAsia"/>
-                <w:b/>
-                <w:bCs/>
-              </w:rPr>
-            </w:pPr>
-          </w:p>
-          <w:p>
-            <w:pPr>
-              <w:pStyle w:val="TableContents"/>
-              <w:rPr>
-                <w:rFonts w:hint="eastAsia"/>
-              </w:rPr>
-            </w:pPr>
-          </w:p>
         </w:tc>
       </w:tr>
       <w:tr>
@@ -3479,7 +4973,6 @@
                 <w:bCs/>
                 <w:lang w:val="es-CL"/>
               </w:rPr>
-              <w:lastRenderedPageBreak/>
               <w:t>Dejar campos obligatorios vacíos:</w:t>
             </w:r>
           </w:p>
@@ -3556,6 +5049,7 @@
               <w:rPr>
                 <w:lang w:val="es-CL"/>
               </w:rPr>
+              <w:lastRenderedPageBreak/>
               <w:t>Contraseña.</w:t>
             </w:r>
           </w:p>
@@ -3671,16 +5165,6 @@
               </w:rPr>
               <w:t>El sistema debe mostrar un mensaje indicando que faltan datos obligatorios y no debe crear el usuario.</w:t>
             </w:r>
-          </w:p>
-          <w:p>
-            <w:pPr>
-              <w:pStyle w:val="TableContents"/>
-              <w:rPr>
-                <w:rFonts w:hint="eastAsia"/>
-                <w:b/>
-                <w:bCs/>
-              </w:rPr>
-            </w:pPr>
           </w:p>
           <w:p>
             <w:pPr>
@@ -4097,26 +5581,6 @@
               <w:pStyle w:val="TableContents"/>
               <w:rPr>
                 <w:rFonts w:hint="eastAsia"/>
-                <w:b/>
-                <w:bCs/>
-              </w:rPr>
-            </w:pPr>
-          </w:p>
-          <w:p>
-            <w:pPr>
-              <w:pStyle w:val="TableContents"/>
-              <w:rPr>
-                <w:rFonts w:hint="eastAsia"/>
-                <w:b/>
-                <w:bCs/>
-              </w:rPr>
-            </w:pPr>
-          </w:p>
-          <w:p>
-            <w:pPr>
-              <w:pStyle w:val="TableContents"/>
-              <w:rPr>
-                <w:rFonts w:hint="eastAsia"/>
               </w:rPr>
             </w:pPr>
           </w:p>
@@ -4343,16 +5807,6 @@
               </w:rPr>
               <w:t>El sistema debe validar las credenciales e iniciar sesión correctamente.</w:t>
             </w:r>
-          </w:p>
-          <w:p>
-            <w:pPr>
-              <w:pStyle w:val="TableContents"/>
-              <w:rPr>
-                <w:rFonts w:hint="eastAsia"/>
-                <w:b/>
-                <w:bCs/>
-              </w:rPr>
-            </w:pPr>
           </w:p>
           <w:p>
             <w:pPr>
@@ -4414,16 +5868,6 @@
             <w:r>
               <w:t>El usuario ingresa correctamente al sistema. Cumple.</w:t>
             </w:r>
-          </w:p>
-          <w:p>
-            <w:pPr>
-              <w:pStyle w:val="TableContents"/>
-              <w:rPr>
-                <w:rFonts w:hint="eastAsia"/>
-                <w:b/>
-                <w:bCs/>
-              </w:rPr>
-            </w:pPr>
           </w:p>
           <w:p>
             <w:pPr>
@@ -4764,26 +6208,6 @@
               <w:pStyle w:val="TableContents"/>
               <w:rPr>
                 <w:rFonts w:hint="eastAsia"/>
-                <w:b/>
-                <w:bCs/>
-              </w:rPr>
-            </w:pPr>
-          </w:p>
-          <w:p>
-            <w:pPr>
-              <w:pStyle w:val="TableContents"/>
-              <w:rPr>
-                <w:rFonts w:hint="eastAsia"/>
-                <w:b/>
-                <w:bCs/>
-              </w:rPr>
-            </w:pPr>
-          </w:p>
-          <w:p>
-            <w:pPr>
-              <w:pStyle w:val="TableContents"/>
-              <w:rPr>
-                <w:rFonts w:hint="eastAsia"/>
               </w:rPr>
             </w:pPr>
           </w:p>
@@ -4821,7 +6245,6 @@
                 <w:b/>
                 <w:bCs/>
               </w:rPr>
-              <w:lastRenderedPageBreak/>
               <w:t>Pasos:</w:t>
             </w:r>
           </w:p>
@@ -4945,6 +6368,15 @@
               </w:rPr>
               <w:t>El sistema debe mostrar un mensaje indicando que faltan datos y no permitir el acceso.</w:t>
             </w:r>
+          </w:p>
+          <w:p>
+            <w:pPr>
+              <w:pStyle w:val="TableContents"/>
+              <w:rPr>
+                <w:b/>
+                <w:bCs/>
+              </w:rPr>
+            </w:pPr>
           </w:p>
           <w:p>
             <w:pPr>
@@ -4991,6 +6423,7 @@
                 <w:b/>
                 <w:bCs/>
               </w:rPr>
+              <w:lastRenderedPageBreak/>
               <w:t>Resultado obtenido:</w:t>
             </w:r>
           </w:p>
@@ -5006,16 +6439,6 @@
             <w:r>
               <w:t>El sistema muestra mensaje de validación y no inicia sesión. Cumple.</w:t>
             </w:r>
-          </w:p>
-          <w:p>
-            <w:pPr>
-              <w:pStyle w:val="TableContents"/>
-              <w:rPr>
-                <w:rFonts w:hint="eastAsia"/>
-                <w:b/>
-                <w:bCs/>
-              </w:rPr>
-            </w:pPr>
           </w:p>
           <w:p>
             <w:pPr>
@@ -5361,26 +6784,6 @@
               <w:pStyle w:val="TableContents"/>
               <w:rPr>
                 <w:rFonts w:hint="eastAsia"/>
-                <w:b/>
-                <w:bCs/>
-              </w:rPr>
-            </w:pPr>
-          </w:p>
-          <w:p>
-            <w:pPr>
-              <w:pStyle w:val="TableContents"/>
-              <w:rPr>
-                <w:rFonts w:hint="eastAsia"/>
-                <w:b/>
-                <w:bCs/>
-              </w:rPr>
-            </w:pPr>
-          </w:p>
-          <w:p>
-            <w:pPr>
-              <w:pStyle w:val="TableContents"/>
-              <w:rPr>
-                <w:rFonts w:hint="eastAsia"/>
               </w:rPr>
             </w:pPr>
           </w:p>
@@ -5829,19 +7232,17 @@
               </w:rPr>
             </w:pPr>
           </w:p>
-          <w:p>
-            <w:pPr>
-              <w:pStyle w:val="TableContents"/>
-              <w:rPr>
-                <w:rFonts w:hint="eastAsia"/>
-                <w:b/>
-                <w:bCs/>
-              </w:rPr>
-            </w:pPr>
-          </w:p>
         </w:tc>
       </w:tr>
     </w:tbl>
+    <w:p>
+      <w:pPr>
+        <w:pStyle w:val="Textbody"/>
+        <w:rPr>
+          <w:u w:val="single"/>
+        </w:rPr>
+      </w:pPr>
+    </w:p>
     <w:p>
       <w:pPr>
         <w:pStyle w:val="Textbody"/>
@@ -6072,7 +7473,6 @@
                 <w:b/>
                 <w:bCs/>
               </w:rPr>
-              <w:lastRenderedPageBreak/>
               <w:t>Descripción:</w:t>
             </w:r>
           </w:p>
@@ -6195,26 +7595,6 @@
               <w:pStyle w:val="TableContents"/>
               <w:rPr>
                 <w:rFonts w:hint="eastAsia"/>
-                <w:b/>
-                <w:bCs/>
-              </w:rPr>
-            </w:pPr>
-          </w:p>
-          <w:p>
-            <w:pPr>
-              <w:pStyle w:val="TableContents"/>
-              <w:rPr>
-                <w:rFonts w:hint="eastAsia"/>
-                <w:b/>
-                <w:bCs/>
-              </w:rPr>
-            </w:pPr>
-          </w:p>
-          <w:p>
-            <w:pPr>
-              <w:pStyle w:val="TableContents"/>
-              <w:rPr>
-                <w:rFonts w:hint="eastAsia"/>
               </w:rPr>
             </w:pPr>
           </w:p>
@@ -6381,6 +7761,7 @@
                 <w:b/>
                 <w:bCs/>
               </w:rPr>
+              <w:lastRenderedPageBreak/>
               <w:t>Resultado esperado:</w:t>
             </w:r>
           </w:p>
@@ -6460,16 +7841,6 @@
             <w:r>
               <w:t>El sistema informa los datos faltantes y no registra la mascota. Cumple.</w:t>
             </w:r>
-          </w:p>
-          <w:p>
-            <w:pPr>
-              <w:pStyle w:val="TableContents"/>
-              <w:rPr>
-                <w:rFonts w:hint="eastAsia"/>
-                <w:b/>
-                <w:bCs/>
-              </w:rPr>
-            </w:pPr>
           </w:p>
           <w:p>
             <w:pPr>
@@ -6836,26 +8207,6 @@
               <w:pStyle w:val="TableContents"/>
               <w:rPr>
                 <w:rFonts w:hint="eastAsia"/>
-                <w:b/>
-                <w:bCs/>
-              </w:rPr>
-            </w:pPr>
-          </w:p>
-          <w:p>
-            <w:pPr>
-              <w:pStyle w:val="TableContents"/>
-              <w:rPr>
-                <w:rFonts w:hint="eastAsia"/>
-                <w:b/>
-                <w:bCs/>
-              </w:rPr>
-            </w:pPr>
-          </w:p>
-          <w:p>
-            <w:pPr>
-              <w:pStyle w:val="TableContents"/>
-              <w:rPr>
-                <w:rFonts w:hint="eastAsia"/>
               </w:rPr>
             </w:pPr>
           </w:p>
@@ -7156,16 +8507,6 @@
               </w:rPr>
               <w:t>El sistema debe guardar el evento veterinario asociado a la mascota seleccionada.</w:t>
             </w:r>
-          </w:p>
-          <w:p>
-            <w:pPr>
-              <w:pStyle w:val="TableContents"/>
-              <w:rPr>
-                <w:rFonts w:hint="eastAsia"/>
-                <w:b/>
-                <w:bCs/>
-              </w:rPr>
-            </w:pPr>
           </w:p>
           <w:p>
             <w:pPr>
@@ -7238,19 +8579,17 @@
               </w:rPr>
             </w:pPr>
           </w:p>
-          <w:p>
-            <w:pPr>
-              <w:pStyle w:val="TableContents"/>
-              <w:rPr>
-                <w:rFonts w:hint="eastAsia"/>
-                <w:b/>
-                <w:bCs/>
-              </w:rPr>
-            </w:pPr>
-          </w:p>
         </w:tc>
       </w:tr>
     </w:tbl>
+    <w:p>
+      <w:pPr>
+        <w:pStyle w:val="Textbody"/>
+        <w:rPr>
+          <w:u w:val="single"/>
+        </w:rPr>
+      </w:pPr>
+    </w:p>
     <w:p>
       <w:pPr>
         <w:pStyle w:val="Textbody"/>
@@ -7603,26 +8942,6 @@
               <w:pStyle w:val="TableContents"/>
               <w:rPr>
                 <w:rFonts w:hint="eastAsia"/>
-                <w:b/>
-                <w:bCs/>
-              </w:rPr>
-            </w:pPr>
-          </w:p>
-          <w:p>
-            <w:pPr>
-              <w:pStyle w:val="TableContents"/>
-              <w:rPr>
-                <w:rFonts w:hint="eastAsia"/>
-                <w:b/>
-                <w:bCs/>
-              </w:rPr>
-            </w:pPr>
-          </w:p>
-          <w:p>
-            <w:pPr>
-              <w:pStyle w:val="TableContents"/>
-              <w:rPr>
-                <w:rFonts w:hint="eastAsia"/>
               </w:rPr>
             </w:pPr>
           </w:p>
@@ -7812,6 +9131,7 @@
                 <w:b/>
                 <w:bCs/>
               </w:rPr>
+              <w:lastRenderedPageBreak/>
               <w:t>Resultado esperado:</w:t>
             </w:r>
           </w:p>
@@ -7831,17 +9151,6 @@
               </w:rPr>
               <w:t>El sistema debe indicar que faltan datos y no debe crear el evento.</w:t>
             </w:r>
-          </w:p>
-          <w:p>
-            <w:pPr>
-              <w:pStyle w:val="TableContents"/>
-              <w:rPr>
-                <w:rFonts w:hint="eastAsia"/>
-                <w:b/>
-                <w:bCs/>
-                <w:lang w:val="es-CL"/>
-              </w:rPr>
-            </w:pPr>
           </w:p>
           <w:p>
             <w:pPr>
@@ -7903,16 +9212,6 @@
             <w:r>
               <w:t>El sistema muestra validación de campos obligatorios y no registra el evento. Cumple.</w:t>
             </w:r>
-          </w:p>
-          <w:p>
-            <w:pPr>
-              <w:pStyle w:val="TableContents"/>
-              <w:rPr>
-                <w:rFonts w:hint="eastAsia"/>
-                <w:b/>
-                <w:bCs/>
-              </w:rPr>
-            </w:pPr>
           </w:p>
           <w:p>
             <w:pPr>
@@ -8279,26 +9578,6 @@
               <w:pStyle w:val="TableContents"/>
               <w:rPr>
                 <w:rFonts w:hint="eastAsia"/>
-                <w:b/>
-                <w:bCs/>
-              </w:rPr>
-            </w:pPr>
-          </w:p>
-          <w:p>
-            <w:pPr>
-              <w:pStyle w:val="TableContents"/>
-              <w:rPr>
-                <w:rFonts w:hint="eastAsia"/>
-                <w:b/>
-                <w:bCs/>
-              </w:rPr>
-            </w:pPr>
-          </w:p>
-          <w:p>
-            <w:pPr>
-              <w:pStyle w:val="TableContents"/>
-              <w:rPr>
-                <w:rFonts w:hint="eastAsia"/>
               </w:rPr>
             </w:pPr>
           </w:p>
@@ -8565,7 +9844,6 @@
               <w:rPr>
                 <w:color w:val="000000"/>
               </w:rPr>
-              <w:lastRenderedPageBreak/>
               <w:t>El sistema debe registrar el comentario asociado al servicio seleccionado.</w:t>
             </w:r>
           </w:p>
@@ -8614,7 +9892,6 @@
                 <w:b/>
                 <w:bCs/>
               </w:rPr>
-              <w:lastRenderedPageBreak/>
               <w:t>Resultado obtenido:</w:t>
             </w:r>
           </w:p>
@@ -8630,16 +9907,6 @@
             <w:r>
               <w:t>El comentario fue agregado correctamente al servicio. Cumple.</w:t>
             </w:r>
-          </w:p>
-          <w:p>
-            <w:pPr>
-              <w:pStyle w:val="TableContents"/>
-              <w:rPr>
-                <w:rFonts w:hint="eastAsia"/>
-                <w:b/>
-                <w:bCs/>
-              </w:rPr>
-            </w:pPr>
           </w:p>
           <w:p>
             <w:pPr>
@@ -9006,26 +10273,6 @@
               <w:pStyle w:val="TableContents"/>
               <w:rPr>
                 <w:rFonts w:hint="eastAsia"/>
-                <w:b/>
-                <w:bCs/>
-              </w:rPr>
-            </w:pPr>
-          </w:p>
-          <w:p>
-            <w:pPr>
-              <w:pStyle w:val="TableContents"/>
-              <w:rPr>
-                <w:rFonts w:hint="eastAsia"/>
-                <w:b/>
-                <w:bCs/>
-              </w:rPr>
-            </w:pPr>
-          </w:p>
-          <w:p>
-            <w:pPr>
-              <w:pStyle w:val="TableContents"/>
-              <w:rPr>
-                <w:rFonts w:hint="eastAsia"/>
               </w:rPr>
             </w:pPr>
           </w:p>
@@ -9279,6 +10526,7 @@
                 <w:b/>
                 <w:bCs/>
               </w:rPr>
+              <w:lastRenderedPageBreak/>
               <w:t>Resultado obtenido:</w:t>
             </w:r>
           </w:p>
@@ -9294,16 +10542,6 @@
             <w:r>
               <w:t>El sistema solicita completar los datos faltantes y no guarda el comentario. Cumple.</w:t>
             </w:r>
-          </w:p>
-          <w:p>
-            <w:pPr>
-              <w:pStyle w:val="TableContents"/>
-              <w:rPr>
-                <w:rFonts w:hint="eastAsia"/>
-                <w:b/>
-                <w:bCs/>
-              </w:rPr>
-            </w:pPr>
           </w:p>
           <w:p>
             <w:pPr>
@@ -9673,26 +10911,6 @@
               <w:pStyle w:val="TableContents"/>
               <w:rPr>
                 <w:rFonts w:hint="eastAsia"/>
-                <w:b/>
-                <w:bCs/>
-              </w:rPr>
-            </w:pPr>
-          </w:p>
-          <w:p>
-            <w:pPr>
-              <w:pStyle w:val="TableContents"/>
-              <w:rPr>
-                <w:rFonts w:hint="eastAsia"/>
-                <w:b/>
-                <w:bCs/>
-              </w:rPr>
-            </w:pPr>
-          </w:p>
-          <w:p>
-            <w:pPr>
-              <w:pStyle w:val="TableContents"/>
-              <w:rPr>
-                <w:rFonts w:hint="eastAsia"/>
               </w:rPr>
             </w:pPr>
           </w:p>
@@ -9873,7 +11091,6 @@
               <w:rPr>
                 <w:color w:val="000000"/>
               </w:rPr>
-              <w:lastRenderedPageBreak/>
               <w:t>El sistema debe mostrar las opciones de gestión del comentario seleccionado y permitir modificarlo o eliminarlo.</w:t>
             </w:r>
           </w:p>
@@ -9922,7 +11139,6 @@
                 <w:b/>
                 <w:bCs/>
               </w:rPr>
-              <w:lastRenderedPageBreak/>
               <w:t>Resultado obtenido:</w:t>
             </w:r>
           </w:p>
@@ -9938,16 +11154,6 @@
             <w:r>
               <w:t>El sistema permite editar o eliminar comentarios correctamente. Cumple.</w:t>
             </w:r>
-          </w:p>
-          <w:p>
-            <w:pPr>
-              <w:pStyle w:val="TableContents"/>
-              <w:rPr>
-                <w:rFonts w:hint="eastAsia"/>
-                <w:b/>
-                <w:bCs/>
-              </w:rPr>
-            </w:pPr>
           </w:p>
           <w:p>
             <w:pPr>
@@ -10314,26 +11520,6 @@
               <w:pStyle w:val="TableContents"/>
               <w:rPr>
                 <w:rFonts w:hint="eastAsia"/>
-                <w:b/>
-                <w:bCs/>
-              </w:rPr>
-            </w:pPr>
-          </w:p>
-          <w:p>
-            <w:pPr>
-              <w:pStyle w:val="TableContents"/>
-              <w:rPr>
-                <w:rFonts w:hint="eastAsia"/>
-                <w:b/>
-                <w:bCs/>
-              </w:rPr>
-            </w:pPr>
-          </w:p>
-          <w:p>
-            <w:pPr>
-              <w:pStyle w:val="TableContents"/>
-              <w:rPr>
-                <w:rFonts w:hint="eastAsia"/>
               </w:rPr>
             </w:pPr>
           </w:p>
@@ -10653,6 +11839,7 @@
                 <w:bCs/>
                 <w:lang w:val="es-CL"/>
               </w:rPr>
+              <w:lastRenderedPageBreak/>
               <w:t>Seleccionar "Registrar".</w:t>
             </w:r>
           </w:p>
@@ -10690,6 +11877,7 @@
                 <w:b/>
                 <w:bCs/>
               </w:rPr>
+              <w:lastRenderedPageBreak/>
               <w:t>Resultado esperado:</w:t>
             </w:r>
           </w:p>
@@ -10769,16 +11957,6 @@
             <w:r>
               <w:t>La cuenta de empresa fue creada correctamente. Cumple.</w:t>
             </w:r>
-          </w:p>
-          <w:p>
-            <w:pPr>
-              <w:pStyle w:val="TableContents"/>
-              <w:rPr>
-                <w:rFonts w:hint="eastAsia"/>
-                <w:b/>
-                <w:bCs/>
-              </w:rPr>
-            </w:pPr>
           </w:p>
           <w:p>
             <w:pPr>
@@ -11124,26 +12302,6 @@
               <w:pStyle w:val="TableContents"/>
               <w:rPr>
                 <w:rFonts w:hint="eastAsia"/>
-                <w:b/>
-                <w:bCs/>
-              </w:rPr>
-            </w:pPr>
-          </w:p>
-          <w:p>
-            <w:pPr>
-              <w:pStyle w:val="TableContents"/>
-              <w:rPr>
-                <w:rFonts w:hint="eastAsia"/>
-                <w:b/>
-                <w:bCs/>
-              </w:rPr>
-            </w:pPr>
-          </w:p>
-          <w:p>
-            <w:pPr>
-              <w:pStyle w:val="TableContents"/>
-              <w:rPr>
-                <w:rFonts w:hint="eastAsia"/>
               </w:rPr>
             </w:pPr>
           </w:p>
@@ -11181,7 +12339,6 @@
                 <w:b/>
                 <w:bCs/>
               </w:rPr>
-              <w:lastRenderedPageBreak/>
               <w:t>Pasos:</w:t>
             </w:r>
           </w:p>
@@ -11390,16 +12547,6 @@
             <w:r>
               <w:t>El sistema muestra mensaje de validación y bloquea el registro. Cumple.</w:t>
             </w:r>
-          </w:p>
-          <w:p>
-            <w:pPr>
-              <w:pStyle w:val="TableContents"/>
-              <w:rPr>
-                <w:rFonts w:hint="eastAsia"/>
-                <w:b/>
-                <w:bCs/>
-              </w:rPr>
-            </w:pPr>
           </w:p>
           <w:p>
             <w:pPr>
@@ -11758,28 +12905,8 @@
                 <w:color w:val="000000"/>
                 <w:lang w:val="es-CL"/>
               </w:rPr>
-              <w:t>El sistema debe estar operativo.</w:t>
-            </w:r>
-          </w:p>
-          <w:p>
-            <w:pPr>
-              <w:pStyle w:val="TableContents"/>
-              <w:rPr>
-                <w:rFonts w:hint="eastAsia"/>
-                <w:b/>
-                <w:bCs/>
-              </w:rPr>
-            </w:pPr>
-          </w:p>
-          <w:p>
-            <w:pPr>
-              <w:pStyle w:val="TableContents"/>
-              <w:rPr>
-                <w:rFonts w:hint="eastAsia"/>
-                <w:b/>
-                <w:bCs/>
-              </w:rPr>
-            </w:pPr>
+              <w:t>El sistema debe estar operativo</w:t>
+            </w:r>
           </w:p>
           <w:p>
             <w:pPr>
@@ -12032,16 +13159,6 @@
             <w:r>
               <w:t>El usuario empresa ingresa correctamente al sistema. Cumple.</w:t>
             </w:r>
-          </w:p>
-          <w:p>
-            <w:pPr>
-              <w:pStyle w:val="TableContents"/>
-              <w:rPr>
-                <w:rFonts w:hint="eastAsia"/>
-                <w:b/>
-                <w:bCs/>
-              </w:rPr>
-            </w:pPr>
           </w:p>
           <w:p>
             <w:pPr>
@@ -12108,6 +13225,7 @@
               </w:rPr>
             </w:pPr>
             <w:r>
+              <w:lastRenderedPageBreak/>
               <w:t>Inicio de sesión dueño de empresa con datos incompletos</w:t>
             </w:r>
           </w:p>
@@ -12387,26 +13505,6 @@
               <w:pStyle w:val="TableContents"/>
               <w:rPr>
                 <w:rFonts w:hint="eastAsia"/>
-                <w:b/>
-                <w:bCs/>
-              </w:rPr>
-            </w:pPr>
-          </w:p>
-          <w:p>
-            <w:pPr>
-              <w:pStyle w:val="TableContents"/>
-              <w:rPr>
-                <w:rFonts w:hint="eastAsia"/>
-                <w:b/>
-                <w:bCs/>
-              </w:rPr>
-            </w:pPr>
-          </w:p>
-          <w:p>
-            <w:pPr>
-              <w:pStyle w:val="TableContents"/>
-              <w:rPr>
-                <w:rFonts w:hint="eastAsia"/>
               </w:rPr>
             </w:pPr>
           </w:p>
@@ -12467,7 +13565,6 @@
                 <w:bCs/>
                 <w:lang w:val="es-CL"/>
               </w:rPr>
-              <w:lastRenderedPageBreak/>
               <w:t>Ingresar al Login.</w:t>
             </w:r>
           </w:p>
@@ -12574,7 +13671,6 @@
                 <w:b/>
                 <w:bCs/>
               </w:rPr>
-              <w:lastRenderedPageBreak/>
               <w:t>Resultado esperado:</w:t>
             </w:r>
           </w:p>
@@ -12654,16 +13750,6 @@
             <w:r>
               <w:t>El sistema bloquea el acceso y muestra mensaje de validación. Cumple.</w:t>
             </w:r>
-          </w:p>
-          <w:p>
-            <w:pPr>
-              <w:pStyle w:val="TableContents"/>
-              <w:rPr>
-                <w:rFonts w:hint="eastAsia"/>
-                <w:b/>
-                <w:bCs/>
-              </w:rPr>
-            </w:pPr>
           </w:p>
           <w:p>
             <w:pPr>
@@ -13030,26 +14116,6 @@
               <w:pStyle w:val="TableContents"/>
               <w:rPr>
                 <w:rFonts w:hint="eastAsia"/>
-                <w:b/>
-                <w:bCs/>
-              </w:rPr>
-            </w:pPr>
-          </w:p>
-          <w:p>
-            <w:pPr>
-              <w:pStyle w:val="TableContents"/>
-              <w:rPr>
-                <w:rFonts w:hint="eastAsia"/>
-                <w:b/>
-                <w:bCs/>
-              </w:rPr>
-            </w:pPr>
-          </w:p>
-          <w:p>
-            <w:pPr>
-              <w:pStyle w:val="TableContents"/>
-              <w:rPr>
-                <w:rFonts w:hint="eastAsia"/>
               </w:rPr>
             </w:pPr>
           </w:p>
@@ -13308,16 +14374,6 @@
               </w:rPr>
               <w:t>El sistema debe registrar correctamente la promoción y mostrarla dentro del perfil de empresa.</w:t>
             </w:r>
-          </w:p>
-          <w:p>
-            <w:pPr>
-              <w:pStyle w:val="TableContents"/>
-              <w:rPr>
-                <w:rFonts w:hint="eastAsia"/>
-                <w:b/>
-                <w:bCs/>
-              </w:rPr>
-            </w:pPr>
           </w:p>
           <w:p>
             <w:pPr>
@@ -13390,19 +14446,33 @@
               </w:rPr>
             </w:pPr>
           </w:p>
-          <w:p>
-            <w:pPr>
-              <w:pStyle w:val="TableContents"/>
-              <w:rPr>
-                <w:rFonts w:hint="eastAsia"/>
-                <w:b/>
-                <w:bCs/>
-              </w:rPr>
-            </w:pPr>
-          </w:p>
         </w:tc>
       </w:tr>
     </w:tbl>
+    <w:p>
+      <w:pPr>
+        <w:pStyle w:val="Textbody"/>
+        <w:rPr>
+          <w:u w:val="single"/>
+        </w:rPr>
+      </w:pPr>
+    </w:p>
+    <w:p>
+      <w:pPr>
+        <w:pStyle w:val="Textbody"/>
+        <w:rPr>
+          <w:u w:val="single"/>
+        </w:rPr>
+      </w:pPr>
+    </w:p>
+    <w:p>
+      <w:pPr>
+        <w:pStyle w:val="Textbody"/>
+        <w:rPr>
+          <w:u w:val="single"/>
+        </w:rPr>
+      </w:pPr>
+    </w:p>
     <w:p>
       <w:pPr>
         <w:pStyle w:val="Textbody"/>
@@ -13455,6 +14525,7 @@
               </w:rPr>
             </w:pPr>
             <w:r>
+              <w:lastRenderedPageBreak/>
               <w:t>Registro de promoción sin datos</w:t>
             </w:r>
           </w:p>
@@ -13755,26 +14826,6 @@
               <w:pStyle w:val="TableContents"/>
               <w:rPr>
                 <w:rFonts w:hint="eastAsia"/>
-                <w:b/>
-                <w:bCs/>
-              </w:rPr>
-            </w:pPr>
-          </w:p>
-          <w:p>
-            <w:pPr>
-              <w:pStyle w:val="TableContents"/>
-              <w:rPr>
-                <w:rFonts w:hint="eastAsia"/>
-                <w:b/>
-                <w:bCs/>
-              </w:rPr>
-            </w:pPr>
-          </w:p>
-          <w:p>
-            <w:pPr>
-              <w:pStyle w:val="TableContents"/>
-              <w:rPr>
-                <w:rFonts w:hint="eastAsia"/>
               </w:rPr>
             </w:pPr>
           </w:p>
@@ -13812,7 +14863,6 @@
                 <w:b/>
                 <w:bCs/>
               </w:rPr>
-              <w:lastRenderedPageBreak/>
               <w:t>Pasos:</w:t>
             </w:r>
           </w:p>
@@ -14097,16 +15147,6 @@
             <w:r>
               <w:t>El sistema valida los campos obligatorios y no crea la promoción. Cumple.</w:t>
             </w:r>
-          </w:p>
-          <w:p>
-            <w:pPr>
-              <w:pStyle w:val="TableContents"/>
-              <w:rPr>
-                <w:rFonts w:hint="eastAsia"/>
-                <w:b/>
-                <w:bCs/>
-              </w:rPr>
-            </w:pPr>
           </w:p>
           <w:p>
             <w:pPr>
@@ -14473,26 +15513,6 @@
               <w:pStyle w:val="TableContents"/>
               <w:rPr>
                 <w:rFonts w:hint="eastAsia"/>
-                <w:b/>
-                <w:bCs/>
-              </w:rPr>
-            </w:pPr>
-          </w:p>
-          <w:p>
-            <w:pPr>
-              <w:pStyle w:val="TableContents"/>
-              <w:rPr>
-                <w:rFonts w:hint="eastAsia"/>
-                <w:b/>
-                <w:bCs/>
-              </w:rPr>
-            </w:pPr>
-          </w:p>
-          <w:p>
-            <w:pPr>
-              <w:pStyle w:val="TableContents"/>
-              <w:rPr>
-                <w:rFonts w:hint="eastAsia"/>
               </w:rPr>
             </w:pPr>
           </w:p>
@@ -14807,16 +15827,6 @@
             <w:r>
               <w:t>La entrada de blog fue creada correctamente. Cumple.</w:t>
             </w:r>
-          </w:p>
-          <w:p>
-            <w:pPr>
-              <w:pStyle w:val="TableContents"/>
-              <w:rPr>
-                <w:rFonts w:hint="eastAsia"/>
-                <w:b/>
-                <w:bCs/>
-              </w:rPr>
-            </w:pPr>
           </w:p>
           <w:p>
             <w:pPr>
@@ -15112,7 +16122,6 @@
                 <w:b/>
                 <w:bCs/>
               </w:rPr>
-              <w:lastRenderedPageBreak/>
               <w:t>Prerrequisitos</w:t>
             </w:r>
           </w:p>
@@ -15194,16 +16203,6 @@
               </w:rPr>
               <w:t>El usuario debe encontrarse registrado o ingresar datos inválidos para validar la respuesta.</w:t>
             </w:r>
-          </w:p>
-          <w:p>
-            <w:pPr>
-              <w:pStyle w:val="TableContents"/>
-              <w:rPr>
-                <w:rFonts w:hint="eastAsia"/>
-                <w:b/>
-                <w:bCs/>
-              </w:rPr>
-            </w:pPr>
           </w:p>
           <w:p>
             <w:pPr>
@@ -15837,16 +16836,6 @@
               <w:pStyle w:val="TableContents"/>
               <w:rPr>
                 <w:rFonts w:hint="eastAsia"/>
-                <w:b/>
-                <w:bCs/>
-              </w:rPr>
-            </w:pPr>
-          </w:p>
-          <w:p>
-            <w:pPr>
-              <w:pStyle w:val="TableContents"/>
-              <w:rPr>
-                <w:rFonts w:hint="eastAsia"/>
               </w:rPr>
             </w:pPr>
           </w:p>
@@ -16864,16 +17853,6 @@
               <w:pStyle w:val="TableContents"/>
               <w:rPr>
                 <w:rFonts w:hint="eastAsia"/>
-                <w:b/>
-                <w:bCs/>
-              </w:rPr>
-            </w:pPr>
-          </w:p>
-          <w:p>
-            <w:pPr>
-              <w:pStyle w:val="TableContents"/>
-              <w:rPr>
-                <w:rFonts w:hint="eastAsia"/>
               </w:rPr>
             </w:pPr>
           </w:p>
@@ -17672,16 +18651,6 @@
               <w:pStyle w:val="TableContents"/>
               <w:rPr>
                 <w:rFonts w:hint="eastAsia"/>
-                <w:b/>
-                <w:bCs/>
-              </w:rPr>
-            </w:pPr>
-          </w:p>
-          <w:p>
-            <w:pPr>
-              <w:pStyle w:val="TableContents"/>
-              <w:rPr>
-                <w:rFonts w:hint="eastAsia"/>
               </w:rPr>
             </w:pPr>
           </w:p>
@@ -17967,6 +18936,30 @@
         </w:tc>
       </w:tr>
     </w:tbl>
+    <w:p>
+      <w:pPr>
+        <w:pStyle w:val="Textbody"/>
+        <w:rPr>
+          <w:u w:val="single"/>
+        </w:rPr>
+      </w:pPr>
+    </w:p>
+    <w:p>
+      <w:pPr>
+        <w:pStyle w:val="Textbody"/>
+        <w:rPr>
+          <w:u w:val="single"/>
+        </w:rPr>
+      </w:pPr>
+    </w:p>
+    <w:p>
+      <w:pPr>
+        <w:pStyle w:val="Textbody"/>
+        <w:rPr>
+          <w:u w:val="single"/>
+        </w:rPr>
+      </w:pPr>
+    </w:p>
     <w:p>
       <w:pPr>
         <w:pStyle w:val="Textbody"/>
@@ -18019,6 +19012,7 @@
               </w:rPr>
             </w:pPr>
             <w:r>
+              <w:lastRenderedPageBreak/>
               <w:t>Visualización de información del servicio</w:t>
             </w:r>
           </w:p>
@@ -18313,16 +19307,6 @@
               </w:rPr>
               <w:t>El sistema debe estar operativo.</w:t>
             </w:r>
-          </w:p>
-          <w:p>
-            <w:pPr>
-              <w:pStyle w:val="TableContents"/>
-              <w:rPr>
-                <w:rFonts w:hint="eastAsia"/>
-                <w:b/>
-                <w:bCs/>
-              </w:rPr>
-            </w:pPr>
           </w:p>
           <w:p>
             <w:pPr>
@@ -18912,24 +19896,6 @@
               <w:t>Debe existir un perfil de servicio creado.</w:t>
             </w:r>
           </w:p>
-          <w:p>
-            <w:pPr>
-              <w:pStyle w:val="TableContents"/>
-              <w:rPr>
-                <w:rFonts w:hint="eastAsia"/>
-                <w:b/>
-                <w:bCs/>
-              </w:rPr>
-            </w:pPr>
-          </w:p>
-          <w:p>
-            <w:pPr>
-              <w:pStyle w:val="TableContents"/>
-              <w:rPr>
-                <w:rFonts w:hint="eastAsia"/>
-              </w:rPr>
-            </w:pPr>
-          </w:p>
         </w:tc>
       </w:tr>
       <w:tr>
@@ -19539,16 +20505,6 @@
             <w:r>
               <w:t>La información del servicio fue modificada correctamente. Cumple.</w:t>
             </w:r>
-          </w:p>
-          <w:p>
-            <w:pPr>
-              <w:pStyle w:val="TableContents"/>
-              <w:rPr>
-                <w:rFonts w:hint="eastAsia"/>
-                <w:b/>
-                <w:bCs/>
-              </w:rPr>
-            </w:pPr>
           </w:p>
         </w:tc>
       </w:tr>
@@ -19605,6 +20561,7 @@
               </w:rPr>
             </w:pPr>
             <w:r>
+              <w:lastRenderedPageBreak/>
               <w:t>Modificación de promociones</w:t>
             </w:r>
           </w:p>
@@ -19899,16 +20856,6 @@
               </w:rPr>
               <w:t>El sistema debe estar operativo.</w:t>
             </w:r>
-          </w:p>
-          <w:p>
-            <w:pPr>
-              <w:pStyle w:val="TableContents"/>
-              <w:rPr>
-                <w:rFonts w:hint="eastAsia"/>
-                <w:b/>
-                <w:bCs/>
-              </w:rPr>
-            </w:pPr>
           </w:p>
           <w:p>
             <w:pPr>
@@ -20722,16 +21669,6 @@
               <w:pStyle w:val="TableContents"/>
               <w:rPr>
                 <w:rFonts w:hint="eastAsia"/>
-                <w:b/>
-                <w:bCs/>
-              </w:rPr>
-            </w:pPr>
-          </w:p>
-          <w:p>
-            <w:pPr>
-              <w:pStyle w:val="TableContents"/>
-              <w:rPr>
-                <w:rFonts w:hint="eastAsia"/>
               </w:rPr>
             </w:pPr>
           </w:p>
@@ -21050,7 +21987,6 @@
                 <w:b/>
                 <w:bCs/>
               </w:rPr>
-              <w:lastRenderedPageBreak/>
               <w:t>Resultado obtenido:</w:t>
             </w:r>
           </w:p>
@@ -21066,16 +22002,6 @@
             <w:r>
               <w:t>El comentario fue actualizado correctamente. Cumple.</w:t>
             </w:r>
-          </w:p>
-          <w:p>
-            <w:pPr>
-              <w:pStyle w:val="TableContents"/>
-              <w:rPr>
-                <w:rFonts w:hint="eastAsia"/>
-                <w:b/>
-                <w:bCs/>
-              </w:rPr>
-            </w:pPr>
           </w:p>
           <w:p>
             <w:pPr>
@@ -21142,6 +22068,7 @@
               </w:rPr>
             </w:pPr>
             <w:r>
+              <w:lastRenderedPageBreak/>
               <w:t>Modificación de blog</w:t>
             </w:r>
           </w:p>
@@ -21436,16 +22363,6 @@
               </w:rPr>
               <w:t>El sistema debe estar operativo.</w:t>
             </w:r>
-          </w:p>
-          <w:p>
-            <w:pPr>
-              <w:pStyle w:val="TableContents"/>
-              <w:rPr>
-                <w:rFonts w:hint="eastAsia"/>
-                <w:b/>
-                <w:bCs/>
-              </w:rPr>
-            </w:pPr>
           </w:p>
           <w:p>
             <w:pPr>
@@ -22216,16 +23133,6 @@
               <w:pStyle w:val="TableContents"/>
               <w:rPr>
                 <w:rFonts w:hint="eastAsia"/>
-                <w:b/>
-                <w:bCs/>
-              </w:rPr>
-            </w:pPr>
-          </w:p>
-          <w:p>
-            <w:pPr>
-              <w:pStyle w:val="TableContents"/>
-              <w:rPr>
-                <w:rFonts w:hint="eastAsia"/>
               </w:rPr>
             </w:pPr>
           </w:p>
@@ -22512,7 +23419,6 @@
               <w:rPr>
                 <w:color w:val="000000"/>
               </w:rPr>
-              <w:lastRenderedPageBreak/>
               <w:t>El sistema debe validar el código y permitir actualizar la contraseña correctamente.</w:t>
             </w:r>
           </w:p>
@@ -22551,7 +23457,6 @@
                 <w:b/>
                 <w:bCs/>
               </w:rPr>
-              <w:lastRenderedPageBreak/>
               <w:t>Resultado obtenido:</w:t>
             </w:r>
           </w:p>
@@ -22581,24 +23486,6 @@
         </w:tc>
       </w:tr>
     </w:tbl>
-    <w:p>
-      <w:pPr>
-        <w:pStyle w:val="Textbody"/>
-        <w:rPr>
-          <w:rFonts w:hint="eastAsia"/>
-          <w:u w:val="single"/>
-        </w:rPr>
-      </w:pPr>
-    </w:p>
-    <w:p>
-      <w:pPr>
-        <w:pStyle w:val="Textbody"/>
-        <w:rPr>
-          <w:rFonts w:hint="eastAsia"/>
-          <w:u w:val="single"/>
-        </w:rPr>
-      </w:pPr>
-    </w:p>
     <w:p>
       <w:pPr>
         <w:pStyle w:val="Textbody"/>
@@ -22811,6 +23698,20 @@
         <w:jc w:val="both"/>
         <w:rPr>
           <w:rFonts w:eastAsia="NewsGotT" w:cs="NewsGotT"/>
+          <w:b/>
+          <w:bCs/>
+          <w:szCs w:val="20"/>
+          <w:lang w:val="es-CL"/>
+        </w:rPr>
+      </w:pPr>
+    </w:p>
+    <w:p>
+      <w:pPr>
+        <w:pStyle w:val="Standard"/>
+        <w:shd w:val="clear" w:color="auto" w:fill="FFFFFF"/>
+        <w:jc w:val="both"/>
+        <w:rPr>
+          <w:rFonts w:eastAsia="NewsGotT" w:cs="NewsGotT"/>
           <w:szCs w:val="20"/>
           <w:lang w:val="es-CL"/>
         </w:rPr>
@@ -22977,6 +23878,20 @@
         <w:jc w:val="both"/>
         <w:rPr>
           <w:rFonts w:eastAsia="NewsGotT" w:cs="NewsGotT"/>
+          <w:b/>
+          <w:bCs/>
+          <w:szCs w:val="20"/>
+          <w:lang w:val="es-CL"/>
+        </w:rPr>
+      </w:pPr>
+    </w:p>
+    <w:p>
+      <w:pPr>
+        <w:pStyle w:val="Standard"/>
+        <w:shd w:val="clear" w:color="auto" w:fill="FFFFFF"/>
+        <w:jc w:val="both"/>
+        <w:rPr>
+          <w:rFonts w:eastAsia="NewsGotT" w:cs="NewsGotT"/>
           <w:szCs w:val="20"/>
           <w:lang w:val="es-CL"/>
         </w:rPr>
@@ -23007,7 +23922,7 @@
           <w:lang w:val="es-CL"/>
         </w:rPr>
       </w:pPr>
-      <w:proofErr w:type="spellStart"/>
+      <w:proofErr w:type="gramStart"/>
       <w:r>
         <w:rPr>
           <w:rFonts w:eastAsia="NewsGotT" w:cs="NewsGotT"/>
@@ -23030,9 +23945,9 @@
           <w:szCs w:val="20"/>
           <w:lang w:val="es-CL"/>
         </w:rPr>
-        <w:t>ejecución</w:t>
+        <w:t xml:space="preserve"> ejecución</w:t>
       </w:r>
-      <w:proofErr w:type="spellEnd"/>
+      <w:proofErr w:type="gramEnd"/>
       <w:r>
         <w:rPr>
           <w:rFonts w:eastAsia="NewsGotT" w:cs="NewsGotT"/>
@@ -23065,6 +23980,20 @@
         </w:rPr>
         <w:t xml:space="preserve">Validación de que los cambios no afecten funcionalidades existentes. </w:t>
       </w:r>
+    </w:p>
+    <w:p>
+      <w:pPr>
+        <w:pStyle w:val="Standard"/>
+        <w:shd w:val="clear" w:color="auto" w:fill="FFFFFF"/>
+        <w:jc w:val="both"/>
+        <w:rPr>
+          <w:rFonts w:eastAsia="NewsGotT" w:cs="NewsGotT"/>
+          <w:b/>
+          <w:bCs/>
+          <w:szCs w:val="20"/>
+          <w:lang w:val="es-CL"/>
+        </w:rPr>
+      </w:pPr>
     </w:p>
     <w:p>
       <w:pPr>
@@ -30334,6 +31263,7 @@
                 <w:szCs w:val="20"/>
                 <w:lang w:eastAsia="es-CL"/>
               </w:rPr>
+              <w:lastRenderedPageBreak/>
               <w:t>&lt;CP-26&gt;</w:t>
             </w:r>
           </w:p>
@@ -30884,7 +31814,6 @@
                 <w:szCs w:val="20"/>
                 <w:lang w:eastAsia="es-CL"/>
               </w:rPr>
-              <w:lastRenderedPageBreak/>
               <w:t>&lt;CP-28&gt;</w:t>
             </w:r>
           </w:p>
@@ -31726,21 +32655,7 @@
             <w:rStyle w:val="Hipervnculo"/>
             <w:rFonts w:cs="Arial"/>
           </w:rPr>
-          <w:t>Encargo</w:t>
-        </w:r>
-        <w:r>
-          <w:rPr>
-            <w:rStyle w:val="Hipervnculo"/>
-            <w:rFonts w:cs="Arial"/>
-          </w:rPr>
-          <w:t xml:space="preserve"> </w:t>
-        </w:r>
-        <w:r>
-          <w:rPr>
-            <w:rStyle w:val="Hipervnculo"/>
-            <w:rFonts w:cs="Arial"/>
-          </w:rPr>
-          <w:t>Ev.</w:t>
+          <w:t>Encargo Ev.</w:t>
         </w:r>
         <w:proofErr w:type="gramStart"/>
         <w:r>
@@ -31790,21 +32705,7 @@
             <w:rStyle w:val="Hipervnculo"/>
             <w:rFonts w:cs="Arial"/>
           </w:rPr>
-          <w:t>plan pru</w:t>
-        </w:r>
-        <w:r>
-          <w:rPr>
-            <w:rStyle w:val="Hipervnculo"/>
-            <w:rFonts w:cs="Arial"/>
-          </w:rPr>
-          <w:t>e</w:t>
-        </w:r>
-        <w:r>
-          <w:rPr>
-            <w:rStyle w:val="Hipervnculo"/>
-            <w:rFonts w:cs="Arial"/>
-          </w:rPr>
-          <w:t>bas</w:t>
+          <w:t>plan pruebas</w:t>
         </w:r>
         <w:r>
           <w:rPr>
@@ -31851,25 +32752,7 @@
             <w:b/>
             <w:bCs/>
           </w:rPr>
-          <w:t>proy</w:t>
-        </w:r>
-        <w:r>
-          <w:rPr>
-            <w:rStyle w:val="Hipervnculo"/>
-            <w:rFonts w:cs="Arial"/>
-            <w:b/>
-            <w:bCs/>
-          </w:rPr>
-          <w:t>e</w:t>
-        </w:r>
-        <w:r>
-          <w:rPr>
-            <w:rStyle w:val="Hipervnculo"/>
-            <w:rFonts w:cs="Arial"/>
-            <w:b/>
-            <w:bCs/>
-          </w:rPr>
-          <w:t>cto</w:t>
+          <w:t>proyecto</w:t>
         </w:r>
       </w:hyperlink>
     </w:p>
@@ -32030,12 +32913,14 @@
                 <w:rFonts w:cs="Arial" w:hint="eastAsia"/>
               </w:rPr>
             </w:pPr>
+            <w:proofErr w:type="spellStart"/>
             <w:r>
               <w:rPr>
                 <w:rFonts w:cs="Arial"/>
               </w:rPr>
               <w:t>Frontend</w:t>
             </w:r>
+            <w:proofErr w:type="spellEnd"/>
           </w:p>
         </w:tc>
         <w:tc>
@@ -32096,12 +32981,14 @@
                 <w:rFonts w:cs="Arial" w:hint="eastAsia"/>
               </w:rPr>
             </w:pPr>
+            <w:proofErr w:type="spellStart"/>
             <w:r>
               <w:rPr>
                 <w:rFonts w:cs="Arial"/>
               </w:rPr>
               <w:t>Backend</w:t>
             </w:r>
+            <w:proofErr w:type="spellEnd"/>
           </w:p>
         </w:tc>
         <w:tc>
@@ -32892,6 +33779,27 @@
 <file path=word/numbering.xml><?xml version="1.0" encoding="utf-8"?>
 <w:numbering xmlns:wpc="http://schemas.microsoft.com/office/word/2010/wordprocessingCanvas" xmlns:cx="http://schemas.microsoft.com/office/drawing/2014/chartex" xmlns:cx1="http://schemas.microsoft.com/office/drawing/2015/9/8/chartex" xmlns:cx2="http://schemas.microsoft.com/office/drawing/2015/10/21/chartex" xmlns:cx3="http://schemas.microsoft.com/office/drawing/2016/5/9/chartex" xmlns:cx4="http://schemas.microsoft.com/office/drawing/2016/5/10/chartex" xmlns:cx5="http://schemas.microsoft.com/office/drawing/2016/5/11/chartex" xmlns:cx6="http://schemas.microsoft.com/office/drawing/2016/5/12/chartex" xmlns:cx7="http://schemas.microsoft.com/office/drawing/2016/5/13/chartex" xmlns:cx8="http://schemas.microsoft.com/office/drawing/2016/5/14/chartex" xmlns:mc="http://schemas.openxmlformats.org/markup-compatibility/2006" xmlns:aink="http://schemas.microsoft.com/office/drawing/2016/ink" xmlns:am3d="http://schemas.microsoft.com/office/drawing/2017/model3d" xmlns:o="urn:schemas-microsoft-com:office:office" xmlns:oel="http://schemas.microsoft.com/office/2019/extlst" xmlns:r="http://schemas.openxmlformats.org/officeDocument/2006/relationships" xmlns:m="http://schemas.openxmlformats.org/officeDocument/2006/math" xmlns:v="urn:schemas-microsoft-com:vml" xmlns:wp14="http://schemas.microsoft.com/office/word/2010/wordprocessingDrawing" xmlns:wp="http://schemas.openxmlformats.org/drawingml/2006/wordprocessingDrawing" xmlns:w10="urn:schemas-microsoft-com:office:word" xmlns:w="http://schemas.openxmlformats.org/wordprocessingml/2006/main" xmlns:w14="http://schemas.microsoft.com/office/word/2010/wordml" xmlns:w15="http://schemas.microsoft.com/office/word/2012/wordml" xmlns:w16cex="http://schemas.microsoft.com/office/word/2018/wordml/cex" xmlns:w16cid="http://schemas.microsoft.com/office/word/2016/wordml/cid" xmlns:w16="http://schemas.microsoft.com/office/word/2018/wordml" xmlns:w16du="http://schemas.microsoft.com/office/word/2023/wordml/word16du" xmlns:w16sdtdh="http://schemas.microsoft.com/office/word/2020/wordml/sdtdatahash" xmlns:w16sdtfl="http://schemas.microsoft.com/office/word/2024/wordml/sdtformatlock" xmlns:w16se="http://schemas.microsoft.com/office/word/2015/wordml/symex" xmlns:wpg="http://schemas.microsoft.com/office/word/2010/wordprocessingGroup" xmlns:wpi="http://schemas.microsoft.com/office/word/2010/wordprocessingInk" xmlns:wne="http://schemas.microsoft.com/office/word/2006/wordml" xmlns:wps="http://schemas.microsoft.com/office/word/2010/wordprocessingShape" mc:Ignorable="w14 w15 w16se w16cid w16 w16cex w16sdtdh w16sdtfl w16du wp14">
   <w:abstractNum w:abstractNumId="0" w15:restartNumberingAfterBreak="0">
+    <w:nsid w:val="FFFFFF89"/>
+    <w:multiLevelType w:val="singleLevel"/>
+    <w:tmpl w:val="29761A62"/>
+    <w:lvl w:ilvl="0">
+      <w:start w:val="1"/>
+      <w:numFmt w:val="bullet"/>
+      <w:pStyle w:val="Listaconvietas"/>
+      <w:lvlText w:val=""/>
+      <w:lvlJc w:val="left"/>
+      <w:pPr>
+        <w:tabs>
+          <w:tab w:val="num" w:pos="360"/>
+        </w:tabs>
+        <w:ind w:left="360" w:hanging="360"/>
+      </w:pPr>
+      <w:rPr>
+        <w:rFonts w:ascii="Symbol" w:hAnsi="Symbol" w:hint="default"/>
+      </w:rPr>
+    </w:lvl>
+  </w:abstractNum>
+  <w:abstractNum w:abstractNumId="1" w15:restartNumberingAfterBreak="0">
     <w:nsid w:val="03A90CE6"/>
     <w:multiLevelType w:val="hybridMultilevel"/>
     <w:tmpl w:val="BFD6F9D8"/>
@@ -33004,7 +33912,7 @@
       </w:rPr>
     </w:lvl>
   </w:abstractNum>
-  <w:abstractNum w:abstractNumId="1" w15:restartNumberingAfterBreak="0">
+  <w:abstractNum w:abstractNumId="2" w15:restartNumberingAfterBreak="0">
     <w:nsid w:val="05997810"/>
     <w:multiLevelType w:val="hybridMultilevel"/>
     <w:tmpl w:val="498A9226"/>
@@ -33090,7 +33998,7 @@
       </w:pPr>
     </w:lvl>
   </w:abstractNum>
-  <w:abstractNum w:abstractNumId="2" w15:restartNumberingAfterBreak="0">
+  <w:abstractNum w:abstractNumId="3" w15:restartNumberingAfterBreak="0">
     <w:nsid w:val="096471B4"/>
     <w:multiLevelType w:val="multilevel"/>
     <w:tmpl w:val="B192D0A4"/>
@@ -33239,7 +34147,7 @@
       </w:rPr>
     </w:lvl>
   </w:abstractNum>
-  <w:abstractNum w:abstractNumId="3" w15:restartNumberingAfterBreak="0">
+  <w:abstractNum w:abstractNumId="4" w15:restartNumberingAfterBreak="0">
     <w:nsid w:val="0A976DB5"/>
     <w:multiLevelType w:val="hybridMultilevel"/>
     <w:tmpl w:val="8A4E6C56"/>
@@ -33352,7 +34260,7 @@
       </w:rPr>
     </w:lvl>
   </w:abstractNum>
-  <w:abstractNum w:abstractNumId="4" w15:restartNumberingAfterBreak="0">
+  <w:abstractNum w:abstractNumId="5" w15:restartNumberingAfterBreak="0">
     <w:nsid w:val="0C5D7D10"/>
     <w:multiLevelType w:val="hybridMultilevel"/>
     <w:tmpl w:val="45AEB176"/>
@@ -33465,7 +34373,7 @@
       </w:rPr>
     </w:lvl>
   </w:abstractNum>
-  <w:abstractNum w:abstractNumId="5" w15:restartNumberingAfterBreak="0">
+  <w:abstractNum w:abstractNumId="6" w15:restartNumberingAfterBreak="0">
     <w:nsid w:val="0C791DC4"/>
     <w:multiLevelType w:val="hybridMultilevel"/>
     <w:tmpl w:val="2E6071C8"/>
@@ -33551,7 +34459,7 @@
       </w:pPr>
     </w:lvl>
   </w:abstractNum>
-  <w:abstractNum w:abstractNumId="6" w15:restartNumberingAfterBreak="0">
+  <w:abstractNum w:abstractNumId="7" w15:restartNumberingAfterBreak="0">
     <w:nsid w:val="0CEA1F3D"/>
     <w:multiLevelType w:val="hybridMultilevel"/>
     <w:tmpl w:val="469410A6"/>
@@ -33637,7 +34545,7 @@
       </w:pPr>
     </w:lvl>
   </w:abstractNum>
-  <w:abstractNum w:abstractNumId="7" w15:restartNumberingAfterBreak="0">
+  <w:abstractNum w:abstractNumId="8" w15:restartNumberingAfterBreak="0">
     <w:nsid w:val="0F6D7E21"/>
     <w:multiLevelType w:val="hybridMultilevel"/>
     <w:tmpl w:val="0E8A3CA4"/>
@@ -33750,7 +34658,7 @@
       </w:rPr>
     </w:lvl>
   </w:abstractNum>
-  <w:abstractNum w:abstractNumId="8" w15:restartNumberingAfterBreak="0">
+  <w:abstractNum w:abstractNumId="9" w15:restartNumberingAfterBreak="0">
     <w:nsid w:val="11051373"/>
     <w:multiLevelType w:val="hybridMultilevel"/>
     <w:tmpl w:val="4A32D2B6"/>
@@ -33836,7 +34744,7 @@
       </w:pPr>
     </w:lvl>
   </w:abstractNum>
-  <w:abstractNum w:abstractNumId="9" w15:restartNumberingAfterBreak="0">
+  <w:abstractNum w:abstractNumId="10" w15:restartNumberingAfterBreak="0">
     <w:nsid w:val="11C85493"/>
     <w:multiLevelType w:val="hybridMultilevel"/>
     <w:tmpl w:val="83D61F48"/>
@@ -33949,7 +34857,7 @@
       </w:rPr>
     </w:lvl>
   </w:abstractNum>
-  <w:abstractNum w:abstractNumId="10" w15:restartNumberingAfterBreak="0">
+  <w:abstractNum w:abstractNumId="11" w15:restartNumberingAfterBreak="0">
     <w:nsid w:val="14B1753C"/>
     <w:multiLevelType w:val="hybridMultilevel"/>
     <w:tmpl w:val="855A772C"/>
@@ -34035,7 +34943,7 @@
       </w:pPr>
     </w:lvl>
   </w:abstractNum>
-  <w:abstractNum w:abstractNumId="11" w15:restartNumberingAfterBreak="0">
+  <w:abstractNum w:abstractNumId="12" w15:restartNumberingAfterBreak="0">
     <w:nsid w:val="16DD4365"/>
     <w:multiLevelType w:val="hybridMultilevel"/>
     <w:tmpl w:val="5AD4C85E"/>
@@ -34148,7 +35056,7 @@
       </w:rPr>
     </w:lvl>
   </w:abstractNum>
-  <w:abstractNum w:abstractNumId="12" w15:restartNumberingAfterBreak="0">
+  <w:abstractNum w:abstractNumId="13" w15:restartNumberingAfterBreak="0">
     <w:nsid w:val="183F6F16"/>
     <w:multiLevelType w:val="hybridMultilevel"/>
     <w:tmpl w:val="BE520A1E"/>
@@ -34261,7 +35169,7 @@
       </w:rPr>
     </w:lvl>
   </w:abstractNum>
-  <w:abstractNum w:abstractNumId="13" w15:restartNumberingAfterBreak="0">
+  <w:abstractNum w:abstractNumId="14" w15:restartNumberingAfterBreak="0">
     <w:nsid w:val="1B677CB5"/>
     <w:multiLevelType w:val="hybridMultilevel"/>
     <w:tmpl w:val="64D0E8F2"/>
@@ -34347,7 +35255,7 @@
       </w:pPr>
     </w:lvl>
   </w:abstractNum>
-  <w:abstractNum w:abstractNumId="14" w15:restartNumberingAfterBreak="0">
+  <w:abstractNum w:abstractNumId="15" w15:restartNumberingAfterBreak="0">
     <w:nsid w:val="1D6274E3"/>
     <w:multiLevelType w:val="hybridMultilevel"/>
     <w:tmpl w:val="31BC5EBA"/>
@@ -34433,7 +35341,7 @@
       </w:pPr>
     </w:lvl>
   </w:abstractNum>
-  <w:abstractNum w:abstractNumId="15" w15:restartNumberingAfterBreak="0">
+  <w:abstractNum w:abstractNumId="16" w15:restartNumberingAfterBreak="0">
     <w:nsid w:val="25AF6267"/>
     <w:multiLevelType w:val="multilevel"/>
     <w:tmpl w:val="C9B238FE"/>
@@ -34582,7 +35490,7 @@
       </w:rPr>
     </w:lvl>
   </w:abstractNum>
-  <w:abstractNum w:abstractNumId="16" w15:restartNumberingAfterBreak="0">
+  <w:abstractNum w:abstractNumId="17" w15:restartNumberingAfterBreak="0">
     <w:nsid w:val="27CE4916"/>
     <w:multiLevelType w:val="hybridMultilevel"/>
     <w:tmpl w:val="3EA0E6C0"/>
@@ -34695,7 +35603,7 @@
       </w:rPr>
     </w:lvl>
   </w:abstractNum>
-  <w:abstractNum w:abstractNumId="17" w15:restartNumberingAfterBreak="0">
+  <w:abstractNum w:abstractNumId="18" w15:restartNumberingAfterBreak="0">
     <w:nsid w:val="294B642B"/>
     <w:multiLevelType w:val="hybridMultilevel"/>
     <w:tmpl w:val="39562744"/>
@@ -34808,7 +35716,7 @@
       </w:rPr>
     </w:lvl>
   </w:abstractNum>
-  <w:abstractNum w:abstractNumId="18" w15:restartNumberingAfterBreak="0">
+  <w:abstractNum w:abstractNumId="19" w15:restartNumberingAfterBreak="0">
     <w:nsid w:val="2EAD5A3C"/>
     <w:multiLevelType w:val="hybridMultilevel"/>
     <w:tmpl w:val="34086F00"/>
@@ -34894,7 +35802,7 @@
       </w:pPr>
     </w:lvl>
   </w:abstractNum>
-  <w:abstractNum w:abstractNumId="19" w15:restartNumberingAfterBreak="0">
+  <w:abstractNum w:abstractNumId="20" w15:restartNumberingAfterBreak="0">
     <w:nsid w:val="316E0FAF"/>
     <w:multiLevelType w:val="multilevel"/>
     <w:tmpl w:val="B2A0523C"/>
@@ -35043,7 +35951,7 @@
       </w:rPr>
     </w:lvl>
   </w:abstractNum>
-  <w:abstractNum w:abstractNumId="20" w15:restartNumberingAfterBreak="0">
+  <w:abstractNum w:abstractNumId="21" w15:restartNumberingAfterBreak="0">
     <w:nsid w:val="33FF7B46"/>
     <w:multiLevelType w:val="hybridMultilevel"/>
     <w:tmpl w:val="B6020DDC"/>
@@ -35129,7 +36037,7 @@
       </w:pPr>
     </w:lvl>
   </w:abstractNum>
-  <w:abstractNum w:abstractNumId="21" w15:restartNumberingAfterBreak="0">
+  <w:abstractNum w:abstractNumId="22" w15:restartNumberingAfterBreak="0">
     <w:nsid w:val="347367AD"/>
     <w:multiLevelType w:val="hybridMultilevel"/>
     <w:tmpl w:val="4A32D2B6"/>
@@ -35215,7 +36123,7 @@
       </w:pPr>
     </w:lvl>
   </w:abstractNum>
-  <w:abstractNum w:abstractNumId="22" w15:restartNumberingAfterBreak="0">
+  <w:abstractNum w:abstractNumId="23" w15:restartNumberingAfterBreak="0">
     <w:nsid w:val="34BF3EFF"/>
     <w:multiLevelType w:val="hybridMultilevel"/>
     <w:tmpl w:val="BF6E6882"/>
@@ -35328,7 +36236,7 @@
       </w:rPr>
     </w:lvl>
   </w:abstractNum>
-  <w:abstractNum w:abstractNumId="23" w15:restartNumberingAfterBreak="0">
+  <w:abstractNum w:abstractNumId="24" w15:restartNumberingAfterBreak="0">
     <w:nsid w:val="39F3515B"/>
     <w:multiLevelType w:val="hybridMultilevel"/>
     <w:tmpl w:val="AA144C70"/>
@@ -35441,7 +36349,7 @@
       </w:rPr>
     </w:lvl>
   </w:abstractNum>
-  <w:abstractNum w:abstractNumId="24" w15:restartNumberingAfterBreak="0">
+  <w:abstractNum w:abstractNumId="25" w15:restartNumberingAfterBreak="0">
     <w:nsid w:val="3CC64517"/>
     <w:multiLevelType w:val="hybridMultilevel"/>
     <w:tmpl w:val="792294FE"/>
@@ -35554,7 +36462,7 @@
       </w:rPr>
     </w:lvl>
   </w:abstractNum>
-  <w:abstractNum w:abstractNumId="25" w15:restartNumberingAfterBreak="0">
+  <w:abstractNum w:abstractNumId="26" w15:restartNumberingAfterBreak="0">
     <w:nsid w:val="3CE71DBF"/>
     <w:multiLevelType w:val="hybridMultilevel"/>
     <w:tmpl w:val="84287AD6"/>
@@ -35640,7 +36548,7 @@
       </w:pPr>
     </w:lvl>
   </w:abstractNum>
-  <w:abstractNum w:abstractNumId="26" w15:restartNumberingAfterBreak="0">
+  <w:abstractNum w:abstractNumId="27" w15:restartNumberingAfterBreak="0">
     <w:nsid w:val="3D5E09D1"/>
     <w:multiLevelType w:val="hybridMultilevel"/>
     <w:tmpl w:val="A93CE92A"/>
@@ -35753,7 +36661,7 @@
       </w:rPr>
     </w:lvl>
   </w:abstractNum>
-  <w:abstractNum w:abstractNumId="27" w15:restartNumberingAfterBreak="0">
+  <w:abstractNum w:abstractNumId="28" w15:restartNumberingAfterBreak="0">
     <w:nsid w:val="3DD56271"/>
     <w:multiLevelType w:val="hybridMultilevel"/>
     <w:tmpl w:val="BAA0401E"/>
@@ -35866,7 +36774,7 @@
       </w:rPr>
     </w:lvl>
   </w:abstractNum>
-  <w:abstractNum w:abstractNumId="28" w15:restartNumberingAfterBreak="0">
+  <w:abstractNum w:abstractNumId="29" w15:restartNumberingAfterBreak="0">
     <w:nsid w:val="3F21187F"/>
     <w:multiLevelType w:val="hybridMultilevel"/>
     <w:tmpl w:val="F51AB19E"/>
@@ -35979,7 +36887,7 @@
       </w:rPr>
     </w:lvl>
   </w:abstractNum>
-  <w:abstractNum w:abstractNumId="29" w15:restartNumberingAfterBreak="0">
+  <w:abstractNum w:abstractNumId="30" w15:restartNumberingAfterBreak="0">
     <w:nsid w:val="40262CDE"/>
     <w:multiLevelType w:val="hybridMultilevel"/>
     <w:tmpl w:val="129C52F8"/>
@@ -36092,7 +37000,7 @@
       </w:rPr>
     </w:lvl>
   </w:abstractNum>
-  <w:abstractNum w:abstractNumId="30" w15:restartNumberingAfterBreak="0">
+  <w:abstractNum w:abstractNumId="31" w15:restartNumberingAfterBreak="0">
     <w:nsid w:val="4131467F"/>
     <w:multiLevelType w:val="multilevel"/>
     <w:tmpl w:val="6FC41BF8"/>
@@ -36184,7 +37092,7 @@
       </w:pPr>
     </w:lvl>
   </w:abstractNum>
-  <w:abstractNum w:abstractNumId="31" w15:restartNumberingAfterBreak="0">
+  <w:abstractNum w:abstractNumId="32" w15:restartNumberingAfterBreak="0">
     <w:nsid w:val="448D0F02"/>
     <w:multiLevelType w:val="hybridMultilevel"/>
     <w:tmpl w:val="8C681828"/>
@@ -36270,7 +37178,7 @@
       </w:pPr>
     </w:lvl>
   </w:abstractNum>
-  <w:abstractNum w:abstractNumId="32" w15:restartNumberingAfterBreak="0">
+  <w:abstractNum w:abstractNumId="33" w15:restartNumberingAfterBreak="0">
     <w:nsid w:val="45311DB8"/>
     <w:multiLevelType w:val="hybridMultilevel"/>
     <w:tmpl w:val="AF34D538"/>
@@ -36383,7 +37291,7 @@
       </w:rPr>
     </w:lvl>
   </w:abstractNum>
-  <w:abstractNum w:abstractNumId="33" w15:restartNumberingAfterBreak="0">
+  <w:abstractNum w:abstractNumId="34" w15:restartNumberingAfterBreak="0">
     <w:nsid w:val="49173D35"/>
     <w:multiLevelType w:val="hybridMultilevel"/>
     <w:tmpl w:val="4DA67312"/>
@@ -36469,7 +37377,7 @@
       </w:pPr>
     </w:lvl>
   </w:abstractNum>
-  <w:abstractNum w:abstractNumId="34" w15:restartNumberingAfterBreak="0">
+  <w:abstractNum w:abstractNumId="35" w15:restartNumberingAfterBreak="0">
     <w:nsid w:val="4B5A0DEE"/>
     <w:multiLevelType w:val="hybridMultilevel"/>
     <w:tmpl w:val="CAF49A76"/>
@@ -36555,7 +37463,7 @@
       </w:pPr>
     </w:lvl>
   </w:abstractNum>
-  <w:abstractNum w:abstractNumId="35" w15:restartNumberingAfterBreak="0">
+  <w:abstractNum w:abstractNumId="36" w15:restartNumberingAfterBreak="0">
     <w:nsid w:val="4D237070"/>
     <w:multiLevelType w:val="hybridMultilevel"/>
     <w:tmpl w:val="9F7C016E"/>
@@ -36668,7 +37576,7 @@
       </w:rPr>
     </w:lvl>
   </w:abstractNum>
-  <w:abstractNum w:abstractNumId="36" w15:restartNumberingAfterBreak="0">
+  <w:abstractNum w:abstractNumId="37" w15:restartNumberingAfterBreak="0">
     <w:nsid w:val="4EAC651E"/>
     <w:multiLevelType w:val="hybridMultilevel"/>
     <w:tmpl w:val="101689B2"/>
@@ -36781,7 +37689,7 @@
       </w:rPr>
     </w:lvl>
   </w:abstractNum>
-  <w:abstractNum w:abstractNumId="37" w15:restartNumberingAfterBreak="0">
+  <w:abstractNum w:abstractNumId="38" w15:restartNumberingAfterBreak="0">
     <w:nsid w:val="4F7618D7"/>
     <w:multiLevelType w:val="hybridMultilevel"/>
     <w:tmpl w:val="38849D50"/>
@@ -36894,7 +37802,7 @@
       </w:rPr>
     </w:lvl>
   </w:abstractNum>
-  <w:abstractNum w:abstractNumId="38" w15:restartNumberingAfterBreak="0">
+  <w:abstractNum w:abstractNumId="39" w15:restartNumberingAfterBreak="0">
     <w:nsid w:val="4F9262F4"/>
     <w:multiLevelType w:val="hybridMultilevel"/>
     <w:tmpl w:val="07221F96"/>
@@ -37007,7 +37915,7 @@
       </w:rPr>
     </w:lvl>
   </w:abstractNum>
-  <w:abstractNum w:abstractNumId="39" w15:restartNumberingAfterBreak="0">
+  <w:abstractNum w:abstractNumId="40" w15:restartNumberingAfterBreak="0">
     <w:nsid w:val="4FA65DE5"/>
     <w:multiLevelType w:val="hybridMultilevel"/>
     <w:tmpl w:val="D6CCCE30"/>
@@ -37093,7 +38001,7 @@
       </w:pPr>
     </w:lvl>
   </w:abstractNum>
-  <w:abstractNum w:abstractNumId="40" w15:restartNumberingAfterBreak="0">
+  <w:abstractNum w:abstractNumId="41" w15:restartNumberingAfterBreak="0">
     <w:nsid w:val="50FB6B3E"/>
     <w:multiLevelType w:val="hybridMultilevel"/>
     <w:tmpl w:val="F4642E1C"/>
@@ -37179,7 +38087,7 @@
       </w:pPr>
     </w:lvl>
   </w:abstractNum>
-  <w:abstractNum w:abstractNumId="41" w15:restartNumberingAfterBreak="0">
+  <w:abstractNum w:abstractNumId="42" w15:restartNumberingAfterBreak="0">
     <w:nsid w:val="5391242E"/>
     <w:multiLevelType w:val="hybridMultilevel"/>
     <w:tmpl w:val="E2E89C1E"/>
@@ -37265,7 +38173,7 @@
       </w:pPr>
     </w:lvl>
   </w:abstractNum>
-  <w:abstractNum w:abstractNumId="42" w15:restartNumberingAfterBreak="0">
+  <w:abstractNum w:abstractNumId="43" w15:restartNumberingAfterBreak="0">
     <w:nsid w:val="53B810C5"/>
     <w:multiLevelType w:val="hybridMultilevel"/>
     <w:tmpl w:val="F59ACF40"/>
@@ -37378,7 +38286,7 @@
       </w:rPr>
     </w:lvl>
   </w:abstractNum>
-  <w:abstractNum w:abstractNumId="43" w15:restartNumberingAfterBreak="0">
+  <w:abstractNum w:abstractNumId="44" w15:restartNumberingAfterBreak="0">
     <w:nsid w:val="5B5B70EE"/>
     <w:multiLevelType w:val="hybridMultilevel"/>
     <w:tmpl w:val="2C6A5D28"/>
@@ -37464,7 +38372,7 @@
       </w:pPr>
     </w:lvl>
   </w:abstractNum>
-  <w:abstractNum w:abstractNumId="44" w15:restartNumberingAfterBreak="0">
+  <w:abstractNum w:abstractNumId="45" w15:restartNumberingAfterBreak="0">
     <w:nsid w:val="5BD40DBC"/>
     <w:multiLevelType w:val="hybridMultilevel"/>
     <w:tmpl w:val="1F7298A0"/>
@@ -37577,7 +38485,7 @@
       </w:rPr>
     </w:lvl>
   </w:abstractNum>
-  <w:abstractNum w:abstractNumId="45" w15:restartNumberingAfterBreak="0">
+  <w:abstractNum w:abstractNumId="46" w15:restartNumberingAfterBreak="0">
     <w:nsid w:val="5BDE11AC"/>
     <w:multiLevelType w:val="hybridMultilevel"/>
     <w:tmpl w:val="43A4533E"/>
@@ -37663,7 +38571,7 @@
       </w:pPr>
     </w:lvl>
   </w:abstractNum>
-  <w:abstractNum w:abstractNumId="46" w15:restartNumberingAfterBreak="0">
+  <w:abstractNum w:abstractNumId="47" w15:restartNumberingAfterBreak="0">
     <w:nsid w:val="5C660E14"/>
     <w:multiLevelType w:val="hybridMultilevel"/>
     <w:tmpl w:val="E0FA6ABA"/>
@@ -37776,7 +38684,7 @@
       </w:rPr>
     </w:lvl>
   </w:abstractNum>
-  <w:abstractNum w:abstractNumId="47" w15:restartNumberingAfterBreak="0">
+  <w:abstractNum w:abstractNumId="48" w15:restartNumberingAfterBreak="0">
     <w:nsid w:val="607C49F2"/>
     <w:multiLevelType w:val="multilevel"/>
     <w:tmpl w:val="1EF88A7C"/>
@@ -37925,7 +38833,7 @@
       </w:rPr>
     </w:lvl>
   </w:abstractNum>
-  <w:abstractNum w:abstractNumId="48" w15:restartNumberingAfterBreak="0">
+  <w:abstractNum w:abstractNumId="49" w15:restartNumberingAfterBreak="0">
     <w:nsid w:val="60880C1B"/>
     <w:multiLevelType w:val="hybridMultilevel"/>
     <w:tmpl w:val="36AA667A"/>
@@ -38011,7 +38919,7 @@
       </w:pPr>
     </w:lvl>
   </w:abstractNum>
-  <w:abstractNum w:abstractNumId="49" w15:restartNumberingAfterBreak="0">
+  <w:abstractNum w:abstractNumId="50" w15:restartNumberingAfterBreak="0">
     <w:nsid w:val="624828B0"/>
     <w:multiLevelType w:val="hybridMultilevel"/>
     <w:tmpl w:val="3258AD46"/>
@@ -38097,7 +39005,7 @@
       </w:pPr>
     </w:lvl>
   </w:abstractNum>
-  <w:abstractNum w:abstractNumId="50" w15:restartNumberingAfterBreak="0">
+  <w:abstractNum w:abstractNumId="51" w15:restartNumberingAfterBreak="0">
     <w:nsid w:val="63893BD7"/>
     <w:multiLevelType w:val="hybridMultilevel"/>
     <w:tmpl w:val="38B2610A"/>
@@ -38210,7 +39118,7 @@
       </w:rPr>
     </w:lvl>
   </w:abstractNum>
-  <w:abstractNum w:abstractNumId="51" w15:restartNumberingAfterBreak="0">
+  <w:abstractNum w:abstractNumId="52" w15:restartNumberingAfterBreak="0">
     <w:nsid w:val="6B695674"/>
     <w:multiLevelType w:val="hybridMultilevel"/>
     <w:tmpl w:val="B392685A"/>
@@ -38323,7 +39231,7 @@
       </w:rPr>
     </w:lvl>
   </w:abstractNum>
-  <w:abstractNum w:abstractNumId="52" w15:restartNumberingAfterBreak="0">
+  <w:abstractNum w:abstractNumId="53" w15:restartNumberingAfterBreak="0">
     <w:nsid w:val="6C7D5871"/>
     <w:multiLevelType w:val="hybridMultilevel"/>
     <w:tmpl w:val="7FC4F20C"/>
@@ -38436,7 +39344,7 @@
       </w:rPr>
     </w:lvl>
   </w:abstractNum>
-  <w:abstractNum w:abstractNumId="53" w15:restartNumberingAfterBreak="0">
+  <w:abstractNum w:abstractNumId="54" w15:restartNumberingAfterBreak="0">
     <w:nsid w:val="7020573A"/>
     <w:multiLevelType w:val="hybridMultilevel"/>
     <w:tmpl w:val="1F4883E8"/>
@@ -38549,7 +39457,7 @@
       </w:rPr>
     </w:lvl>
   </w:abstractNum>
-  <w:abstractNum w:abstractNumId="54" w15:restartNumberingAfterBreak="0">
+  <w:abstractNum w:abstractNumId="55" w15:restartNumberingAfterBreak="0">
     <w:nsid w:val="763E673D"/>
     <w:multiLevelType w:val="hybridMultilevel"/>
     <w:tmpl w:val="58844BF6"/>
@@ -38635,7 +39543,7 @@
       </w:pPr>
     </w:lvl>
   </w:abstractNum>
-  <w:abstractNum w:abstractNumId="55" w15:restartNumberingAfterBreak="0">
+  <w:abstractNum w:abstractNumId="56" w15:restartNumberingAfterBreak="0">
     <w:nsid w:val="78257FEF"/>
     <w:multiLevelType w:val="hybridMultilevel"/>
     <w:tmpl w:val="90D6DEC6"/>
@@ -38748,7 +39656,7 @@
       </w:rPr>
     </w:lvl>
   </w:abstractNum>
-  <w:abstractNum w:abstractNumId="56" w15:restartNumberingAfterBreak="0">
+  <w:abstractNum w:abstractNumId="57" w15:restartNumberingAfterBreak="0">
     <w:nsid w:val="78BE66F4"/>
     <w:multiLevelType w:val="hybridMultilevel"/>
     <w:tmpl w:val="ED321F68"/>
@@ -38861,7 +39769,7 @@
       </w:rPr>
     </w:lvl>
   </w:abstractNum>
-  <w:abstractNum w:abstractNumId="57" w15:restartNumberingAfterBreak="0">
+  <w:abstractNum w:abstractNumId="58" w15:restartNumberingAfterBreak="0">
     <w:nsid w:val="7969117D"/>
     <w:multiLevelType w:val="hybridMultilevel"/>
     <w:tmpl w:val="534607CA"/>
@@ -38947,7 +39855,7 @@
       </w:pPr>
     </w:lvl>
   </w:abstractNum>
-  <w:abstractNum w:abstractNumId="58" w15:restartNumberingAfterBreak="0">
+  <w:abstractNum w:abstractNumId="59" w15:restartNumberingAfterBreak="0">
     <w:nsid w:val="7B3E52F7"/>
     <w:multiLevelType w:val="hybridMultilevel"/>
     <w:tmpl w:val="99C21B2C"/>
@@ -39036,7 +39944,7 @@
       </w:pPr>
     </w:lvl>
   </w:abstractNum>
-  <w:abstractNum w:abstractNumId="59" w15:restartNumberingAfterBreak="0">
+  <w:abstractNum w:abstractNumId="60" w15:restartNumberingAfterBreak="0">
     <w:nsid w:val="7C20184F"/>
     <w:multiLevelType w:val="hybridMultilevel"/>
     <w:tmpl w:val="E8B4E2D2"/>
@@ -39126,184 +40034,187 @@
     </w:lvl>
   </w:abstractNum>
   <w:num w:numId="1" w16cid:durableId="1141582516">
+    <w:abstractNumId w:val="31"/>
+  </w:num>
+  <w:num w:numId="2" w16cid:durableId="151531173">
+    <w:abstractNumId w:val="23"/>
+  </w:num>
+  <w:num w:numId="3" w16cid:durableId="1029376350">
+    <w:abstractNumId w:val="10"/>
+  </w:num>
+  <w:num w:numId="4" w16cid:durableId="2120180098">
+    <w:abstractNumId w:val="4"/>
+  </w:num>
+  <w:num w:numId="5" w16cid:durableId="1506162647">
+    <w:abstractNumId w:val="53"/>
+  </w:num>
+  <w:num w:numId="6" w16cid:durableId="1119884250">
+    <w:abstractNumId w:val="28"/>
+  </w:num>
+  <w:num w:numId="7" w16cid:durableId="2055150171">
+    <w:abstractNumId w:val="39"/>
+  </w:num>
+  <w:num w:numId="8" w16cid:durableId="1477409518">
+    <w:abstractNumId w:val="36"/>
+  </w:num>
+  <w:num w:numId="9" w16cid:durableId="1011101514">
+    <w:abstractNumId w:val="57"/>
+  </w:num>
+  <w:num w:numId="10" w16cid:durableId="829104103">
+    <w:abstractNumId w:val="5"/>
+  </w:num>
+  <w:num w:numId="11" w16cid:durableId="1944069316">
+    <w:abstractNumId w:val="24"/>
+  </w:num>
+  <w:num w:numId="12" w16cid:durableId="1728802208">
+    <w:abstractNumId w:val="45"/>
+  </w:num>
+  <w:num w:numId="13" w16cid:durableId="610940519">
     <w:abstractNumId w:val="30"/>
   </w:num>
-  <w:num w:numId="2" w16cid:durableId="151531173">
+  <w:num w:numId="14" w16cid:durableId="59208953">
+    <w:abstractNumId w:val="37"/>
+  </w:num>
+  <w:num w:numId="15" w16cid:durableId="960107786">
+    <w:abstractNumId w:val="40"/>
+  </w:num>
+  <w:num w:numId="16" w16cid:durableId="1699431885">
+    <w:abstractNumId w:val="6"/>
+  </w:num>
+  <w:num w:numId="17" w16cid:durableId="697777169">
+    <w:abstractNumId w:val="9"/>
+  </w:num>
+  <w:num w:numId="18" w16cid:durableId="312876786">
+    <w:abstractNumId w:val="1"/>
+  </w:num>
+  <w:num w:numId="19" w16cid:durableId="245847622">
+    <w:abstractNumId w:val="8"/>
+  </w:num>
+  <w:num w:numId="20" w16cid:durableId="871041672">
+    <w:abstractNumId w:val="29"/>
+  </w:num>
+  <w:num w:numId="21" w16cid:durableId="38677475">
+    <w:abstractNumId w:val="21"/>
+  </w:num>
+  <w:num w:numId="22" w16cid:durableId="401413673">
+    <w:abstractNumId w:val="33"/>
+  </w:num>
+  <w:num w:numId="23" w16cid:durableId="983852381">
+    <w:abstractNumId w:val="46"/>
+  </w:num>
+  <w:num w:numId="24" w16cid:durableId="2065368673">
+    <w:abstractNumId w:val="54"/>
+  </w:num>
+  <w:num w:numId="25" w16cid:durableId="723530432">
+    <w:abstractNumId w:val="19"/>
+  </w:num>
+  <w:num w:numId="26" w16cid:durableId="1131362506">
+    <w:abstractNumId w:val="52"/>
+  </w:num>
+  <w:num w:numId="27" w16cid:durableId="1668171052">
+    <w:abstractNumId w:val="58"/>
+  </w:num>
+  <w:num w:numId="28" w16cid:durableId="1014963080">
+    <w:abstractNumId w:val="60"/>
+  </w:num>
+  <w:num w:numId="29" w16cid:durableId="679284470">
     <w:abstractNumId w:val="22"/>
   </w:num>
-  <w:num w:numId="3" w16cid:durableId="1029376350">
-    <w:abstractNumId w:val="9"/>
+  <w:num w:numId="30" w16cid:durableId="10497725">
+    <w:abstractNumId w:val="41"/>
   </w:num>
-  <w:num w:numId="4" w16cid:durableId="2120180098">
+  <w:num w:numId="31" w16cid:durableId="1123889220">
+    <w:abstractNumId w:val="42"/>
+  </w:num>
+  <w:num w:numId="32" w16cid:durableId="1879780709">
+    <w:abstractNumId w:val="17"/>
+  </w:num>
+  <w:num w:numId="33" w16cid:durableId="325674415">
+    <w:abstractNumId w:val="34"/>
+  </w:num>
+  <w:num w:numId="34" w16cid:durableId="77025804">
+    <w:abstractNumId w:val="59"/>
+  </w:num>
+  <w:num w:numId="35" w16cid:durableId="1788351203">
+    <w:abstractNumId w:val="43"/>
+  </w:num>
+  <w:num w:numId="36" w16cid:durableId="1075129410">
+    <w:abstractNumId w:val="7"/>
+  </w:num>
+  <w:num w:numId="37" w16cid:durableId="999583328">
+    <w:abstractNumId w:val="12"/>
+  </w:num>
+  <w:num w:numId="38" w16cid:durableId="1367176154">
+    <w:abstractNumId w:val="35"/>
+  </w:num>
+  <w:num w:numId="39" w16cid:durableId="1112238181">
+    <w:abstractNumId w:val="25"/>
+  </w:num>
+  <w:num w:numId="40" w16cid:durableId="1967734928">
+    <w:abstractNumId w:val="15"/>
+  </w:num>
+  <w:num w:numId="41" w16cid:durableId="103572414">
+    <w:abstractNumId w:val="18"/>
+  </w:num>
+  <w:num w:numId="42" w16cid:durableId="148446584">
+    <w:abstractNumId w:val="14"/>
+  </w:num>
+  <w:num w:numId="43" w16cid:durableId="1984893156">
+    <w:abstractNumId w:val="51"/>
+  </w:num>
+  <w:num w:numId="44" w16cid:durableId="322007500">
+    <w:abstractNumId w:val="50"/>
+  </w:num>
+  <w:num w:numId="45" w16cid:durableId="56393602">
+    <w:abstractNumId w:val="56"/>
+  </w:num>
+  <w:num w:numId="46" w16cid:durableId="1290013091">
+    <w:abstractNumId w:val="47"/>
+  </w:num>
+  <w:num w:numId="47" w16cid:durableId="2036953865">
+    <w:abstractNumId w:val="49"/>
+  </w:num>
+  <w:num w:numId="48" w16cid:durableId="835800647">
+    <w:abstractNumId w:val="38"/>
+  </w:num>
+  <w:num w:numId="49" w16cid:durableId="1720933703">
+    <w:abstractNumId w:val="26"/>
+  </w:num>
+  <w:num w:numId="50" w16cid:durableId="634602868">
+    <w:abstractNumId w:val="32"/>
+  </w:num>
+  <w:num w:numId="51" w16cid:durableId="236401254">
+    <w:abstractNumId w:val="27"/>
+  </w:num>
+  <w:num w:numId="52" w16cid:durableId="946817319">
+    <w:abstractNumId w:val="44"/>
+  </w:num>
+  <w:num w:numId="53" w16cid:durableId="492379861">
+    <w:abstractNumId w:val="11"/>
+  </w:num>
+  <w:num w:numId="54" w16cid:durableId="2045904081">
+    <w:abstractNumId w:val="2"/>
+  </w:num>
+  <w:num w:numId="55" w16cid:durableId="974992460">
+    <w:abstractNumId w:val="13"/>
+  </w:num>
+  <w:num w:numId="56" w16cid:durableId="1341739367">
+    <w:abstractNumId w:val="55"/>
+  </w:num>
+  <w:num w:numId="57" w16cid:durableId="1992515160">
+    <w:abstractNumId w:val="16"/>
+  </w:num>
+  <w:num w:numId="58" w16cid:durableId="694383937">
+    <w:abstractNumId w:val="20"/>
+  </w:num>
+  <w:num w:numId="59" w16cid:durableId="1650598219">
     <w:abstractNumId w:val="3"/>
   </w:num>
-  <w:num w:numId="5" w16cid:durableId="1506162647">
-    <w:abstractNumId w:val="52"/>
-  </w:num>
-  <w:num w:numId="6" w16cid:durableId="1119884250">
-    <w:abstractNumId w:val="27"/>
-  </w:num>
-  <w:num w:numId="7" w16cid:durableId="2055150171">
-    <w:abstractNumId w:val="38"/>
-  </w:num>
-  <w:num w:numId="8" w16cid:durableId="1477409518">
-    <w:abstractNumId w:val="35"/>
-  </w:num>
-  <w:num w:numId="9" w16cid:durableId="1011101514">
-    <w:abstractNumId w:val="56"/>
-  </w:num>
-  <w:num w:numId="10" w16cid:durableId="829104103">
-    <w:abstractNumId w:val="4"/>
-  </w:num>
-  <w:num w:numId="11" w16cid:durableId="1944069316">
-    <w:abstractNumId w:val="23"/>
-  </w:num>
-  <w:num w:numId="12" w16cid:durableId="1728802208">
-    <w:abstractNumId w:val="44"/>
-  </w:num>
-  <w:num w:numId="13" w16cid:durableId="610940519">
-    <w:abstractNumId w:val="29"/>
-  </w:num>
-  <w:num w:numId="14" w16cid:durableId="59208953">
-    <w:abstractNumId w:val="36"/>
-  </w:num>
-  <w:num w:numId="15" w16cid:durableId="960107786">
-    <w:abstractNumId w:val="39"/>
-  </w:num>
-  <w:num w:numId="16" w16cid:durableId="1699431885">
-    <w:abstractNumId w:val="5"/>
-  </w:num>
-  <w:num w:numId="17" w16cid:durableId="697777169">
-    <w:abstractNumId w:val="8"/>
-  </w:num>
-  <w:num w:numId="18" w16cid:durableId="312876786">
-    <w:abstractNumId w:val="0"/>
-  </w:num>
-  <w:num w:numId="19" w16cid:durableId="245847622">
-    <w:abstractNumId w:val="7"/>
-  </w:num>
-  <w:num w:numId="20" w16cid:durableId="871041672">
-    <w:abstractNumId w:val="28"/>
-  </w:num>
-  <w:num w:numId="21" w16cid:durableId="38677475">
-    <w:abstractNumId w:val="20"/>
-  </w:num>
-  <w:num w:numId="22" w16cid:durableId="401413673">
-    <w:abstractNumId w:val="32"/>
-  </w:num>
-  <w:num w:numId="23" w16cid:durableId="983852381">
-    <w:abstractNumId w:val="45"/>
-  </w:num>
-  <w:num w:numId="24" w16cid:durableId="2065368673">
-    <w:abstractNumId w:val="53"/>
-  </w:num>
-  <w:num w:numId="25" w16cid:durableId="723530432">
-    <w:abstractNumId w:val="18"/>
-  </w:num>
-  <w:num w:numId="26" w16cid:durableId="1131362506">
-    <w:abstractNumId w:val="51"/>
-  </w:num>
-  <w:num w:numId="27" w16cid:durableId="1668171052">
-    <w:abstractNumId w:val="57"/>
-  </w:num>
-  <w:num w:numId="28" w16cid:durableId="1014963080">
-    <w:abstractNumId w:val="59"/>
-  </w:num>
-  <w:num w:numId="29" w16cid:durableId="679284470">
-    <w:abstractNumId w:val="21"/>
-  </w:num>
-  <w:num w:numId="30" w16cid:durableId="10497725">
-    <w:abstractNumId w:val="40"/>
-  </w:num>
-  <w:num w:numId="31" w16cid:durableId="1123889220">
-    <w:abstractNumId w:val="41"/>
-  </w:num>
-  <w:num w:numId="32" w16cid:durableId="1879780709">
-    <w:abstractNumId w:val="16"/>
-  </w:num>
-  <w:num w:numId="33" w16cid:durableId="325674415">
-    <w:abstractNumId w:val="33"/>
-  </w:num>
-  <w:num w:numId="34" w16cid:durableId="77025804">
-    <w:abstractNumId w:val="58"/>
-  </w:num>
-  <w:num w:numId="35" w16cid:durableId="1788351203">
-    <w:abstractNumId w:val="42"/>
-  </w:num>
-  <w:num w:numId="36" w16cid:durableId="1075129410">
-    <w:abstractNumId w:val="6"/>
-  </w:num>
-  <w:num w:numId="37" w16cid:durableId="999583328">
-    <w:abstractNumId w:val="11"/>
-  </w:num>
-  <w:num w:numId="38" w16cid:durableId="1367176154">
-    <w:abstractNumId w:val="34"/>
-  </w:num>
-  <w:num w:numId="39" w16cid:durableId="1112238181">
-    <w:abstractNumId w:val="24"/>
-  </w:num>
-  <w:num w:numId="40" w16cid:durableId="1967734928">
-    <w:abstractNumId w:val="14"/>
-  </w:num>
-  <w:num w:numId="41" w16cid:durableId="103572414">
-    <w:abstractNumId w:val="17"/>
-  </w:num>
-  <w:num w:numId="42" w16cid:durableId="148446584">
-    <w:abstractNumId w:val="13"/>
-  </w:num>
-  <w:num w:numId="43" w16cid:durableId="1984893156">
-    <w:abstractNumId w:val="50"/>
-  </w:num>
-  <w:num w:numId="44" w16cid:durableId="322007500">
-    <w:abstractNumId w:val="49"/>
-  </w:num>
-  <w:num w:numId="45" w16cid:durableId="56393602">
-    <w:abstractNumId w:val="55"/>
-  </w:num>
-  <w:num w:numId="46" w16cid:durableId="1290013091">
-    <w:abstractNumId w:val="46"/>
-  </w:num>
-  <w:num w:numId="47" w16cid:durableId="2036953865">
+  <w:num w:numId="60" w16cid:durableId="413205273">
     <w:abstractNumId w:val="48"/>
   </w:num>
-  <w:num w:numId="48" w16cid:durableId="835800647">
-    <w:abstractNumId w:val="37"/>
-  </w:num>
-  <w:num w:numId="49" w16cid:durableId="1720933703">
-    <w:abstractNumId w:val="25"/>
-  </w:num>
-  <w:num w:numId="50" w16cid:durableId="634602868">
-    <w:abstractNumId w:val="31"/>
-  </w:num>
-  <w:num w:numId="51" w16cid:durableId="236401254">
-    <w:abstractNumId w:val="26"/>
-  </w:num>
-  <w:num w:numId="52" w16cid:durableId="946817319">
-    <w:abstractNumId w:val="43"/>
-  </w:num>
-  <w:num w:numId="53" w16cid:durableId="492379861">
-    <w:abstractNumId w:val="10"/>
-  </w:num>
-  <w:num w:numId="54" w16cid:durableId="2045904081">
-    <w:abstractNumId w:val="1"/>
-  </w:num>
-  <w:num w:numId="55" w16cid:durableId="974992460">
-    <w:abstractNumId w:val="12"/>
-  </w:num>
-  <w:num w:numId="56" w16cid:durableId="1341739367">
-    <w:abstractNumId w:val="54"/>
-  </w:num>
-  <w:num w:numId="57" w16cid:durableId="1992515160">
-    <w:abstractNumId w:val="15"/>
-  </w:num>
-  <w:num w:numId="58" w16cid:durableId="694383937">
-    <w:abstractNumId w:val="19"/>
-  </w:num>
-  <w:num w:numId="59" w16cid:durableId="1650598219">
-    <w:abstractNumId w:val="2"/>
-  </w:num>
-  <w:num w:numId="60" w16cid:durableId="413205273">
-    <w:abstractNumId w:val="47"/>
+  <w:num w:numId="61" w16cid:durableId="885684002">
+    <w:abstractNumId w:val="0"/>
   </w:num>
   <w:numIdMacAtCleanup w:val="60"/>
 </w:numbering>
@@ -39485,7 +40396,7 @@
     <w:lsdException w:name="Table Web 2" w:semiHidden="1" w:unhideWhenUsed="1"/>
     <w:lsdException w:name="Table Web 3" w:semiHidden="1" w:unhideWhenUsed="1"/>
     <w:lsdException w:name="Balloon Text" w:semiHidden="1" w:unhideWhenUsed="1"/>
-    <w:lsdException w:name="Table Grid" w:uiPriority="39"/>
+    <w:lsdException w:name="Table Grid" w:uiPriority="59"/>
     <w:lsdException w:name="Table Theme" w:semiHidden="1" w:unhideWhenUsed="1"/>
     <w:lsdException w:name="Placeholder Text" w:semiHidden="1"/>
     <w:lsdException w:name="No Spacing" w:uiPriority="1" w:qFormat="1"/>
@@ -40207,6 +41118,64 @@
       <w:u w:val="single"/>
     </w:rPr>
   </w:style>
+  <w:style w:type="paragraph" w:styleId="Listaconvietas">
+    <w:name w:val="List Bullet"/>
+    <w:basedOn w:val="Normal"/>
+    <w:uiPriority w:val="99"/>
+    <w:unhideWhenUsed/>
+    <w:rsid w:val="00DB249E"/>
+    <w:pPr>
+      <w:widowControl/>
+      <w:numPr>
+        <w:numId w:val="61"/>
+      </w:numPr>
+      <w:tabs>
+        <w:tab w:val="clear" w:pos="360"/>
+      </w:tabs>
+      <w:suppressAutoHyphens w:val="0"/>
+      <w:autoSpaceDN/>
+      <w:spacing w:after="200" w:line="276" w:lineRule="auto"/>
+      <w:ind w:left="0" w:firstLine="0"/>
+      <w:contextualSpacing/>
+      <w:textAlignment w:val="auto"/>
+    </w:pPr>
+    <w:rPr>
+      <w:rFonts w:ascii="Arial" w:eastAsiaTheme="minorEastAsia" w:hAnsi="Arial" w:cstheme="minorBidi"/>
+      <w:kern w:val="0"/>
+      <w:sz w:val="20"/>
+      <w:szCs w:val="22"/>
+      <w:lang w:val="en-US" w:eastAsia="en-US"/>
+    </w:rPr>
+  </w:style>
+  <w:style w:type="table" w:styleId="Tablaconcuadrcula">
+    <w:name w:val="Table Grid"/>
+    <w:basedOn w:val="Tablanormal"/>
+    <w:uiPriority w:val="59"/>
+    <w:rsid w:val="00DB249E"/>
+    <w:pPr>
+      <w:widowControl/>
+      <w:suppressAutoHyphens w:val="0"/>
+      <w:autoSpaceDN/>
+      <w:textAlignment w:val="auto"/>
+    </w:pPr>
+    <w:rPr>
+      <w:rFonts w:asciiTheme="minorHAnsi" w:eastAsiaTheme="minorEastAsia" w:hAnsiTheme="minorHAnsi" w:cstheme="minorBidi"/>
+      <w:kern w:val="0"/>
+      <w:sz w:val="22"/>
+      <w:szCs w:val="22"/>
+      <w:lang w:val="en-US" w:eastAsia="en-US"/>
+    </w:rPr>
+    <w:tblPr>
+      <w:tblBorders>
+        <w:top w:val="single" w:sz="4" w:space="0" w:color="auto"/>
+        <w:left w:val="single" w:sz="4" w:space="0" w:color="auto"/>
+        <w:bottom w:val="single" w:sz="4" w:space="0" w:color="auto"/>
+        <w:right w:val="single" w:sz="4" w:space="0" w:color="auto"/>
+        <w:insideH w:val="single" w:sz="4" w:space="0" w:color="auto"/>
+        <w:insideV w:val="single" w:sz="4" w:space="0" w:color="auto"/>
+      </w:tblBorders>
+    </w:tblPr>
+  </w:style>
 </w:styles>
 </file>
 
@@ -40506,21 +41475,6 @@
 </file>
 
 <file path=customXml/item1.xml><?xml version="1.0" encoding="utf-8"?>
-<p:properties xmlns:p="http://schemas.microsoft.com/office/2006/metadata/properties" xmlns:xsi="http://www.w3.org/2001/XMLSchema-instance" xmlns:pc="http://schemas.microsoft.com/office/infopath/2007/PartnerControls">
-  <documentManagement/>
-</p:properties>
-</file>
-
-<file path=customXml/item2.xml><?xml version="1.0" encoding="utf-8"?>
-<?mso-contentType ?>
-<FormTemplates xmlns="http://schemas.microsoft.com/sharepoint/v3/contenttype/forms">
-  <Display>DocumentLibraryForm</Display>
-  <Edit>DocumentLibraryForm</Edit>
-  <New>DocumentLibraryForm</New>
-</FormTemplates>
-</file>
-
-<file path=customXml/item3.xml><?xml version="1.0" encoding="utf-8"?>
 <ct:contentTypeSchema xmlns:ct="http://schemas.microsoft.com/office/2006/metadata/contentType" xmlns:ma="http://schemas.microsoft.com/office/2006/metadata/properties/metaAttributes" ct:_="" ma:_="" ma:contentTypeName="Documento" ma:contentTypeID="0x010100AF28BDBD65D93F4BA99B6439AFEA320E" ma:contentTypeVersion="10" ma:contentTypeDescription="Crear nuevo documento." ma:contentTypeScope="" ma:versionID="11d45d99e0339591c68aad091688ac92">
   <xsd:schema xmlns:xsd="http://www.w3.org/2001/XMLSchema" xmlns:xs="http://www.w3.org/2001/XMLSchema" xmlns:p="http://schemas.microsoft.com/office/2006/metadata/properties" xmlns:ns2="9b0ef35d-78e7-41bf-847f-3c0497ad5352" xmlns:ns3="3c969135-7855-44e0-a9fe-01d799f07605" targetNamespace="http://schemas.microsoft.com/office/2006/metadata/properties" ma:root="true" ma:fieldsID="0e603a3f7bf67670d682b80385fe4b00" ns2:_="" ns3:_="">
     <xsd:import namespace="9b0ef35d-78e7-41bf-847f-3c0497ad5352"/>
@@ -40721,24 +41675,22 @@
 </ct:contentTypeSchema>
 </file>
 
-<file path=customXml/itemProps1.xml><?xml version="1.0" encoding="utf-8"?>
-<ds:datastoreItem xmlns:ds="http://schemas.openxmlformats.org/officeDocument/2006/customXml" ds:itemID="{B203E38B-4023-43A9-9B83-ED9E35A01FB5}">
-  <ds:schemaRefs>
-    <ds:schemaRef ds:uri="http://schemas.microsoft.com/office/2006/metadata/properties"/>
-    <ds:schemaRef ds:uri="http://schemas.microsoft.com/office/infopath/2007/PartnerControls"/>
-  </ds:schemaRefs>
-</ds:datastoreItem>
+<file path=customXml/item2.xml><?xml version="1.0" encoding="utf-8"?>
+<p:properties xmlns:p="http://schemas.microsoft.com/office/2006/metadata/properties" xmlns:xsi="http://www.w3.org/2001/XMLSchema-instance" xmlns:pc="http://schemas.microsoft.com/office/infopath/2007/PartnerControls">
+  <documentManagement/>
+</p:properties>
 </file>
 
-<file path=customXml/itemProps2.xml><?xml version="1.0" encoding="utf-8"?>
-<ds:datastoreItem xmlns:ds="http://schemas.openxmlformats.org/officeDocument/2006/customXml" ds:itemID="{72654922-4FCC-494D-93F7-F43064C530AD}">
-  <ds:schemaRefs>
-    <ds:schemaRef ds:uri="http://schemas.microsoft.com/sharepoint/v3/contenttype/forms"/>
-  </ds:schemaRefs>
-</ds:datastoreItem>
+<file path=customXml/item3.xml><?xml version="1.0" encoding="utf-8"?>
+<?mso-contentType ?>
+<FormTemplates xmlns="http://schemas.microsoft.com/sharepoint/v3/contenttype/forms">
+  <Display>DocumentLibraryForm</Display>
+  <Edit>DocumentLibraryForm</Edit>
+  <New>DocumentLibraryForm</New>
+</FormTemplates>
 </file>
 
-<file path=customXml/itemProps3.xml><?xml version="1.0" encoding="utf-8"?>
+<file path=customXml/itemProps1.xml><?xml version="1.0" encoding="utf-8"?>
 <ds:datastoreItem xmlns:ds="http://schemas.openxmlformats.org/officeDocument/2006/customXml" ds:itemID="{8A6A4A46-F142-46C7-9854-3FE79CB2998C}">
   <ds:schemaRefs>
     <ds:schemaRef ds:uri="http://schemas.microsoft.com/office/2006/metadata/contentType"/>
@@ -40755,4 +41707,21 @@
     <ds:schemaRef ds:uri="http://schemas.microsoft.com/internal/obd"/>
   </ds:schemaRefs>
 </ds:datastoreItem>
+</file>
+
+<file path=customXml/itemProps2.xml><?xml version="1.0" encoding="utf-8"?>
+<ds:datastoreItem xmlns:ds="http://schemas.openxmlformats.org/officeDocument/2006/customXml" ds:itemID="{B203E38B-4023-43A9-9B83-ED9E35A01FB5}">
+  <ds:schemaRefs>
+    <ds:schemaRef ds:uri="http://schemas.microsoft.com/office/2006/metadata/properties"/>
+    <ds:schemaRef ds:uri="http://schemas.microsoft.com/office/infopath/2007/PartnerControls"/>
+  </ds:schemaRefs>
+</ds:datastoreItem>
+</file>
+
+<file path=customXml/itemProps3.xml><?xml version="1.0" encoding="utf-8"?>
+<ds:datastoreItem xmlns:ds="http://schemas.openxmlformats.org/officeDocument/2006/customXml" ds:itemID="{72654922-4FCC-494D-93F7-F43064C530AD}">
+  <ds:schemaRefs>
+    <ds:schemaRef ds:uri="http://schemas.microsoft.com/sharepoint/v3/contenttype/forms"/>
+  </ds:schemaRefs>
+</ds:datastoreItem>
 </file>
</xml_diff>

<commit_message>
subida y arreglo de documentacion de testing
</commit_message>
<xml_diff>
--- a/Documentación/Plan_Pruebas/3.1.2 Plan Pruebas Funcionales.v2.docx
+++ b/Documentación/Plan_Pruebas/3.1.2 Plan Pruebas Funcionales.v2.docx
@@ -147,11 +147,9 @@
           <w:rFonts w:hint="eastAsia"/>
         </w:rPr>
       </w:pPr>
-      <w:proofErr w:type="spellStart"/>
       <w:r>
         <w:t>PetDate</w:t>
       </w:r>
-      <w:proofErr w:type="spellEnd"/>
     </w:p>
     <w:p>
       <w:pPr>
@@ -174,15 +172,7 @@
         </w:rPr>
       </w:pPr>
       <w:r>
-        <w:t xml:space="preserve">Grupo </w:t>
-      </w:r>
-      <w:proofErr w:type="spellStart"/>
-      <w:r>
-        <w:t>N°</w:t>
-      </w:r>
-      <w:proofErr w:type="spellEnd"/>
-      <w:r>
-        <w:t xml:space="preserve"> XX</w:t>
+        <w:t>Grupo N° XX</w:t>
       </w:r>
     </w:p>
     <w:p>
@@ -406,11 +396,9 @@
                 <w:rFonts w:hint="eastAsia"/>
               </w:rPr>
             </w:pPr>
-            <w:proofErr w:type="spellStart"/>
             <w:r>
               <w:t>PetDate</w:t>
             </w:r>
-            <w:proofErr w:type="spellEnd"/>
           </w:p>
         </w:tc>
       </w:tr>
@@ -540,11 +528,9 @@
                 <w:rFonts w:hint="eastAsia"/>
               </w:rPr>
             </w:pPr>
-            <w:proofErr w:type="spellStart"/>
             <w:r>
               <w:t>PetDate</w:t>
             </w:r>
-            <w:proofErr w:type="spellEnd"/>
           </w:p>
         </w:tc>
       </w:tr>
@@ -891,17 +877,8 @@
                 <w:b/>
                 <w:bCs/>
               </w:rPr>
-              <w:t xml:space="preserve">Versión </w:t>
-            </w:r>
-            <w:proofErr w:type="spellStart"/>
-            <w:r>
-              <w:rPr>
-                <w:b/>
-                <w:bCs/>
-              </w:rPr>
-              <w:t>doc</w:t>
-            </w:r>
-            <w:proofErr w:type="spellEnd"/>
+              <w:t>Versión doc</w:t>
+            </w:r>
           </w:p>
         </w:tc>
         <w:tc>
@@ -1331,13 +1308,8 @@
               </w:rPr>
             </w:pPr>
             <w:r>
-              <w:t xml:space="preserve">Equipo </w:t>
-            </w:r>
-            <w:proofErr w:type="spellStart"/>
-            <w:r>
-              <w:t>PetDate</w:t>
-            </w:r>
-            <w:proofErr w:type="spellEnd"/>
+              <w:t>Equipo PetDate</w:t>
+            </w:r>
           </w:p>
         </w:tc>
         <w:tc>
@@ -1943,15 +1915,7 @@
         </w:rPr>
       </w:pPr>
       <w:r>
-        <w:t xml:space="preserve">El presente documento tiene como objetivo definir el plan de pruebas funcionales aplicado al sistema </w:t>
-      </w:r>
-      <w:proofErr w:type="spellStart"/>
-      <w:r>
-        <w:t>PetDate</w:t>
-      </w:r>
-      <w:proofErr w:type="spellEnd"/>
-      <w:r>
-        <w:t>, plataforma web orientada a centralizar información relacionada con el cuidado de mascotas, permitiendo registrar usuarios, administrar mascotas, consultar servicios y utilizar funcionalidades asociadas a proveedores.</w:t>
+        <w:t>El presente documento tiene como objetivo definir el plan de pruebas funcionales aplicado al sistema PetDate, plataforma web orientada a centralizar información relacionada con el cuidado de mascotas, permitiendo registrar usuarios, administrar mascotas, consultar servicios y utilizar funcionalidades asociadas a proveedores.</w:t>
       </w:r>
     </w:p>
     <w:p>
@@ -1993,35 +1957,7 @@
         <w:rPr>
           <w:lang w:val="es-CL"/>
         </w:rPr>
-        <w:t xml:space="preserve">El alcance del presente plan contempla pruebas funcionales globales sobre la aplicación web </w:t>
-      </w:r>
-      <w:proofErr w:type="spellStart"/>
-      <w:r>
-        <w:rPr>
-          <w:lang w:val="es-CL"/>
-        </w:rPr>
-        <w:t>PetDate</w:t>
-      </w:r>
-      <w:proofErr w:type="spellEnd"/>
-      <w:r>
-        <w:rPr>
-          <w:lang w:val="es-CL"/>
-        </w:rPr>
-        <w:t xml:space="preserve">. Las pruebas se ejecutan desde el </w:t>
-      </w:r>
-      <w:proofErr w:type="spellStart"/>
-      <w:r>
-        <w:rPr>
-          <w:lang w:val="es-CL"/>
-        </w:rPr>
-        <w:t>frontend</w:t>
-      </w:r>
-      <w:proofErr w:type="spellEnd"/>
-      <w:r>
-        <w:rPr>
-          <w:lang w:val="es-CL"/>
-        </w:rPr>
-        <w:t>, validando que las acciones realizadas por los usuarios generen una respuesta correcta del sistema.</w:t>
+        <w:t>El alcance del presente plan contempla pruebas funcionales globales sobre la aplicación web PetDate. Las pruebas se ejecutan desde el frontend, validando que las acciones realizadas por los usuarios generen una respuesta correcta del sistema.</w:t>
       </w:r>
     </w:p>
     <w:p>
@@ -2051,35 +1987,7 @@
         <w:rPr>
           <w:lang w:val="es-CL"/>
         </w:rPr>
-        <w:t xml:space="preserve">No se consideran pruebas unitarias, pruebas de carga, pruebas de rendimiento ni pruebas profundas del </w:t>
-      </w:r>
-      <w:proofErr w:type="spellStart"/>
-      <w:r>
-        <w:rPr>
-          <w:lang w:val="es-CL"/>
-        </w:rPr>
-        <w:t>backend</w:t>
-      </w:r>
-      <w:proofErr w:type="spellEnd"/>
-      <w:r>
-        <w:rPr>
-          <w:lang w:val="es-CL"/>
-        </w:rPr>
-        <w:t xml:space="preserve">. La validación del </w:t>
-      </w:r>
-      <w:proofErr w:type="spellStart"/>
-      <w:r>
-        <w:rPr>
-          <w:lang w:val="es-CL"/>
-        </w:rPr>
-        <w:t>backend</w:t>
-      </w:r>
-      <w:proofErr w:type="spellEnd"/>
-      <w:r>
-        <w:rPr>
-          <w:lang w:val="es-CL"/>
-        </w:rPr>
-        <w:t xml:space="preserve"> se realiza de forma indirecta, comprobando que las operaciones ejecutadas desde la interfaz sean procesadas correctamente y reflejadas en el comportamiento general de la aplicación.</w:t>
+        <w:t>No se consideran pruebas unitarias, pruebas de carga, pruebas de rendimiento ni pruebas profundas del backend. La validación del backend se realiza de forma indirecta, comprobando que las operaciones ejecutadas desde la interfaz sean procesadas correctamente y reflejadas en el comportamiento general de la aplicación.</w:t>
       </w:r>
     </w:p>
     <w:p>
@@ -2094,7 +2002,7 @@
       <w:pPr>
         <w:pStyle w:val="Ttulo2"/>
         <w:rPr>
-          <w:rFonts w:ascii="NewsGotT" w:hAnsi="NewsGotT"/>
+          <w:rFonts w:ascii="NewsGotT" w:hAnsi="NewsGotT" w:hint="eastAsia"/>
         </w:rPr>
       </w:pPr>
       <w:r>
@@ -2107,7 +2015,7 @@
     <w:p>
       <w:pPr>
         <w:rPr>
-          <w:rFonts w:ascii="NewsGotT" w:hAnsi="NewsGotT"/>
+          <w:rFonts w:ascii="NewsGotT" w:hAnsi="NewsGotT" w:hint="eastAsia"/>
           <w:sz w:val="22"/>
           <w:szCs w:val="22"/>
         </w:rPr>
@@ -2118,67 +2026,13 @@
           <w:sz w:val="22"/>
           <w:szCs w:val="22"/>
         </w:rPr>
-        <w:t xml:space="preserve">Las pruebas fueron diseñadas para ejecutarse en un ambiente local/controlado de desarrollo, con la aplicación web levantada mediante </w:t>
-      </w:r>
-      <w:proofErr w:type="spellStart"/>
-      <w:r>
-        <w:rPr>
-          <w:rFonts w:ascii="NewsGotT" w:hAnsi="NewsGotT"/>
-          <w:sz w:val="22"/>
-          <w:szCs w:val="22"/>
-        </w:rPr>
-        <w:t>frontend</w:t>
-      </w:r>
-      <w:proofErr w:type="spellEnd"/>
-      <w:r>
-        <w:rPr>
-          <w:rFonts w:ascii="NewsGotT" w:hAnsi="NewsGotT"/>
-          <w:sz w:val="22"/>
-          <w:szCs w:val="22"/>
-        </w:rPr>
-        <w:t xml:space="preserve"> </w:t>
-      </w:r>
-      <w:proofErr w:type="spellStart"/>
-      <w:r>
-        <w:rPr>
-          <w:rFonts w:ascii="NewsGotT" w:hAnsi="NewsGotT"/>
-          <w:sz w:val="22"/>
-          <w:szCs w:val="22"/>
-        </w:rPr>
-        <w:t>React</w:t>
-      </w:r>
-      <w:proofErr w:type="spellEnd"/>
-      <w:r>
-        <w:rPr>
-          <w:rFonts w:ascii="NewsGotT" w:hAnsi="NewsGotT"/>
-          <w:sz w:val="22"/>
-          <w:szCs w:val="22"/>
-        </w:rPr>
-        <w:t xml:space="preserve">, </w:t>
-      </w:r>
-      <w:proofErr w:type="spellStart"/>
-      <w:r>
-        <w:rPr>
-          <w:rFonts w:ascii="NewsGotT" w:hAnsi="NewsGotT"/>
-          <w:sz w:val="22"/>
-          <w:szCs w:val="22"/>
-        </w:rPr>
-        <w:t>backend</w:t>
-      </w:r>
-      <w:proofErr w:type="spellEnd"/>
-      <w:r>
-        <w:rPr>
-          <w:rFonts w:ascii="NewsGotT" w:hAnsi="NewsGotT"/>
-          <w:sz w:val="22"/>
-          <w:szCs w:val="22"/>
-        </w:rPr>
-        <w:t xml:space="preserve"> Spring Boot, API Gateway, microservicios y base de datos MongoDB.</w:t>
+        <w:t>Las pruebas fueron diseñadas para ejecutarse en un ambiente local/controlado de desarrollo, con la aplicación web levantada mediante frontend React, backend Spring Boot, API Gateway, microservicios y base de datos MongoDB.</w:t>
       </w:r>
     </w:p>
     <w:p>
       <w:pPr>
         <w:rPr>
-          <w:rFonts w:ascii="NewsGotT" w:hAnsi="NewsGotT"/>
+          <w:rFonts w:ascii="NewsGotT" w:hAnsi="NewsGotT" w:hint="eastAsia"/>
           <w:sz w:val="22"/>
           <w:szCs w:val="22"/>
         </w:rPr>
@@ -2192,8 +2046,8 @@
         <w:tblLook w:val="04A0" w:firstRow="1" w:lastRow="0" w:firstColumn="1" w:lastColumn="0" w:noHBand="0" w:noVBand="1"/>
       </w:tblPr>
       <w:tblGrid>
-        <w:gridCol w:w="4525"/>
-        <w:gridCol w:w="4536"/>
+        <w:gridCol w:w="4535"/>
+        <w:gridCol w:w="4526"/>
       </w:tblGrid>
       <w:tr>
         <w:trPr>
@@ -2207,19 +2061,17 @@
           <w:p>
             <w:pPr>
               <w:rPr>
+                <w:rFonts w:ascii="NewsGotT" w:hAnsi="NewsGotT" w:hint="eastAsia"/>
+              </w:rPr>
+            </w:pPr>
+            <w:r>
+              <w:rPr>
                 <w:rFonts w:ascii="NewsGotT" w:hAnsi="NewsGotT"/>
-              </w:rPr>
-            </w:pPr>
-            <w:proofErr w:type="spellStart"/>
-            <w:r>
-              <w:rPr>
-                <w:rFonts w:ascii="NewsGotT" w:hAnsi="NewsGotT"/>
                 <w:b/>
                 <w:color w:val="FFFFFF"/>
               </w:rPr>
               <w:t>Elemento</w:t>
             </w:r>
-            <w:proofErr w:type="spellEnd"/>
           </w:p>
         </w:tc>
         <w:tc>
@@ -2230,19 +2082,17 @@
           <w:p>
             <w:pPr>
               <w:rPr>
+                <w:rFonts w:ascii="NewsGotT" w:hAnsi="NewsGotT" w:hint="eastAsia"/>
+              </w:rPr>
+            </w:pPr>
+            <w:r>
+              <w:rPr>
                 <w:rFonts w:ascii="NewsGotT" w:hAnsi="NewsGotT"/>
-              </w:rPr>
-            </w:pPr>
-            <w:proofErr w:type="spellStart"/>
-            <w:r>
-              <w:rPr>
-                <w:rFonts w:ascii="NewsGotT" w:hAnsi="NewsGotT"/>
                 <w:b/>
                 <w:color w:val="FFFFFF"/>
               </w:rPr>
               <w:t>Descripción</w:t>
             </w:r>
-            <w:proofErr w:type="spellEnd"/>
           </w:p>
         </w:tc>
       </w:tr>
@@ -2257,82 +2107,34 @@
           <w:p>
             <w:pPr>
               <w:rPr>
+                <w:rFonts w:ascii="NewsGotT" w:hAnsi="NewsGotT" w:hint="eastAsia"/>
+              </w:rPr>
+            </w:pPr>
+            <w:r>
+              <w:rPr>
                 <w:rFonts w:ascii="NewsGotT" w:hAnsi="NewsGotT"/>
               </w:rPr>
+              <w:t>Frontend</w:t>
+            </w:r>
+          </w:p>
+        </w:tc>
+        <w:tc>
+          <w:tcPr>
+            <w:tcW w:w="5184" w:type="dxa"/>
+          </w:tcPr>
+          <w:p>
+            <w:pPr>
+              <w:rPr>
+                <w:rFonts w:ascii="NewsGotT" w:hAnsi="NewsGotT" w:hint="eastAsia"/>
+                <w:lang w:val="es-CL"/>
+              </w:rPr>
             </w:pPr>
             <w:r>
               <w:rPr>
                 <w:rFonts w:ascii="NewsGotT" w:hAnsi="NewsGotT"/>
-              </w:rPr>
-              <w:t>Frontend</w:t>
-            </w:r>
-          </w:p>
-        </w:tc>
-        <w:tc>
-          <w:tcPr>
-            <w:tcW w:w="5184" w:type="dxa"/>
-          </w:tcPr>
-          <w:p>
-            <w:pPr>
-              <w:rPr>
-                <w:rFonts w:ascii="NewsGotT" w:hAnsi="NewsGotT"/>
-              </w:rPr>
-            </w:pPr>
-            <w:proofErr w:type="spellStart"/>
-            <w:r>
-              <w:rPr>
-                <w:rFonts w:ascii="NewsGotT" w:hAnsi="NewsGotT"/>
-              </w:rPr>
-              <w:t>Aplicación</w:t>
-            </w:r>
-            <w:proofErr w:type="spellEnd"/>
-            <w:r>
-              <w:rPr>
-                <w:rFonts w:ascii="NewsGotT" w:hAnsi="NewsGotT"/>
-              </w:rPr>
-              <w:t xml:space="preserve"> web React + Vite con CSS </w:t>
-            </w:r>
-            <w:proofErr w:type="spellStart"/>
-            <w:r>
-              <w:rPr>
-                <w:rFonts w:ascii="NewsGotT" w:hAnsi="NewsGotT"/>
-              </w:rPr>
-              <w:t>propio</w:t>
-            </w:r>
-            <w:proofErr w:type="spellEnd"/>
-            <w:r>
-              <w:rPr>
-                <w:rFonts w:ascii="NewsGotT" w:hAnsi="NewsGotT"/>
-              </w:rPr>
-              <w:t xml:space="preserve"> </w:t>
-            </w:r>
-            <w:proofErr w:type="spellStart"/>
-            <w:r>
-              <w:rPr>
-                <w:rFonts w:ascii="NewsGotT" w:hAnsi="NewsGotT"/>
-              </w:rPr>
-              <w:t>por</w:t>
-            </w:r>
-            <w:proofErr w:type="spellEnd"/>
-            <w:r>
-              <w:rPr>
-                <w:rFonts w:ascii="NewsGotT" w:hAnsi="NewsGotT"/>
-              </w:rPr>
-              <w:t xml:space="preserve"> </w:t>
-            </w:r>
-            <w:proofErr w:type="spellStart"/>
-            <w:r>
-              <w:rPr>
-                <w:rFonts w:ascii="NewsGotT" w:hAnsi="NewsGotT"/>
-              </w:rPr>
-              <w:t>componente</w:t>
-            </w:r>
-            <w:proofErr w:type="spellEnd"/>
-            <w:r>
-              <w:rPr>
-                <w:rFonts w:ascii="NewsGotT" w:hAnsi="NewsGotT"/>
-              </w:rPr>
-              <w:t>.</w:t>
+                <w:lang w:val="es-CL"/>
+              </w:rPr>
+              <w:t>Aplicación web React + Vite con CSS propio por componente.</w:t>
             </w:r>
           </w:p>
         </w:tc>
@@ -2349,7 +2151,7 @@
           <w:p>
             <w:pPr>
               <w:rPr>
-                <w:rFonts w:ascii="NewsGotT" w:hAnsi="NewsGotT"/>
+                <w:rFonts w:ascii="NewsGotT" w:hAnsi="NewsGotT" w:hint="eastAsia"/>
               </w:rPr>
             </w:pPr>
             <w:r>
@@ -2368,50 +2170,14 @@
           <w:p>
             <w:pPr>
               <w:rPr>
+                <w:rFonts w:ascii="NewsGotT" w:hAnsi="NewsGotT" w:hint="eastAsia"/>
+              </w:rPr>
+            </w:pPr>
+            <w:r>
+              <w:rPr>
                 <w:rFonts w:ascii="NewsGotT" w:hAnsi="NewsGotT"/>
               </w:rPr>
-            </w:pPr>
-            <w:proofErr w:type="spellStart"/>
-            <w:r>
-              <w:rPr>
-                <w:rFonts w:ascii="NewsGotT" w:hAnsi="NewsGotT"/>
-              </w:rPr>
-              <w:t>Microservicios</w:t>
-            </w:r>
-            <w:proofErr w:type="spellEnd"/>
-            <w:r>
-              <w:rPr>
-                <w:rFonts w:ascii="NewsGotT" w:hAnsi="NewsGotT"/>
-              </w:rPr>
-              <w:t xml:space="preserve"> Spring Boot </w:t>
-            </w:r>
-            <w:proofErr w:type="spellStart"/>
-            <w:r>
-              <w:rPr>
-                <w:rFonts w:ascii="NewsGotT" w:hAnsi="NewsGotT"/>
-              </w:rPr>
-              <w:t>expuestos</w:t>
-            </w:r>
-            <w:proofErr w:type="spellEnd"/>
-            <w:r>
-              <w:rPr>
-                <w:rFonts w:ascii="NewsGotT" w:hAnsi="NewsGotT"/>
-              </w:rPr>
-              <w:t xml:space="preserve"> </w:t>
-            </w:r>
-            <w:proofErr w:type="spellStart"/>
-            <w:r>
-              <w:rPr>
-                <w:rFonts w:ascii="NewsGotT" w:hAnsi="NewsGotT"/>
-              </w:rPr>
-              <w:t>mediante</w:t>
-            </w:r>
-            <w:proofErr w:type="spellEnd"/>
-            <w:r>
-              <w:rPr>
-                <w:rFonts w:ascii="NewsGotT" w:hAnsi="NewsGotT"/>
-              </w:rPr>
-              <w:t xml:space="preserve"> API Gateway.</w:t>
+              <w:t>Microservicios Spring Boot expuestos mediante API Gateway.</w:t>
             </w:r>
           </w:p>
         </w:tc>
@@ -2427,152 +2193,34 @@
           <w:p>
             <w:pPr>
               <w:rPr>
+                <w:rFonts w:ascii="NewsGotT" w:hAnsi="NewsGotT" w:hint="eastAsia"/>
+              </w:rPr>
+            </w:pPr>
+            <w:r>
+              <w:rPr>
                 <w:rFonts w:ascii="NewsGotT" w:hAnsi="NewsGotT"/>
               </w:rPr>
+              <w:t>Base de datos</w:t>
+            </w:r>
+          </w:p>
+        </w:tc>
+        <w:tc>
+          <w:tcPr>
+            <w:tcW w:w="5184" w:type="dxa"/>
+          </w:tcPr>
+          <w:p>
+            <w:pPr>
+              <w:rPr>
+                <w:rFonts w:ascii="NewsGotT" w:hAnsi="NewsGotT" w:hint="eastAsia"/>
+                <w:lang w:val="es-CL"/>
+              </w:rPr>
             </w:pPr>
             <w:r>
               <w:rPr>
                 <w:rFonts w:ascii="NewsGotT" w:hAnsi="NewsGotT"/>
-              </w:rPr>
-              <w:t xml:space="preserve">Base de </w:t>
-            </w:r>
-            <w:proofErr w:type="spellStart"/>
-            <w:r>
-              <w:rPr>
-                <w:rFonts w:ascii="NewsGotT" w:hAnsi="NewsGotT"/>
-              </w:rPr>
-              <w:t>datos</w:t>
-            </w:r>
-            <w:proofErr w:type="spellEnd"/>
-          </w:p>
-        </w:tc>
-        <w:tc>
-          <w:tcPr>
-            <w:tcW w:w="5184" w:type="dxa"/>
-          </w:tcPr>
-          <w:p>
-            <w:pPr>
-              <w:rPr>
-                <w:rFonts w:ascii="NewsGotT" w:hAnsi="NewsGotT"/>
-              </w:rPr>
-            </w:pPr>
-            <w:r>
-              <w:rPr>
-                <w:rFonts w:ascii="NewsGotT" w:hAnsi="NewsGotT"/>
-              </w:rPr>
-              <w:t xml:space="preserve">MongoDB con </w:t>
-            </w:r>
-            <w:proofErr w:type="spellStart"/>
-            <w:r>
-              <w:rPr>
-                <w:rFonts w:ascii="NewsGotT" w:hAnsi="NewsGotT"/>
-              </w:rPr>
-              <w:t>datos</w:t>
-            </w:r>
-            <w:proofErr w:type="spellEnd"/>
-            <w:r>
-              <w:rPr>
-                <w:rFonts w:ascii="NewsGotT" w:hAnsi="NewsGotT"/>
-              </w:rPr>
-              <w:t xml:space="preserve"> </w:t>
-            </w:r>
-            <w:proofErr w:type="spellStart"/>
-            <w:r>
-              <w:rPr>
-                <w:rFonts w:ascii="NewsGotT" w:hAnsi="NewsGotT"/>
-              </w:rPr>
-              <w:t>ficticios</w:t>
-            </w:r>
-            <w:proofErr w:type="spellEnd"/>
-            <w:r>
-              <w:rPr>
-                <w:rFonts w:ascii="NewsGotT" w:hAnsi="NewsGotT"/>
-              </w:rPr>
-              <w:t xml:space="preserve"> de </w:t>
-            </w:r>
-            <w:proofErr w:type="spellStart"/>
-            <w:r>
-              <w:rPr>
-                <w:rFonts w:ascii="NewsGotT" w:hAnsi="NewsGotT"/>
-              </w:rPr>
-              <w:t>usuarios</w:t>
-            </w:r>
-            <w:proofErr w:type="spellEnd"/>
-            <w:r>
-              <w:rPr>
-                <w:rFonts w:ascii="NewsGotT" w:hAnsi="NewsGotT"/>
-              </w:rPr>
-              <w:t xml:space="preserve">, </w:t>
-            </w:r>
-            <w:proofErr w:type="spellStart"/>
-            <w:r>
-              <w:rPr>
-                <w:rFonts w:ascii="NewsGotT" w:hAnsi="NewsGotT"/>
-              </w:rPr>
-              <w:t>mascotas</w:t>
-            </w:r>
-            <w:proofErr w:type="spellEnd"/>
-            <w:r>
-              <w:rPr>
-                <w:rFonts w:ascii="NewsGotT" w:hAnsi="NewsGotT"/>
-              </w:rPr>
-              <w:t xml:space="preserve">, </w:t>
-            </w:r>
-            <w:proofErr w:type="spellStart"/>
-            <w:r>
-              <w:rPr>
-                <w:rFonts w:ascii="NewsGotT" w:hAnsi="NewsGotT"/>
-              </w:rPr>
-              <w:t>empresas</w:t>
-            </w:r>
-            <w:proofErr w:type="spellEnd"/>
-            <w:r>
-              <w:rPr>
-                <w:rFonts w:ascii="NewsGotT" w:hAnsi="NewsGotT"/>
-              </w:rPr>
-              <w:t xml:space="preserve">, </w:t>
-            </w:r>
-            <w:proofErr w:type="spellStart"/>
-            <w:r>
-              <w:rPr>
-                <w:rFonts w:ascii="NewsGotT" w:hAnsi="NewsGotT"/>
-              </w:rPr>
-              <w:t>citas</w:t>
-            </w:r>
-            <w:proofErr w:type="spellEnd"/>
-            <w:r>
-              <w:rPr>
-                <w:rFonts w:ascii="NewsGotT" w:hAnsi="NewsGotT"/>
-              </w:rPr>
-              <w:t xml:space="preserve">, blogs, </w:t>
-            </w:r>
-            <w:proofErr w:type="spellStart"/>
-            <w:r>
-              <w:rPr>
-                <w:rFonts w:ascii="NewsGotT" w:hAnsi="NewsGotT"/>
-              </w:rPr>
-              <w:t>promociones</w:t>
-            </w:r>
-            <w:proofErr w:type="spellEnd"/>
-            <w:r>
-              <w:rPr>
-                <w:rFonts w:ascii="NewsGotT" w:hAnsi="NewsGotT"/>
-              </w:rPr>
-              <w:t xml:space="preserve"> y </w:t>
-            </w:r>
-            <w:proofErr w:type="spellStart"/>
-            <w:r>
-              <w:rPr>
-                <w:rFonts w:ascii="NewsGotT" w:hAnsi="NewsGotT"/>
-              </w:rPr>
-              <w:t>comentarios</w:t>
-            </w:r>
-            <w:proofErr w:type="spellEnd"/>
-            <w:r>
-              <w:rPr>
-                <w:rFonts w:ascii="NewsGotT" w:hAnsi="NewsGotT"/>
-              </w:rPr>
-              <w:t>.</w:t>
+                <w:lang w:val="es-CL"/>
+              </w:rPr>
+              <w:t>MongoDB con datos ficticios de usuarios, mascotas, empresas, citas, blogs, promociones y comentarios.</w:t>
             </w:r>
           </w:p>
         </w:tc>
@@ -2589,23 +2237,15 @@
           <w:p>
             <w:pPr>
               <w:rPr>
+                <w:rFonts w:ascii="NewsGotT" w:hAnsi="NewsGotT" w:hint="eastAsia"/>
+              </w:rPr>
+            </w:pPr>
+            <w:r>
+              <w:rPr>
                 <w:rFonts w:ascii="NewsGotT" w:hAnsi="NewsGotT"/>
               </w:rPr>
-            </w:pPr>
-            <w:r>
-              <w:rPr>
-                <w:rFonts w:ascii="NewsGotT" w:hAnsi="NewsGotT"/>
-              </w:rPr>
-              <w:t xml:space="preserve">Tipo de </w:t>
-            </w:r>
-            <w:proofErr w:type="spellStart"/>
-            <w:r>
-              <w:rPr>
-                <w:rFonts w:ascii="NewsGotT" w:hAnsi="NewsGotT"/>
-              </w:rPr>
-              <w:t>prueba</w:t>
-            </w:r>
-            <w:proofErr w:type="spellEnd"/>
+              <w:t>Tipo de prueba</w:t>
+            </w:r>
           </w:p>
         </w:tc>
         <w:tc>
@@ -2616,92 +2256,16 @@
           <w:p>
             <w:pPr>
               <w:rPr>
+                <w:rFonts w:ascii="NewsGotT" w:hAnsi="NewsGotT" w:hint="eastAsia"/>
+                <w:lang w:val="es-CL"/>
+              </w:rPr>
+            </w:pPr>
+            <w:r>
+              <w:rPr>
                 <w:rFonts w:ascii="NewsGotT" w:hAnsi="NewsGotT"/>
-              </w:rPr>
-            </w:pPr>
-            <w:proofErr w:type="spellStart"/>
-            <w:r>
-              <w:rPr>
-                <w:rFonts w:ascii="NewsGotT" w:hAnsi="NewsGotT"/>
-              </w:rPr>
-              <w:t>Pruebas</w:t>
-            </w:r>
-            <w:proofErr w:type="spellEnd"/>
-            <w:r>
-              <w:rPr>
-                <w:rFonts w:ascii="NewsGotT" w:hAnsi="NewsGotT"/>
-              </w:rPr>
-              <w:t xml:space="preserve"> </w:t>
-            </w:r>
-            <w:proofErr w:type="spellStart"/>
-            <w:r>
-              <w:rPr>
-                <w:rFonts w:ascii="NewsGotT" w:hAnsi="NewsGotT"/>
-              </w:rPr>
-              <w:t>funcionales</w:t>
-            </w:r>
-            <w:proofErr w:type="spellEnd"/>
-            <w:r>
-              <w:rPr>
-                <w:rFonts w:ascii="NewsGotT" w:hAnsi="NewsGotT"/>
-              </w:rPr>
-              <w:t xml:space="preserve"> </w:t>
-            </w:r>
-            <w:proofErr w:type="spellStart"/>
-            <w:r>
-              <w:rPr>
-                <w:rFonts w:ascii="NewsGotT" w:hAnsi="NewsGotT"/>
-              </w:rPr>
-              <w:t>manuales</w:t>
-            </w:r>
-            <w:proofErr w:type="spellEnd"/>
-            <w:r>
-              <w:rPr>
-                <w:rFonts w:ascii="NewsGotT" w:hAnsi="NewsGotT"/>
-              </w:rPr>
-              <w:t>/</w:t>
-            </w:r>
-            <w:proofErr w:type="spellStart"/>
-            <w:r>
-              <w:rPr>
-                <w:rFonts w:ascii="NewsGotT" w:hAnsi="NewsGotT"/>
-              </w:rPr>
-              <w:t>globales</w:t>
-            </w:r>
-            <w:proofErr w:type="spellEnd"/>
-            <w:r>
-              <w:rPr>
-                <w:rFonts w:ascii="NewsGotT" w:hAnsi="NewsGotT"/>
-              </w:rPr>
-              <w:t xml:space="preserve"> </w:t>
-            </w:r>
-            <w:proofErr w:type="spellStart"/>
-            <w:r>
-              <w:rPr>
-                <w:rFonts w:ascii="NewsGotT" w:hAnsi="NewsGotT"/>
-              </w:rPr>
-              <w:t>desde</w:t>
-            </w:r>
-            <w:proofErr w:type="spellEnd"/>
-            <w:r>
-              <w:rPr>
-                <w:rFonts w:ascii="NewsGotT" w:hAnsi="NewsGotT"/>
-              </w:rPr>
-              <w:t xml:space="preserve"> la </w:t>
-            </w:r>
-            <w:proofErr w:type="spellStart"/>
-            <w:r>
-              <w:rPr>
-                <w:rFonts w:ascii="NewsGotT" w:hAnsi="NewsGotT"/>
-              </w:rPr>
-              <w:t>interfaz</w:t>
-            </w:r>
-            <w:proofErr w:type="spellEnd"/>
-            <w:r>
-              <w:rPr>
-                <w:rFonts w:ascii="NewsGotT" w:hAnsi="NewsGotT"/>
-              </w:rPr>
-              <w:t xml:space="preserve"> web.</w:t>
+                <w:lang w:val="es-CL"/>
+              </w:rPr>
+              <w:t>Pruebas funcionales manuales/globales desde la interfaz web.</w:t>
             </w:r>
           </w:p>
         </w:tc>
@@ -2717,140 +2281,34 @@
           <w:p>
             <w:pPr>
               <w:rPr>
+                <w:rFonts w:ascii="NewsGotT" w:hAnsi="NewsGotT" w:hint="eastAsia"/>
+              </w:rPr>
+            </w:pPr>
+            <w:r>
+              <w:rPr>
                 <w:rFonts w:ascii="NewsGotT" w:hAnsi="NewsGotT"/>
               </w:rPr>
-            </w:pPr>
-            <w:proofErr w:type="spellStart"/>
+              <w:t>Evidencias</w:t>
+            </w:r>
+          </w:p>
+        </w:tc>
+        <w:tc>
+          <w:tcPr>
+            <w:tcW w:w="5184" w:type="dxa"/>
+          </w:tcPr>
+          <w:p>
+            <w:pPr>
+              <w:rPr>
+                <w:rFonts w:ascii="NewsGotT" w:hAnsi="NewsGotT" w:hint="eastAsia"/>
+                <w:lang w:val="es-CL"/>
+              </w:rPr>
+            </w:pPr>
             <w:r>
               <w:rPr>
                 <w:rFonts w:ascii="NewsGotT" w:hAnsi="NewsGotT"/>
-              </w:rPr>
-              <w:t>Evidencias</w:t>
-            </w:r>
-            <w:proofErr w:type="spellEnd"/>
-          </w:p>
-        </w:tc>
-        <w:tc>
-          <w:tcPr>
-            <w:tcW w:w="5184" w:type="dxa"/>
-          </w:tcPr>
-          <w:p>
-            <w:pPr>
-              <w:rPr>
-                <w:rFonts w:ascii="NewsGotT" w:hAnsi="NewsGotT"/>
-              </w:rPr>
-            </w:pPr>
-            <w:proofErr w:type="spellStart"/>
-            <w:r>
-              <w:rPr>
-                <w:rFonts w:ascii="NewsGotT" w:hAnsi="NewsGotT"/>
-              </w:rPr>
-              <w:t>Capturas</w:t>
-            </w:r>
-            <w:proofErr w:type="spellEnd"/>
-            <w:r>
-              <w:rPr>
-                <w:rFonts w:ascii="NewsGotT" w:hAnsi="NewsGotT"/>
-              </w:rPr>
-              <w:t xml:space="preserve"> </w:t>
-            </w:r>
-            <w:proofErr w:type="spellStart"/>
-            <w:r>
-              <w:rPr>
-                <w:rFonts w:ascii="NewsGotT" w:hAnsi="NewsGotT"/>
-              </w:rPr>
-              <w:t>identificadas</w:t>
-            </w:r>
-            <w:proofErr w:type="spellEnd"/>
-            <w:r>
-              <w:rPr>
-                <w:rFonts w:ascii="NewsGotT" w:hAnsi="NewsGotT"/>
-              </w:rPr>
-              <w:t xml:space="preserve"> </w:t>
-            </w:r>
-            <w:proofErr w:type="spellStart"/>
-            <w:r>
-              <w:rPr>
-                <w:rFonts w:ascii="NewsGotT" w:hAnsi="NewsGotT"/>
-              </w:rPr>
-              <w:t>por</w:t>
-            </w:r>
-            <w:proofErr w:type="spellEnd"/>
-            <w:r>
-              <w:rPr>
-                <w:rFonts w:ascii="NewsGotT" w:hAnsi="NewsGotT"/>
-              </w:rPr>
-              <w:t xml:space="preserve"> </w:t>
-            </w:r>
-            <w:proofErr w:type="spellStart"/>
-            <w:r>
-              <w:rPr>
-                <w:rFonts w:ascii="NewsGotT" w:hAnsi="NewsGotT"/>
-              </w:rPr>
-              <w:t>código</w:t>
-            </w:r>
-            <w:proofErr w:type="spellEnd"/>
-            <w:r>
-              <w:rPr>
-                <w:rFonts w:ascii="NewsGotT" w:hAnsi="NewsGotT"/>
-              </w:rPr>
-              <w:t xml:space="preserve"> de </w:t>
-            </w:r>
-            <w:proofErr w:type="spellStart"/>
-            <w:r>
-              <w:rPr>
-                <w:rFonts w:ascii="NewsGotT" w:hAnsi="NewsGotT"/>
-              </w:rPr>
-              <w:t>caso</w:t>
-            </w:r>
-            <w:proofErr w:type="spellEnd"/>
-            <w:r>
-              <w:rPr>
-                <w:rFonts w:ascii="NewsGotT" w:hAnsi="NewsGotT"/>
-              </w:rPr>
-              <w:t xml:space="preserve"> de </w:t>
-            </w:r>
-            <w:proofErr w:type="spellStart"/>
-            <w:r>
-              <w:rPr>
-                <w:rFonts w:ascii="NewsGotT" w:hAnsi="NewsGotT"/>
-              </w:rPr>
-              <w:t>prueba</w:t>
-            </w:r>
-            <w:proofErr w:type="spellEnd"/>
-            <w:r>
-              <w:rPr>
-                <w:rFonts w:ascii="NewsGotT" w:hAnsi="NewsGotT"/>
-              </w:rPr>
-              <w:t xml:space="preserve">, </w:t>
-            </w:r>
-            <w:proofErr w:type="spellStart"/>
-            <w:r>
-              <w:rPr>
-                <w:rFonts w:ascii="NewsGotT" w:hAnsi="NewsGotT"/>
-              </w:rPr>
-              <w:t>por</w:t>
-            </w:r>
-            <w:proofErr w:type="spellEnd"/>
-            <w:r>
-              <w:rPr>
-                <w:rFonts w:ascii="NewsGotT" w:hAnsi="NewsGotT"/>
-              </w:rPr>
-              <w:t xml:space="preserve"> </w:t>
-            </w:r>
-            <w:proofErr w:type="spellStart"/>
-            <w:r>
-              <w:rPr>
-                <w:rFonts w:ascii="NewsGotT" w:hAnsi="NewsGotT"/>
-              </w:rPr>
-              <w:t>ejemplo</w:t>
-            </w:r>
-            <w:proofErr w:type="spellEnd"/>
-            <w:r>
-              <w:rPr>
-                <w:rFonts w:ascii="NewsGotT" w:hAnsi="NewsGotT"/>
-              </w:rPr>
-              <w:t xml:space="preserve"> CP-01, CP-02, CP-03.</w:t>
+                <w:lang w:val="es-CL"/>
+              </w:rPr>
+              <w:t>Capturas identificadas por código de caso de prueba, por ejemplo CP-01, CP-02, CP-03.</w:t>
             </w:r>
           </w:p>
         </w:tc>
@@ -2861,7 +2319,7 @@
         <w:pStyle w:val="Standard"/>
         <w:jc w:val="both"/>
         <w:rPr>
-          <w:rFonts w:cs="Arial"/>
+          <w:rFonts w:cs="Arial" w:hint="eastAsia"/>
           <w:sz w:val="22"/>
           <w:szCs w:val="22"/>
         </w:rPr>
@@ -2872,7 +2330,7 @@
         <w:pStyle w:val="Standard"/>
         <w:jc w:val="both"/>
         <w:rPr>
-          <w:rFonts w:cs="Arial"/>
+          <w:rFonts w:cs="Arial" w:hint="eastAsia"/>
           <w:sz w:val="22"/>
           <w:szCs w:val="22"/>
         </w:rPr>
@@ -2883,7 +2341,7 @@
         <w:pStyle w:val="Standard"/>
         <w:jc w:val="both"/>
         <w:rPr>
-          <w:rFonts w:cs="Arial"/>
+          <w:rFonts w:cs="Arial" w:hint="eastAsia"/>
           <w:sz w:val="22"/>
           <w:szCs w:val="22"/>
         </w:rPr>
@@ -2894,7 +2352,7 @@
         <w:pStyle w:val="Standard"/>
         <w:jc w:val="both"/>
         <w:rPr>
-          <w:rFonts w:cs="Arial"/>
+          <w:rFonts w:cs="Arial" w:hint="eastAsia"/>
           <w:sz w:val="22"/>
           <w:szCs w:val="22"/>
         </w:rPr>
@@ -2905,7 +2363,7 @@
         <w:pStyle w:val="Standard"/>
         <w:jc w:val="both"/>
         <w:rPr>
-          <w:rFonts w:cs="Arial"/>
+          <w:rFonts w:cs="Arial" w:hint="eastAsia"/>
           <w:sz w:val="22"/>
           <w:szCs w:val="22"/>
         </w:rPr>
@@ -2916,7 +2374,7 @@
         <w:pStyle w:val="Standard"/>
         <w:jc w:val="both"/>
         <w:rPr>
-          <w:rFonts w:cs="Arial"/>
+          <w:rFonts w:cs="Arial" w:hint="eastAsia"/>
           <w:sz w:val="22"/>
           <w:szCs w:val="22"/>
         </w:rPr>
@@ -2927,7 +2385,7 @@
         <w:pStyle w:val="Standard"/>
         <w:jc w:val="both"/>
         <w:rPr>
-          <w:rFonts w:cs="Arial"/>
+          <w:rFonts w:cs="Arial" w:hint="eastAsia"/>
           <w:sz w:val="22"/>
           <w:szCs w:val="22"/>
         </w:rPr>
@@ -2938,7 +2396,7 @@
         <w:pStyle w:val="Standard"/>
         <w:jc w:val="both"/>
         <w:rPr>
-          <w:rFonts w:cs="Arial"/>
+          <w:rFonts w:cs="Arial" w:hint="eastAsia"/>
           <w:sz w:val="22"/>
           <w:szCs w:val="22"/>
         </w:rPr>
@@ -2963,7 +2421,7 @@
       <w:pPr>
         <w:pStyle w:val="Ttulo2"/>
         <w:rPr>
-          <w:rFonts w:ascii="NewsGotT" w:hAnsi="NewsGotT"/>
+          <w:rFonts w:ascii="NewsGotT" w:hAnsi="NewsGotT" w:hint="eastAsia"/>
         </w:rPr>
       </w:pPr>
       <w:r>
@@ -2981,8 +2439,8 @@
         <w:tblLook w:val="04A0" w:firstRow="1" w:lastRow="0" w:firstColumn="1" w:lastColumn="0" w:noHBand="0" w:noVBand="1"/>
       </w:tblPr>
       <w:tblGrid>
-        <w:gridCol w:w="4533"/>
-        <w:gridCol w:w="4528"/>
+        <w:gridCol w:w="4554"/>
+        <w:gridCol w:w="4507"/>
       </w:tblGrid>
       <w:tr>
         <w:trPr>
@@ -2996,19 +2454,17 @@
           <w:p>
             <w:pPr>
               <w:rPr>
+                <w:rFonts w:ascii="NewsGotT" w:hAnsi="NewsGotT" w:hint="eastAsia"/>
+              </w:rPr>
+            </w:pPr>
+            <w:r>
+              <w:rPr>
                 <w:rFonts w:ascii="NewsGotT" w:hAnsi="NewsGotT"/>
-              </w:rPr>
-            </w:pPr>
-            <w:proofErr w:type="spellStart"/>
-            <w:r>
-              <w:rPr>
-                <w:rFonts w:ascii="NewsGotT" w:hAnsi="NewsGotT"/>
                 <w:b/>
                 <w:color w:val="FFFFFF"/>
               </w:rPr>
               <w:t>Criterio</w:t>
             </w:r>
-            <w:proofErr w:type="spellEnd"/>
           </w:p>
         </w:tc>
         <w:tc>
@@ -3019,19 +2475,17 @@
           <w:p>
             <w:pPr>
               <w:rPr>
+                <w:rFonts w:ascii="NewsGotT" w:hAnsi="NewsGotT" w:hint="eastAsia"/>
+              </w:rPr>
+            </w:pPr>
+            <w:r>
+              <w:rPr>
                 <w:rFonts w:ascii="NewsGotT" w:hAnsi="NewsGotT"/>
-              </w:rPr>
-            </w:pPr>
-            <w:proofErr w:type="spellStart"/>
-            <w:r>
-              <w:rPr>
-                <w:rFonts w:ascii="NewsGotT" w:hAnsi="NewsGotT"/>
                 <w:b/>
                 <w:color w:val="FFFFFF"/>
               </w:rPr>
               <w:t>Descripción</w:t>
             </w:r>
-            <w:proofErr w:type="spellEnd"/>
           </w:p>
         </w:tc>
       </w:tr>
@@ -3046,216 +2500,34 @@
           <w:p>
             <w:pPr>
               <w:rPr>
+                <w:rFonts w:ascii="NewsGotT" w:hAnsi="NewsGotT" w:hint="eastAsia"/>
+              </w:rPr>
+            </w:pPr>
+            <w:r>
+              <w:rPr>
                 <w:rFonts w:ascii="NewsGotT" w:hAnsi="NewsGotT"/>
               </w:rPr>
-            </w:pPr>
-            <w:proofErr w:type="spellStart"/>
+              <w:t>Aprobado</w:t>
+            </w:r>
+          </w:p>
+        </w:tc>
+        <w:tc>
+          <w:tcPr>
+            <w:tcW w:w="5184" w:type="dxa"/>
+          </w:tcPr>
+          <w:p>
+            <w:pPr>
+              <w:rPr>
+                <w:rFonts w:ascii="NewsGotT" w:hAnsi="NewsGotT" w:hint="eastAsia"/>
+                <w:lang w:val="es-CL"/>
+              </w:rPr>
+            </w:pPr>
             <w:r>
               <w:rPr>
                 <w:rFonts w:ascii="NewsGotT" w:hAnsi="NewsGotT"/>
-              </w:rPr>
-              <w:t>Aprobado</w:t>
-            </w:r>
-            <w:proofErr w:type="spellEnd"/>
-          </w:p>
-        </w:tc>
-        <w:tc>
-          <w:tcPr>
-            <w:tcW w:w="5184" w:type="dxa"/>
-          </w:tcPr>
-          <w:p>
-            <w:pPr>
-              <w:rPr>
-                <w:rFonts w:ascii="NewsGotT" w:hAnsi="NewsGotT"/>
-              </w:rPr>
-            </w:pPr>
-            <w:r>
-              <w:rPr>
-                <w:rFonts w:ascii="NewsGotT" w:hAnsi="NewsGotT"/>
-              </w:rPr>
-              <w:t xml:space="preserve">El </w:t>
-            </w:r>
-            <w:proofErr w:type="spellStart"/>
-            <w:r>
-              <w:rPr>
-                <w:rFonts w:ascii="NewsGotT" w:hAnsi="NewsGotT"/>
-              </w:rPr>
-              <w:t>sistema</w:t>
-            </w:r>
-            <w:proofErr w:type="spellEnd"/>
-            <w:r>
-              <w:rPr>
-                <w:rFonts w:ascii="NewsGotT" w:hAnsi="NewsGotT"/>
-              </w:rPr>
-              <w:t xml:space="preserve"> </w:t>
-            </w:r>
-            <w:proofErr w:type="spellStart"/>
-            <w:r>
-              <w:rPr>
-                <w:rFonts w:ascii="NewsGotT" w:hAnsi="NewsGotT"/>
-              </w:rPr>
-              <w:t>ejecuta</w:t>
-            </w:r>
-            <w:proofErr w:type="spellEnd"/>
-            <w:r>
-              <w:rPr>
-                <w:rFonts w:ascii="NewsGotT" w:hAnsi="NewsGotT"/>
-              </w:rPr>
-              <w:t xml:space="preserve"> la </w:t>
-            </w:r>
-            <w:proofErr w:type="spellStart"/>
-            <w:r>
-              <w:rPr>
-                <w:rFonts w:ascii="NewsGotT" w:hAnsi="NewsGotT"/>
-              </w:rPr>
-              <w:t>acción</w:t>
-            </w:r>
-            <w:proofErr w:type="spellEnd"/>
-            <w:r>
-              <w:rPr>
-                <w:rFonts w:ascii="NewsGotT" w:hAnsi="NewsGotT"/>
-              </w:rPr>
-              <w:t xml:space="preserve"> </w:t>
-            </w:r>
-            <w:proofErr w:type="spellStart"/>
-            <w:r>
-              <w:rPr>
-                <w:rFonts w:ascii="NewsGotT" w:hAnsi="NewsGotT"/>
-              </w:rPr>
-              <w:t>solicitada</w:t>
-            </w:r>
-            <w:proofErr w:type="spellEnd"/>
-            <w:r>
-              <w:rPr>
-                <w:rFonts w:ascii="NewsGotT" w:hAnsi="NewsGotT"/>
-              </w:rPr>
-              <w:t xml:space="preserve">, </w:t>
-            </w:r>
-            <w:proofErr w:type="spellStart"/>
-            <w:r>
-              <w:rPr>
-                <w:rFonts w:ascii="NewsGotT" w:hAnsi="NewsGotT"/>
-              </w:rPr>
-              <w:t>muestra</w:t>
-            </w:r>
-            <w:proofErr w:type="spellEnd"/>
-            <w:r>
-              <w:rPr>
-                <w:rFonts w:ascii="NewsGotT" w:hAnsi="NewsGotT"/>
-              </w:rPr>
-              <w:t xml:space="preserve"> </w:t>
-            </w:r>
-            <w:proofErr w:type="spellStart"/>
-            <w:r>
-              <w:rPr>
-                <w:rFonts w:ascii="NewsGotT" w:hAnsi="NewsGotT"/>
-              </w:rPr>
-              <w:t>una</w:t>
-            </w:r>
-            <w:proofErr w:type="spellEnd"/>
-            <w:r>
-              <w:rPr>
-                <w:rFonts w:ascii="NewsGotT" w:hAnsi="NewsGotT"/>
-              </w:rPr>
-              <w:t xml:space="preserve"> </w:t>
-            </w:r>
-            <w:proofErr w:type="spellStart"/>
-            <w:r>
-              <w:rPr>
-                <w:rFonts w:ascii="NewsGotT" w:hAnsi="NewsGotT"/>
-              </w:rPr>
-              <w:t>respuesta</w:t>
-            </w:r>
-            <w:proofErr w:type="spellEnd"/>
-            <w:r>
-              <w:rPr>
-                <w:rFonts w:ascii="NewsGotT" w:hAnsi="NewsGotT"/>
-              </w:rPr>
-              <w:t xml:space="preserve"> </w:t>
-            </w:r>
-            <w:proofErr w:type="spellStart"/>
-            <w:r>
-              <w:rPr>
-                <w:rFonts w:ascii="NewsGotT" w:hAnsi="NewsGotT"/>
-              </w:rPr>
-              <w:t>coherente</w:t>
-            </w:r>
-            <w:proofErr w:type="spellEnd"/>
-            <w:r>
-              <w:rPr>
-                <w:rFonts w:ascii="NewsGotT" w:hAnsi="NewsGotT"/>
-              </w:rPr>
-              <w:t xml:space="preserve"> y </w:t>
-            </w:r>
-            <w:proofErr w:type="spellStart"/>
-            <w:r>
-              <w:rPr>
-                <w:rFonts w:ascii="NewsGotT" w:hAnsi="NewsGotT"/>
-              </w:rPr>
-              <w:t>mantiene</w:t>
-            </w:r>
-            <w:proofErr w:type="spellEnd"/>
-            <w:r>
-              <w:rPr>
-                <w:rFonts w:ascii="NewsGotT" w:hAnsi="NewsGotT"/>
-              </w:rPr>
-              <w:t xml:space="preserve"> </w:t>
-            </w:r>
-            <w:proofErr w:type="spellStart"/>
-            <w:r>
-              <w:rPr>
-                <w:rFonts w:ascii="NewsGotT" w:hAnsi="NewsGotT"/>
-              </w:rPr>
-              <w:t>el</w:t>
-            </w:r>
-            <w:proofErr w:type="spellEnd"/>
-            <w:r>
-              <w:rPr>
-                <w:rFonts w:ascii="NewsGotT" w:hAnsi="NewsGotT"/>
-              </w:rPr>
-              <w:t xml:space="preserve"> </w:t>
-            </w:r>
-            <w:proofErr w:type="spellStart"/>
-            <w:r>
-              <w:rPr>
-                <w:rFonts w:ascii="NewsGotT" w:hAnsi="NewsGotT"/>
-              </w:rPr>
-              <w:t>flujo</w:t>
-            </w:r>
-            <w:proofErr w:type="spellEnd"/>
-            <w:r>
-              <w:rPr>
-                <w:rFonts w:ascii="NewsGotT" w:hAnsi="NewsGotT"/>
-              </w:rPr>
-              <w:t xml:space="preserve"> </w:t>
-            </w:r>
-            <w:proofErr w:type="spellStart"/>
-            <w:r>
-              <w:rPr>
-                <w:rFonts w:ascii="NewsGotT" w:hAnsi="NewsGotT"/>
-              </w:rPr>
-              <w:t>funcional</w:t>
-            </w:r>
-            <w:proofErr w:type="spellEnd"/>
-            <w:r>
-              <w:rPr>
-                <w:rFonts w:ascii="NewsGotT" w:hAnsi="NewsGotT"/>
-              </w:rPr>
-              <w:t xml:space="preserve"> </w:t>
-            </w:r>
-            <w:proofErr w:type="spellStart"/>
-            <w:r>
-              <w:rPr>
-                <w:rFonts w:ascii="NewsGotT" w:hAnsi="NewsGotT"/>
-              </w:rPr>
-              <w:t>esperado</w:t>
-            </w:r>
-            <w:proofErr w:type="spellEnd"/>
-            <w:r>
-              <w:rPr>
-                <w:rFonts w:ascii="NewsGotT" w:hAnsi="NewsGotT"/>
-              </w:rPr>
-              <w:t>.</w:t>
+                <w:lang w:val="es-CL"/>
+              </w:rPr>
+              <w:t>El sistema ejecuta la acción solicitada, muestra una respuesta coherente y mantiene el flujo funcional esperado.</w:t>
             </w:r>
           </w:p>
         </w:tc>
@@ -3272,23 +2544,15 @@
           <w:p>
             <w:pPr>
               <w:rPr>
+                <w:rFonts w:ascii="NewsGotT" w:hAnsi="NewsGotT" w:hint="eastAsia"/>
+              </w:rPr>
+            </w:pPr>
+            <w:r>
+              <w:rPr>
                 <w:rFonts w:ascii="NewsGotT" w:hAnsi="NewsGotT"/>
               </w:rPr>
-            </w:pPr>
-            <w:r>
-              <w:rPr>
-                <w:rFonts w:ascii="NewsGotT" w:hAnsi="NewsGotT"/>
-              </w:rPr>
-              <w:t xml:space="preserve">No </w:t>
-            </w:r>
-            <w:proofErr w:type="spellStart"/>
-            <w:r>
-              <w:rPr>
-                <w:rFonts w:ascii="NewsGotT" w:hAnsi="NewsGotT"/>
-              </w:rPr>
-              <w:t>aprobado</w:t>
-            </w:r>
-            <w:proofErr w:type="spellEnd"/>
+              <w:t>No aprobado</w:t>
+            </w:r>
           </w:p>
         </w:tc>
         <w:tc>
@@ -3299,140 +2563,16 @@
           <w:p>
             <w:pPr>
               <w:rPr>
+                <w:rFonts w:ascii="NewsGotT" w:hAnsi="NewsGotT" w:hint="eastAsia"/>
+                <w:lang w:val="es-CL"/>
+              </w:rPr>
+            </w:pPr>
+            <w:r>
+              <w:rPr>
                 <w:rFonts w:ascii="NewsGotT" w:hAnsi="NewsGotT"/>
-              </w:rPr>
-            </w:pPr>
-            <w:r>
-              <w:rPr>
-                <w:rFonts w:ascii="NewsGotT" w:hAnsi="NewsGotT"/>
-              </w:rPr>
-              <w:t xml:space="preserve">La </w:t>
-            </w:r>
-            <w:proofErr w:type="spellStart"/>
-            <w:r>
-              <w:rPr>
-                <w:rFonts w:ascii="NewsGotT" w:hAnsi="NewsGotT"/>
-              </w:rPr>
-              <w:t>funcionalidad</w:t>
-            </w:r>
-            <w:proofErr w:type="spellEnd"/>
-            <w:r>
-              <w:rPr>
-                <w:rFonts w:ascii="NewsGotT" w:hAnsi="NewsGotT"/>
-              </w:rPr>
-              <w:t xml:space="preserve"> no se </w:t>
-            </w:r>
-            <w:proofErr w:type="spellStart"/>
-            <w:r>
-              <w:rPr>
-                <w:rFonts w:ascii="NewsGotT" w:hAnsi="NewsGotT"/>
-              </w:rPr>
-              <w:t>ejecuta</w:t>
-            </w:r>
-            <w:proofErr w:type="spellEnd"/>
-            <w:r>
-              <w:rPr>
-                <w:rFonts w:ascii="NewsGotT" w:hAnsi="NewsGotT"/>
-              </w:rPr>
-              <w:t xml:space="preserve">, </w:t>
-            </w:r>
-            <w:proofErr w:type="spellStart"/>
-            <w:r>
-              <w:rPr>
-                <w:rFonts w:ascii="NewsGotT" w:hAnsi="NewsGotT"/>
-              </w:rPr>
-              <w:t>presenta</w:t>
-            </w:r>
-            <w:proofErr w:type="spellEnd"/>
-            <w:r>
-              <w:rPr>
-                <w:rFonts w:ascii="NewsGotT" w:hAnsi="NewsGotT"/>
-              </w:rPr>
-              <w:t xml:space="preserve"> error </w:t>
-            </w:r>
-            <w:proofErr w:type="spellStart"/>
-            <w:r>
-              <w:rPr>
-                <w:rFonts w:ascii="NewsGotT" w:hAnsi="NewsGotT"/>
-              </w:rPr>
-              <w:t>crítico</w:t>
-            </w:r>
-            <w:proofErr w:type="spellEnd"/>
-            <w:r>
-              <w:rPr>
-                <w:rFonts w:ascii="NewsGotT" w:hAnsi="NewsGotT"/>
-              </w:rPr>
-              <w:t xml:space="preserve"> o </w:t>
-            </w:r>
-            <w:proofErr w:type="spellStart"/>
-            <w:r>
-              <w:rPr>
-                <w:rFonts w:ascii="NewsGotT" w:hAnsi="NewsGotT"/>
-              </w:rPr>
-              <w:t>impide</w:t>
-            </w:r>
-            <w:proofErr w:type="spellEnd"/>
-            <w:r>
-              <w:rPr>
-                <w:rFonts w:ascii="NewsGotT" w:hAnsi="NewsGotT"/>
-              </w:rPr>
-              <w:t xml:space="preserve"> </w:t>
-            </w:r>
-            <w:proofErr w:type="spellStart"/>
-            <w:r>
-              <w:rPr>
-                <w:rFonts w:ascii="NewsGotT" w:hAnsi="NewsGotT"/>
-              </w:rPr>
-              <w:t>completar</w:t>
-            </w:r>
-            <w:proofErr w:type="spellEnd"/>
-            <w:r>
-              <w:rPr>
-                <w:rFonts w:ascii="NewsGotT" w:hAnsi="NewsGotT"/>
-              </w:rPr>
-              <w:t xml:space="preserve"> </w:t>
-            </w:r>
-            <w:proofErr w:type="spellStart"/>
-            <w:r>
-              <w:rPr>
-                <w:rFonts w:ascii="NewsGotT" w:hAnsi="NewsGotT"/>
-              </w:rPr>
-              <w:t>el</w:t>
-            </w:r>
-            <w:proofErr w:type="spellEnd"/>
-            <w:r>
-              <w:rPr>
-                <w:rFonts w:ascii="NewsGotT" w:hAnsi="NewsGotT"/>
-              </w:rPr>
-              <w:t xml:space="preserve"> </w:t>
-            </w:r>
-            <w:proofErr w:type="spellStart"/>
-            <w:r>
-              <w:rPr>
-                <w:rFonts w:ascii="NewsGotT" w:hAnsi="NewsGotT"/>
-              </w:rPr>
-              <w:t>flujo</w:t>
-            </w:r>
-            <w:proofErr w:type="spellEnd"/>
-            <w:r>
-              <w:rPr>
-                <w:rFonts w:ascii="NewsGotT" w:hAnsi="NewsGotT"/>
-              </w:rPr>
-              <w:t xml:space="preserve"> </w:t>
-            </w:r>
-            <w:proofErr w:type="spellStart"/>
-            <w:r>
-              <w:rPr>
-                <w:rFonts w:ascii="NewsGotT" w:hAnsi="NewsGotT"/>
-              </w:rPr>
-              <w:t>esperado</w:t>
-            </w:r>
-            <w:proofErr w:type="spellEnd"/>
-            <w:r>
-              <w:rPr>
-                <w:rFonts w:ascii="NewsGotT" w:hAnsi="NewsGotT"/>
-              </w:rPr>
-              <w:t>.</w:t>
+                <w:lang w:val="es-CL"/>
+              </w:rPr>
+              <w:t>La funcionalidad no se ejecuta, presenta error crítico o impide completar el flujo esperado.</w:t>
             </w:r>
           </w:p>
         </w:tc>
@@ -3448,124 +2588,34 @@
           <w:p>
             <w:pPr>
               <w:rPr>
+                <w:rFonts w:ascii="NewsGotT" w:hAnsi="NewsGotT" w:hint="eastAsia"/>
+              </w:rPr>
+            </w:pPr>
+            <w:r>
+              <w:rPr>
                 <w:rFonts w:ascii="NewsGotT" w:hAnsi="NewsGotT"/>
               </w:rPr>
+              <w:t>No aplica</w:t>
+            </w:r>
+          </w:p>
+        </w:tc>
+        <w:tc>
+          <w:tcPr>
+            <w:tcW w:w="5184" w:type="dxa"/>
+          </w:tcPr>
+          <w:p>
+            <w:pPr>
+              <w:rPr>
+                <w:rFonts w:ascii="NewsGotT" w:hAnsi="NewsGotT" w:hint="eastAsia"/>
+                <w:lang w:val="es-CL"/>
+              </w:rPr>
             </w:pPr>
             <w:r>
               <w:rPr>
                 <w:rFonts w:ascii="NewsGotT" w:hAnsi="NewsGotT"/>
-              </w:rPr>
-              <w:t xml:space="preserve">No </w:t>
-            </w:r>
-            <w:proofErr w:type="spellStart"/>
-            <w:r>
-              <w:rPr>
-                <w:rFonts w:ascii="NewsGotT" w:hAnsi="NewsGotT"/>
-              </w:rPr>
-              <w:t>aplica</w:t>
-            </w:r>
-            <w:proofErr w:type="spellEnd"/>
-          </w:p>
-        </w:tc>
-        <w:tc>
-          <w:tcPr>
-            <w:tcW w:w="5184" w:type="dxa"/>
-          </w:tcPr>
-          <w:p>
-            <w:pPr>
-              <w:rPr>
-                <w:rFonts w:ascii="NewsGotT" w:hAnsi="NewsGotT"/>
-              </w:rPr>
-            </w:pPr>
-            <w:r>
-              <w:rPr>
-                <w:rFonts w:ascii="NewsGotT" w:hAnsi="NewsGotT"/>
-              </w:rPr>
-              <w:t xml:space="preserve">El </w:t>
-            </w:r>
-            <w:proofErr w:type="spellStart"/>
-            <w:r>
-              <w:rPr>
-                <w:rFonts w:ascii="NewsGotT" w:hAnsi="NewsGotT"/>
-              </w:rPr>
-              <w:t>caso</w:t>
-            </w:r>
-            <w:proofErr w:type="spellEnd"/>
-            <w:r>
-              <w:rPr>
-                <w:rFonts w:ascii="NewsGotT" w:hAnsi="NewsGotT"/>
-              </w:rPr>
-              <w:t xml:space="preserve"> no </w:t>
-            </w:r>
-            <w:proofErr w:type="spellStart"/>
-            <w:r>
-              <w:rPr>
-                <w:rFonts w:ascii="NewsGotT" w:hAnsi="NewsGotT"/>
-              </w:rPr>
-              <w:t>corresponde</w:t>
-            </w:r>
-            <w:proofErr w:type="spellEnd"/>
-            <w:r>
-              <w:rPr>
-                <w:rFonts w:ascii="NewsGotT" w:hAnsi="NewsGotT"/>
-              </w:rPr>
-              <w:t xml:space="preserve"> a la </w:t>
-            </w:r>
-            <w:proofErr w:type="spellStart"/>
-            <w:r>
-              <w:rPr>
-                <w:rFonts w:ascii="NewsGotT" w:hAnsi="NewsGotT"/>
-              </w:rPr>
-              <w:t>versión</w:t>
-            </w:r>
-            <w:proofErr w:type="spellEnd"/>
-            <w:r>
-              <w:rPr>
-                <w:rFonts w:ascii="NewsGotT" w:hAnsi="NewsGotT"/>
-              </w:rPr>
-              <w:t xml:space="preserve"> </w:t>
-            </w:r>
-            <w:proofErr w:type="spellStart"/>
-            <w:r>
-              <w:rPr>
-                <w:rFonts w:ascii="NewsGotT" w:hAnsi="NewsGotT"/>
-              </w:rPr>
-              <w:t>evaluada</w:t>
-            </w:r>
-            <w:proofErr w:type="spellEnd"/>
-            <w:r>
-              <w:rPr>
-                <w:rFonts w:ascii="NewsGotT" w:hAnsi="NewsGotT"/>
-              </w:rPr>
-              <w:t xml:space="preserve"> o se </w:t>
-            </w:r>
-            <w:proofErr w:type="spellStart"/>
-            <w:r>
-              <w:rPr>
-                <w:rFonts w:ascii="NewsGotT" w:hAnsi="NewsGotT"/>
-              </w:rPr>
-              <w:t>encuentra</w:t>
-            </w:r>
-            <w:proofErr w:type="spellEnd"/>
-            <w:r>
-              <w:rPr>
-                <w:rFonts w:ascii="NewsGotT" w:hAnsi="NewsGotT"/>
-              </w:rPr>
-              <w:t xml:space="preserve"> fuera del </w:t>
-            </w:r>
-            <w:proofErr w:type="spellStart"/>
-            <w:r>
-              <w:rPr>
-                <w:rFonts w:ascii="NewsGotT" w:hAnsi="NewsGotT"/>
-              </w:rPr>
-              <w:t>alcance</w:t>
-            </w:r>
-            <w:proofErr w:type="spellEnd"/>
-            <w:r>
-              <w:rPr>
-                <w:rFonts w:ascii="NewsGotT" w:hAnsi="NewsGotT"/>
-              </w:rPr>
-              <w:t xml:space="preserve"> del plan.</w:t>
+                <w:lang w:val="es-CL"/>
+              </w:rPr>
+              <w:t>El caso no corresponde a la versión evaluada o se encuentra fuera del alcance del plan.</w:t>
             </w:r>
           </w:p>
         </w:tc>
@@ -3582,17 +2632,15 @@
           <w:p>
             <w:pPr>
               <w:rPr>
+                <w:rFonts w:ascii="NewsGotT" w:hAnsi="NewsGotT" w:hint="eastAsia"/>
+              </w:rPr>
+            </w:pPr>
+            <w:r>
+              <w:rPr>
                 <w:rFonts w:ascii="NewsGotT" w:hAnsi="NewsGotT"/>
               </w:rPr>
-            </w:pPr>
-            <w:proofErr w:type="spellStart"/>
-            <w:r>
-              <w:rPr>
-                <w:rFonts w:ascii="NewsGotT" w:hAnsi="NewsGotT"/>
-              </w:rPr>
               <w:t>Pendiente</w:t>
             </w:r>
-            <w:proofErr w:type="spellEnd"/>
           </w:p>
         </w:tc>
         <w:tc>
@@ -3603,98 +2651,16 @@
           <w:p>
             <w:pPr>
               <w:rPr>
+                <w:rFonts w:ascii="NewsGotT" w:hAnsi="NewsGotT" w:hint="eastAsia"/>
+                <w:lang w:val="es-CL"/>
+              </w:rPr>
+            </w:pPr>
+            <w:r>
+              <w:rPr>
                 <w:rFonts w:ascii="NewsGotT" w:hAnsi="NewsGotT"/>
-              </w:rPr>
-            </w:pPr>
-            <w:r>
-              <w:rPr>
-                <w:rFonts w:ascii="NewsGotT" w:hAnsi="NewsGotT"/>
-              </w:rPr>
-              <w:t xml:space="preserve">El </w:t>
-            </w:r>
-            <w:proofErr w:type="spellStart"/>
-            <w:r>
-              <w:rPr>
-                <w:rFonts w:ascii="NewsGotT" w:hAnsi="NewsGotT"/>
-              </w:rPr>
-              <w:t>caso</w:t>
-            </w:r>
-            <w:proofErr w:type="spellEnd"/>
-            <w:r>
-              <w:rPr>
-                <w:rFonts w:ascii="NewsGotT" w:hAnsi="NewsGotT"/>
-              </w:rPr>
-              <w:t xml:space="preserve"> </w:t>
-            </w:r>
-            <w:proofErr w:type="spellStart"/>
-            <w:r>
-              <w:rPr>
-                <w:rFonts w:ascii="NewsGotT" w:hAnsi="NewsGotT"/>
-              </w:rPr>
-              <w:t>requiere</w:t>
-            </w:r>
-            <w:proofErr w:type="spellEnd"/>
-            <w:r>
-              <w:rPr>
-                <w:rFonts w:ascii="NewsGotT" w:hAnsi="NewsGotT"/>
-              </w:rPr>
-              <w:t xml:space="preserve"> </w:t>
-            </w:r>
-            <w:proofErr w:type="spellStart"/>
-            <w:r>
-              <w:rPr>
-                <w:rFonts w:ascii="NewsGotT" w:hAnsi="NewsGotT"/>
-              </w:rPr>
-              <w:t>nueva</w:t>
-            </w:r>
-            <w:proofErr w:type="spellEnd"/>
-            <w:r>
-              <w:rPr>
-                <w:rFonts w:ascii="NewsGotT" w:hAnsi="NewsGotT"/>
-              </w:rPr>
-              <w:t xml:space="preserve"> </w:t>
-            </w:r>
-            <w:proofErr w:type="spellStart"/>
-            <w:r>
-              <w:rPr>
-                <w:rFonts w:ascii="NewsGotT" w:hAnsi="NewsGotT"/>
-              </w:rPr>
-              <w:t>ejecución</w:t>
-            </w:r>
-            <w:proofErr w:type="spellEnd"/>
-            <w:r>
-              <w:rPr>
-                <w:rFonts w:ascii="NewsGotT" w:hAnsi="NewsGotT"/>
-              </w:rPr>
-              <w:t xml:space="preserve"> o </w:t>
-            </w:r>
-            <w:proofErr w:type="spellStart"/>
-            <w:r>
-              <w:rPr>
-                <w:rFonts w:ascii="NewsGotT" w:hAnsi="NewsGotT"/>
-              </w:rPr>
-              <w:t>evidencia</w:t>
-            </w:r>
-            <w:proofErr w:type="spellEnd"/>
-            <w:r>
-              <w:rPr>
-                <w:rFonts w:ascii="NewsGotT" w:hAnsi="NewsGotT"/>
-              </w:rPr>
-              <w:t xml:space="preserve"> </w:t>
-            </w:r>
-            <w:proofErr w:type="spellStart"/>
-            <w:r>
-              <w:rPr>
-                <w:rFonts w:ascii="NewsGotT" w:hAnsi="NewsGotT"/>
-              </w:rPr>
-              <w:t>complementaria</w:t>
-            </w:r>
-            <w:proofErr w:type="spellEnd"/>
-            <w:r>
-              <w:rPr>
-                <w:rFonts w:ascii="NewsGotT" w:hAnsi="NewsGotT"/>
-              </w:rPr>
-              <w:t>.</w:t>
+                <w:lang w:val="es-CL"/>
+              </w:rPr>
+              <w:t>El caso requiere nueva ejecución o evidencia complementaria.</w:t>
             </w:r>
           </w:p>
         </w:tc>
@@ -3919,7 +2885,7 @@
               </w:rPr>
             </w:pPr>
             <w:r>
-              <w:t>No</w:t>
+              <w:t>SI</w:t>
             </w:r>
           </w:p>
         </w:tc>
@@ -4532,6 +3498,7 @@
       <w:pPr>
         <w:pStyle w:val="Textbody"/>
         <w:rPr>
+          <w:rFonts w:hint="eastAsia"/>
           <w:u w:val="single"/>
         </w:rPr>
       </w:pPr>
@@ -4540,6 +3507,7 @@
       <w:pPr>
         <w:pStyle w:val="Textbody"/>
         <w:rPr>
+          <w:rFonts w:hint="eastAsia"/>
           <w:u w:val="single"/>
         </w:rPr>
       </w:pPr>
@@ -4658,7 +3626,7 @@
               </w:rPr>
             </w:pPr>
             <w:r>
-              <w:t>No</w:t>
+              <w:t>SI</w:t>
             </w:r>
           </w:p>
         </w:tc>
@@ -5364,7 +4332,7 @@
               </w:rPr>
             </w:pPr>
             <w:r>
-              <w:t>No</w:t>
+              <w:t>SI</w:t>
             </w:r>
           </w:p>
         </w:tc>
@@ -5996,7 +4964,7 @@
               </w:rPr>
             </w:pPr>
             <w:r>
-              <w:t>No</w:t>
+              <w:t>SI</w:t>
             </w:r>
           </w:p>
         </w:tc>
@@ -6373,6 +5341,7 @@
             <w:pPr>
               <w:pStyle w:val="TableContents"/>
               <w:rPr>
+                <w:rFonts w:hint="eastAsia"/>
                 <w:b/>
                 <w:bCs/>
               </w:rPr>
@@ -6567,7 +5536,7 @@
               </w:rPr>
             </w:pPr>
             <w:r>
-              <w:t>No</w:t>
+              <w:t>SI</w:t>
             </w:r>
           </w:p>
         </w:tc>
@@ -7239,6 +6208,7 @@
       <w:pPr>
         <w:pStyle w:val="Textbody"/>
         <w:rPr>
+          <w:rFonts w:hint="eastAsia"/>
           <w:u w:val="single"/>
         </w:rPr>
       </w:pPr>
@@ -7357,7 +6327,7 @@
               </w:rPr>
             </w:pPr>
             <w:r>
-              <w:t>No</w:t>
+              <w:t>SI</w:t>
             </w:r>
           </w:p>
         </w:tc>
@@ -7969,7 +6939,7 @@
               </w:rPr>
             </w:pPr>
             <w:r>
-              <w:t>No</w:t>
+              <w:t>SI</w:t>
             </w:r>
           </w:p>
         </w:tc>
@@ -8586,6 +7556,7 @@
       <w:pPr>
         <w:pStyle w:val="Textbody"/>
         <w:rPr>
+          <w:rFonts w:hint="eastAsia"/>
           <w:u w:val="single"/>
         </w:rPr>
       </w:pPr>
@@ -8704,7 +7675,7 @@
               </w:rPr>
             </w:pPr>
             <w:r>
-              <w:t>No</w:t>
+              <w:t>SI</w:t>
             </w:r>
           </w:p>
         </w:tc>
@@ -9340,7 +8311,7 @@
               </w:rPr>
             </w:pPr>
             <w:r>
-              <w:t>No</w:t>
+              <w:t>SI</w:t>
             </w:r>
           </w:p>
         </w:tc>
@@ -10035,7 +9006,7 @@
               </w:rPr>
             </w:pPr>
             <w:r>
-              <w:t>No</w:t>
+              <w:t>SI</w:t>
             </w:r>
           </w:p>
         </w:tc>
@@ -10673,7 +9644,7 @@
               </w:rPr>
             </w:pPr>
             <w:r>
-              <w:t>No</w:t>
+              <w:t>SI</w:t>
             </w:r>
           </w:p>
         </w:tc>
@@ -11282,7 +10253,7 @@
               </w:rPr>
             </w:pPr>
             <w:r>
-              <w:t>No</w:t>
+              <w:t>SI</w:t>
             </w:r>
           </w:p>
         </w:tc>
@@ -12085,7 +11056,7 @@
               </w:rPr>
             </w:pPr>
             <w:r>
-              <w:t>No</w:t>
+              <w:t>SI</w:t>
             </w:r>
           </w:p>
         </w:tc>
@@ -12675,7 +11646,7 @@
               </w:rPr>
             </w:pPr>
             <w:r>
-              <w:t>No</w:t>
+              <w:t>SI</w:t>
             </w:r>
           </w:p>
         </w:tc>
@@ -13288,7 +12259,7 @@
               </w:rPr>
             </w:pPr>
             <w:r>
-              <w:t>No</w:t>
+              <w:t>SI</w:t>
             </w:r>
           </w:p>
         </w:tc>
@@ -13878,7 +12849,7 @@
               </w:rPr>
             </w:pPr>
             <w:r>
-              <w:t>No</w:t>
+              <w:t>SI</w:t>
             </w:r>
           </w:p>
         </w:tc>
@@ -14453,6 +13424,7 @@
       <w:pPr>
         <w:pStyle w:val="Textbody"/>
         <w:rPr>
+          <w:rFonts w:hint="eastAsia"/>
           <w:u w:val="single"/>
         </w:rPr>
       </w:pPr>
@@ -14461,6 +13433,7 @@
       <w:pPr>
         <w:pStyle w:val="Textbody"/>
         <w:rPr>
+          <w:rFonts w:hint="eastAsia"/>
           <w:u w:val="single"/>
         </w:rPr>
       </w:pPr>
@@ -14469,6 +13442,7 @@
       <w:pPr>
         <w:pStyle w:val="Textbody"/>
         <w:rPr>
+          <w:rFonts w:hint="eastAsia"/>
           <w:u w:val="single"/>
         </w:rPr>
       </w:pPr>
@@ -14588,7 +13562,7 @@
               </w:rPr>
             </w:pPr>
             <w:r>
-              <w:t>No</w:t>
+              <w:t>SI</w:t>
             </w:r>
           </w:p>
         </w:tc>
@@ -15275,7 +14249,7 @@
               </w:rPr>
             </w:pPr>
             <w:r>
-              <w:t>No</w:t>
+              <w:t>SI</w:t>
             </w:r>
           </w:p>
         </w:tc>
@@ -15955,7 +14929,7 @@
               </w:rPr>
             </w:pPr>
             <w:r>
-              <w:t>No</w:t>
+              <w:t>SI</w:t>
             </w:r>
           </w:p>
         </w:tc>
@@ -16143,23 +15117,7 @@
                 <w:color w:val="000000"/>
                 <w:lang w:val="es-CL"/>
               </w:rPr>
-              <w:t xml:space="preserve">El módulo Login </w:t>
-            </w:r>
-            <w:proofErr w:type="spellStart"/>
-            <w:r>
-              <w:rPr>
-                <w:color w:val="000000"/>
-                <w:lang w:val="es-CL"/>
-              </w:rPr>
-              <w:t>Admin</w:t>
-            </w:r>
-            <w:proofErr w:type="spellEnd"/>
-            <w:r>
-              <w:rPr>
-                <w:color w:val="000000"/>
-                <w:lang w:val="es-CL"/>
-              </w:rPr>
-              <w:t xml:space="preserve"> debe estar disponible.</w:t>
+              <w:t>El módulo Login Admin debe estar disponible.</w:t>
             </w:r>
           </w:p>
           <w:p>
@@ -16269,25 +15227,7 @@
                 <w:bCs/>
                 <w:lang w:val="es-CL"/>
               </w:rPr>
-              <w:t xml:space="preserve">Ingresar al Login </w:t>
-            </w:r>
-            <w:proofErr w:type="spellStart"/>
-            <w:r>
-              <w:rPr>
-                <w:b/>
-                <w:bCs/>
-                <w:lang w:val="es-CL"/>
-              </w:rPr>
-              <w:t>Admin</w:t>
-            </w:r>
-            <w:proofErr w:type="spellEnd"/>
-            <w:r>
-              <w:rPr>
-                <w:b/>
-                <w:bCs/>
-                <w:lang w:val="es-CL"/>
-              </w:rPr>
-              <w:t>.</w:t>
+              <w:t>Ingresar al Login Admin.</w:t>
             </w:r>
           </w:p>
           <w:p>
@@ -16333,25 +15273,7 @@
                 <w:bCs/>
                 <w:lang w:val="es-CL"/>
               </w:rPr>
-              <w:t xml:space="preserve">Seleccionar "Ingresar como </w:t>
-            </w:r>
-            <w:proofErr w:type="spellStart"/>
-            <w:r>
-              <w:rPr>
-                <w:b/>
-                <w:bCs/>
-                <w:lang w:val="es-CL"/>
-              </w:rPr>
-              <w:t>Admin</w:t>
-            </w:r>
-            <w:proofErr w:type="spellEnd"/>
-            <w:r>
-              <w:rPr>
-                <w:b/>
-                <w:bCs/>
-                <w:lang w:val="es-CL"/>
-              </w:rPr>
-              <w:t>".</w:t>
+              <w:t>Seleccionar "Ingresar como Admin".</w:t>
             </w:r>
           </w:p>
         </w:tc>
@@ -16598,7 +15520,7 @@
               </w:rPr>
             </w:pPr>
             <w:r>
-              <w:t>No</w:t>
+              <w:t>SI</w:t>
             </w:r>
           </w:p>
         </w:tc>
@@ -17615,7 +16537,7 @@
               </w:rPr>
             </w:pPr>
             <w:r>
-              <w:t>No</w:t>
+              <w:t>SI</w:t>
             </w:r>
           </w:p>
         </w:tc>
@@ -18413,7 +17335,7 @@
               </w:rPr>
             </w:pPr>
             <w:r>
-              <w:t>No</w:t>
+              <w:t>SI</w:t>
             </w:r>
           </w:p>
         </w:tc>
@@ -18940,6 +17862,7 @@
       <w:pPr>
         <w:pStyle w:val="Textbody"/>
         <w:rPr>
+          <w:rFonts w:hint="eastAsia"/>
           <w:u w:val="single"/>
         </w:rPr>
       </w:pPr>
@@ -18948,6 +17871,7 @@
       <w:pPr>
         <w:pStyle w:val="Textbody"/>
         <w:rPr>
+          <w:rFonts w:hint="eastAsia"/>
           <w:u w:val="single"/>
         </w:rPr>
       </w:pPr>
@@ -18956,6 +17880,7 @@
       <w:pPr>
         <w:pStyle w:val="Textbody"/>
         <w:rPr>
+          <w:rFonts w:hint="eastAsia"/>
           <w:u w:val="single"/>
         </w:rPr>
       </w:pPr>
@@ -19075,7 +18000,7 @@
               </w:rPr>
             </w:pPr>
             <w:r>
-              <w:t>No</w:t>
+              <w:t>SI</w:t>
             </w:r>
           </w:p>
         </w:tc>
@@ -19663,7 +18588,7 @@
               </w:rPr>
             </w:pPr>
             <w:r>
-              <w:t>No</w:t>
+              <w:t>SI</w:t>
             </w:r>
           </w:p>
         </w:tc>
@@ -20624,7 +19549,7 @@
               </w:rPr>
             </w:pPr>
             <w:r>
-              <w:t>No</w:t>
+              <w:t>SI</w:t>
             </w:r>
           </w:p>
         </w:tc>
@@ -21431,7 +20356,7 @@
               </w:rPr>
             </w:pPr>
             <w:r>
-              <w:t>No</w:t>
+              <w:t>SI</w:t>
             </w:r>
           </w:p>
         </w:tc>
@@ -22131,7 +21056,7 @@
               </w:rPr>
             </w:pPr>
             <w:r>
-              <w:t>No</w:t>
+              <w:t>SI</w:t>
             </w:r>
           </w:p>
         </w:tc>
@@ -22895,7 +21820,7 @@
               </w:rPr>
             </w:pPr>
             <w:r>
-              <w:t>No</w:t>
+              <w:t>SI</w:t>
             </w:r>
           </w:p>
         </w:tc>
@@ -23922,7 +22847,6 @@
           <w:lang w:val="es-CL"/>
         </w:rPr>
       </w:pPr>
-      <w:proofErr w:type="gramStart"/>
       <w:r>
         <w:rPr>
           <w:rFonts w:eastAsia="NewsGotT" w:cs="NewsGotT"/>
@@ -23947,7 +22871,6 @@
         </w:rPr>
         <w:t xml:space="preserve"> ejecución</w:t>
       </w:r>
-      <w:proofErr w:type="gramEnd"/>
       <w:r>
         <w:rPr>
           <w:rFonts w:eastAsia="NewsGotT" w:cs="NewsGotT"/>
@@ -32655,17 +31578,8 @@
             <w:rStyle w:val="Hipervnculo"/>
             <w:rFonts w:cs="Arial"/>
           </w:rPr>
-          <w:t>Encargo Ev.</w:t>
+          <w:t>Encargo Ev.2.docs</w:t>
         </w:r>
-        <w:proofErr w:type="gramStart"/>
-        <w:r>
-          <w:rPr>
-            <w:rStyle w:val="Hipervnculo"/>
-            <w:rFonts w:cs="Arial"/>
-          </w:rPr>
-          <w:t>2.docs</w:t>
-        </w:r>
-        <w:proofErr w:type="gramEnd"/>
       </w:hyperlink>
     </w:p>
     <w:p>
@@ -32913,14 +31827,12 @@
                 <w:rFonts w:cs="Arial" w:hint="eastAsia"/>
               </w:rPr>
             </w:pPr>
-            <w:proofErr w:type="spellStart"/>
             <w:r>
               <w:rPr>
                 <w:rFonts w:cs="Arial"/>
               </w:rPr>
               <w:t>Frontend</w:t>
             </w:r>
-            <w:proofErr w:type="spellEnd"/>
           </w:p>
         </w:tc>
         <w:tc>
@@ -32981,14 +31893,12 @@
                 <w:rFonts w:cs="Arial" w:hint="eastAsia"/>
               </w:rPr>
             </w:pPr>
-            <w:proofErr w:type="spellStart"/>
             <w:r>
               <w:rPr>
                 <w:rFonts w:cs="Arial"/>
               </w:rPr>
               <w:t>Backend</w:t>
             </w:r>
-            <w:proofErr w:type="spellEnd"/>
           </w:p>
         </w:tc>
         <w:tc>
@@ -41676,18 +40586,18 @@
 </file>
 
 <file path=customXml/item2.xml><?xml version="1.0" encoding="utf-8"?>
-<p:properties xmlns:p="http://schemas.microsoft.com/office/2006/metadata/properties" xmlns:xsi="http://www.w3.org/2001/XMLSchema-instance" xmlns:pc="http://schemas.microsoft.com/office/infopath/2007/PartnerControls">
-  <documentManagement/>
-</p:properties>
-</file>
-
-<file path=customXml/item3.xml><?xml version="1.0" encoding="utf-8"?>
 <?mso-contentType ?>
 <FormTemplates xmlns="http://schemas.microsoft.com/sharepoint/v3/contenttype/forms">
   <Display>DocumentLibraryForm</Display>
   <Edit>DocumentLibraryForm</Edit>
   <New>DocumentLibraryForm</New>
 </FormTemplates>
+</file>
+
+<file path=customXml/item3.xml><?xml version="1.0" encoding="utf-8"?>
+<p:properties xmlns:p="http://schemas.microsoft.com/office/2006/metadata/properties" xmlns:xsi="http://www.w3.org/2001/XMLSchema-instance" xmlns:pc="http://schemas.microsoft.com/office/infopath/2007/PartnerControls">
+  <documentManagement/>
+</p:properties>
 </file>
 
 <file path=customXml/itemProps1.xml><?xml version="1.0" encoding="utf-8"?>
@@ -41710,18 +40620,18 @@
 </file>
 
 <file path=customXml/itemProps2.xml><?xml version="1.0" encoding="utf-8"?>
+<ds:datastoreItem xmlns:ds="http://schemas.openxmlformats.org/officeDocument/2006/customXml" ds:itemID="{72654922-4FCC-494D-93F7-F43064C530AD}">
+  <ds:schemaRefs>
+    <ds:schemaRef ds:uri="http://schemas.microsoft.com/sharepoint/v3/contenttype/forms"/>
+  </ds:schemaRefs>
+</ds:datastoreItem>
+</file>
+
+<file path=customXml/itemProps3.xml><?xml version="1.0" encoding="utf-8"?>
 <ds:datastoreItem xmlns:ds="http://schemas.openxmlformats.org/officeDocument/2006/customXml" ds:itemID="{B203E38B-4023-43A9-9B83-ED9E35A01FB5}">
   <ds:schemaRefs>
     <ds:schemaRef ds:uri="http://schemas.microsoft.com/office/2006/metadata/properties"/>
     <ds:schemaRef ds:uri="http://schemas.microsoft.com/office/infopath/2007/PartnerControls"/>
   </ds:schemaRefs>
 </ds:datastoreItem>
-</file>
-
-<file path=customXml/itemProps3.xml><?xml version="1.0" encoding="utf-8"?>
-<ds:datastoreItem xmlns:ds="http://schemas.openxmlformats.org/officeDocument/2006/customXml" ds:itemID="{72654922-4FCC-494D-93F7-F43064C530AD}">
-  <ds:schemaRefs>
-    <ds:schemaRef ds:uri="http://schemas.microsoft.com/sharepoint/v3/contenttype/forms"/>
-  </ds:schemaRefs>
-</ds:datastoreItem>
 </file>
</xml_diff>

<commit_message>
Cambios en encargo 3, readme y plan pruebas
</commit_message>
<xml_diff>
--- a/Documentación/Plan_Pruebas/3.1.2 Plan Pruebas Funcionales.v2.docx
+++ b/Documentación/Plan_Pruebas/3.1.2 Plan Pruebas Funcionales.v2.docx
@@ -160,24 +160,11 @@
           <w:rFonts w:hint="eastAsia"/>
         </w:rPr>
       </w:pPr>
-      <w:r>
-        <w:fldChar w:fldCharType="begin"/>
-      </w:r>
-      <w:r>
-        <w:instrText xml:space="preserve"> TITLE </w:instrText>
-      </w:r>
-      <w:r>
-        <w:rPr>
-          <w:rFonts w:hint="eastAsia"/>
-        </w:rPr>
-        <w:fldChar w:fldCharType="separate"/>
-      </w:r>
-      <w:r>
-        <w:t>Planes de Pruebas Funcionales</w:t>
-      </w:r>
-      <w:r>
-        <w:fldChar w:fldCharType="end"/>
-      </w:r>
+      <w:fldSimple w:instr=" TITLE ">
+        <w:r>
+          <w:t>Planes de Pruebas Funcionales</w:t>
+        </w:r>
+      </w:fldSimple>
     </w:p>
     <w:p>
       <w:pPr>
@@ -486,24 +473,11 @@
                 <w:rFonts w:hint="eastAsia"/>
               </w:rPr>
             </w:pPr>
-            <w:r>
-              <w:fldChar w:fldCharType="begin"/>
-            </w:r>
-            <w:r>
-              <w:instrText xml:space="preserve"> TITLE </w:instrText>
-            </w:r>
-            <w:r>
-              <w:rPr>
-                <w:rFonts w:hint="eastAsia"/>
-              </w:rPr>
-              <w:fldChar w:fldCharType="separate"/>
-            </w:r>
-            <w:r>
-              <w:t>Planes de Pruebas Funcionales</w:t>
-            </w:r>
-            <w:r>
-              <w:fldChar w:fldCharType="end"/>
-            </w:r>
+            <w:fldSimple w:instr=" TITLE ">
+              <w:r>
+                <w:t>Planes de Pruebas Funcionales</w:t>
+              </w:r>
+            </w:fldSimple>
           </w:p>
         </w:tc>
       </w:tr>
@@ -821,7 +795,7 @@
               </w:rPr>
             </w:pPr>
             <w:r>
-              <w:t>Pendiente</w:t>
+              <w:t>25/06/2026</w:t>
             </w:r>
           </w:p>
         </w:tc>
@@ -2091,18 +2065,90 @@
     <w:p>
       <w:pPr>
         <w:rPr>
-          <w:rFonts w:ascii="NewsGotT" w:hAnsi="NewsGotT" w:hint="eastAsia"/>
-          <w:sz w:val="22"/>
-          <w:szCs w:val="22"/>
-        </w:rPr>
-      </w:pPr>
-      <w:r>
-        <w:rPr>
           <w:rFonts w:ascii="NewsGotT" w:hAnsi="NewsGotT"/>
           <w:sz w:val="22"/>
           <w:szCs w:val="22"/>
         </w:rPr>
-        <w:t>Las pruebas fueron diseñadas para ejecutarse en un ambiente local/controlado de desarrollo, con la aplicación web levantada mediante frontend React, backend Spring Boot, API Gateway, microservicios y base de datos MongoDB.</w:t>
+      </w:pPr>
+      <w:r>
+        <w:rPr>
+          <w:rFonts w:ascii="NewsGotT" w:hAnsi="NewsGotT"/>
+          <w:sz w:val="22"/>
+          <w:szCs w:val="22"/>
+        </w:rPr>
+        <w:t xml:space="preserve">Las pruebas fueron diseñadas y ejecutadas en un ambiente de QA desplegado en AWS, utilizando la aplicación web </w:t>
+      </w:r>
+      <w:proofErr w:type="spellStart"/>
+      <w:r>
+        <w:rPr>
+          <w:rFonts w:ascii="NewsGotT" w:hAnsi="NewsGotT"/>
+          <w:sz w:val="22"/>
+          <w:szCs w:val="22"/>
+        </w:rPr>
+        <w:t>PetDate</w:t>
+      </w:r>
+      <w:proofErr w:type="spellEnd"/>
+      <w:r>
+        <w:rPr>
+          <w:rFonts w:ascii="NewsGotT" w:hAnsi="NewsGotT"/>
+          <w:sz w:val="22"/>
+          <w:szCs w:val="22"/>
+        </w:rPr>
+        <w:t xml:space="preserve"> junto con su </w:t>
+      </w:r>
+      <w:proofErr w:type="spellStart"/>
+      <w:r>
+        <w:rPr>
+          <w:rFonts w:ascii="NewsGotT" w:hAnsi="NewsGotT"/>
+          <w:sz w:val="22"/>
+          <w:szCs w:val="22"/>
+        </w:rPr>
+        <w:t>frontend</w:t>
+      </w:r>
+      <w:proofErr w:type="spellEnd"/>
+      <w:r>
+        <w:rPr>
+          <w:rFonts w:ascii="NewsGotT" w:hAnsi="NewsGotT"/>
+          <w:sz w:val="22"/>
+          <w:szCs w:val="22"/>
+        </w:rPr>
+        <w:t xml:space="preserve"> </w:t>
+      </w:r>
+      <w:proofErr w:type="spellStart"/>
+      <w:r>
+        <w:rPr>
+          <w:rFonts w:ascii="NewsGotT" w:hAnsi="NewsGotT"/>
+          <w:sz w:val="22"/>
+          <w:szCs w:val="22"/>
+        </w:rPr>
+        <w:t>React</w:t>
+      </w:r>
+      <w:proofErr w:type="spellEnd"/>
+      <w:r>
+        <w:rPr>
+          <w:rFonts w:ascii="NewsGotT" w:hAnsi="NewsGotT"/>
+          <w:sz w:val="22"/>
+          <w:szCs w:val="22"/>
+        </w:rPr>
+        <w:t xml:space="preserve">, </w:t>
+      </w:r>
+      <w:proofErr w:type="spellStart"/>
+      <w:r>
+        <w:rPr>
+          <w:rFonts w:ascii="NewsGotT" w:hAnsi="NewsGotT"/>
+          <w:sz w:val="22"/>
+          <w:szCs w:val="22"/>
+        </w:rPr>
+        <w:t>backend</w:t>
+      </w:r>
+      <w:proofErr w:type="spellEnd"/>
+      <w:r>
+        <w:rPr>
+          <w:rFonts w:ascii="NewsGotT" w:hAnsi="NewsGotT"/>
+          <w:sz w:val="22"/>
+          <w:szCs w:val="22"/>
+        </w:rPr>
+        <w:t xml:space="preserve"> Spring Boot, API Gateway, microservicios y base de datos MongoDB.</w:t>
       </w:r>
     </w:p>
     <w:p>
@@ -2122,8 +2168,8 @@
         <w:tblLook w:val="04A0" w:firstRow="1" w:lastRow="0" w:firstColumn="1" w:lastColumn="0" w:noHBand="0" w:noVBand="1"/>
       </w:tblPr>
       <w:tblGrid>
-        <w:gridCol w:w="4535"/>
-        <w:gridCol w:w="4526"/>
+        <w:gridCol w:w="4541"/>
+        <w:gridCol w:w="4520"/>
       </w:tblGrid>
       <w:tr>
         <w:trPr>
@@ -2140,7 +2186,6 @@
                 <w:rFonts w:ascii="NewsGotT" w:hAnsi="NewsGotT" w:hint="eastAsia"/>
               </w:rPr>
             </w:pPr>
-            <w:proofErr w:type="spellStart"/>
             <w:r>
               <w:rPr>
                 <w:rFonts w:ascii="NewsGotT" w:hAnsi="NewsGotT"/>
@@ -2149,7 +2194,6 @@
               </w:rPr>
               <w:t>Elemento</w:t>
             </w:r>
-            <w:proofErr w:type="spellEnd"/>
           </w:p>
         </w:tc>
         <w:tc>
@@ -2253,47 +2297,12 @@
                 <w:rFonts w:ascii="NewsGotT" w:hAnsi="NewsGotT" w:hint="eastAsia"/>
               </w:rPr>
             </w:pPr>
-            <w:proofErr w:type="spellStart"/>
             <w:r>
               <w:rPr>
                 <w:rFonts w:ascii="NewsGotT" w:hAnsi="NewsGotT"/>
-              </w:rPr>
-              <w:t>Microservicios</w:t>
-            </w:r>
-            <w:proofErr w:type="spellEnd"/>
-            <w:r>
-              <w:rPr>
-                <w:rFonts w:ascii="NewsGotT" w:hAnsi="NewsGotT"/>
-              </w:rPr>
-              <w:t xml:space="preserve"> Spring Boot </w:t>
-            </w:r>
-            <w:proofErr w:type="spellStart"/>
-            <w:r>
-              <w:rPr>
-                <w:rFonts w:ascii="NewsGotT" w:hAnsi="NewsGotT"/>
-              </w:rPr>
-              <w:t>expuestos</w:t>
-            </w:r>
-            <w:proofErr w:type="spellEnd"/>
-            <w:r>
-              <w:rPr>
-                <w:rFonts w:ascii="NewsGotT" w:hAnsi="NewsGotT"/>
-              </w:rPr>
-              <w:t xml:space="preserve"> </w:t>
-            </w:r>
-            <w:proofErr w:type="spellStart"/>
-            <w:r>
-              <w:rPr>
-                <w:rFonts w:ascii="NewsGotT" w:hAnsi="NewsGotT"/>
-              </w:rPr>
-              <w:t>mediante</w:t>
-            </w:r>
-            <w:proofErr w:type="spellEnd"/>
-            <w:r>
-              <w:rPr>
-                <w:rFonts w:ascii="NewsGotT" w:hAnsi="NewsGotT"/>
-              </w:rPr>
-              <w:t xml:space="preserve"> API Gateway.</w:t>
+                <w:lang w:val="es-ES"/>
+              </w:rPr>
+              <w:t>Microservicios Spring Boot desplegados en ambiente QA y expuestos mediante API Gateway.</w:t>
             </w:r>
           </w:p>
         </w:tc>
@@ -2342,9 +2351,9 @@
             <w:r>
               <w:rPr>
                 <w:rFonts w:ascii="NewsGotT" w:hAnsi="NewsGotT"/>
-                <w:lang w:val="es-CL"/>
-              </w:rPr>
-              <w:t>MongoDB con datos ficticios de usuarios, mascotas, empresas, citas, blogs, promociones y comentarios.</w:t>
+                <w:lang w:val="es-ES"/>
+              </w:rPr>
+              <w:t>Base de datos: MongoDB configurada para el ambiente QA con datos ficticios.</w:t>
             </w:r>
           </w:p>
         </w:tc>
@@ -2442,7 +2451,23 @@
                 <w:rFonts w:ascii="NewsGotT" w:hAnsi="NewsGotT"/>
                 <w:lang w:val="es-CL"/>
               </w:rPr>
-              <w:t>Capturas identificadas por código de caso de prueba, por ejemplo CP-01, CP-02, CP-03.</w:t>
+              <w:t xml:space="preserve">Capturas identificadas por código de caso de prueba, por </w:t>
+            </w:r>
+            <w:proofErr w:type="gramStart"/>
+            <w:r>
+              <w:rPr>
+                <w:rFonts w:ascii="NewsGotT" w:hAnsi="NewsGotT"/>
+                <w:lang w:val="es-CL"/>
+              </w:rPr>
+              <w:t>ejemplo</w:t>
+            </w:r>
+            <w:proofErr w:type="gramEnd"/>
+            <w:r>
+              <w:rPr>
+                <w:rFonts w:ascii="NewsGotT" w:hAnsi="NewsGotT"/>
+                <w:lang w:val="es-CL"/>
+              </w:rPr>
+              <w:t xml:space="preserve"> CP-01, CP-02, CP-03.</w:t>
             </w:r>
           </w:p>
         </w:tc>
@@ -2548,6 +2573,7 @@
         <w:rPr>
           <w:szCs w:val="22"/>
         </w:rPr>
+        <w:lastRenderedPageBreak/>
         <w:t>Los datos utilizados corresponden a información ficticia y controlada, evitando el uso de datos personales reales. Se emplean usuarios de prueba, empresas de prueba, mascotas ficticias, servicios de ejemplo, promociones, blogs y comentarios.</w:t>
       </w:r>
     </w:p>
@@ -31782,7 +31808,7 @@
         <w:pStyle w:val="Textbody"/>
         <w:jc w:val="center"/>
         <w:rPr>
-          <w:rFonts w:cs="Arial"/>
+          <w:rFonts w:cs="Arial" w:hint="eastAsia"/>
           <w:b/>
           <w:bCs/>
           <w:color w:val="000000"/>
@@ -39967,6 +39993,9 @@
           <w:numId w:val="0"/>
         </w:numPr>
         <w:ind w:left="432"/>
+        <w:rPr>
+          <w:rFonts w:hint="eastAsia"/>
+        </w:rPr>
       </w:pPr>
       <w:r>
         <w:rPr>
@@ -39983,7 +40012,7 @@
       <w:pPr>
         <w:pStyle w:val="Textbody"/>
         <w:rPr>
-          <w:rFonts w:cs="Arial"/>
+          <w:rFonts w:cs="Arial" w:hint="eastAsia"/>
           <w:color w:val="000000"/>
         </w:rPr>
       </w:pPr>
@@ -40125,31 +40154,15 @@
     <w:r>
       <w:t xml:space="preserve"> de </w:t>
     </w:r>
-    <w:r>
-      <w:fldChar w:fldCharType="begin"/>
-    </w:r>
-    <w:r>
-      <w:instrText xml:space="preserve"> NUMPAGES </w:instrText>
-    </w:r>
-    <w:r>
-      <w:rPr>
-        <w:rFonts w:hint="eastAsia"/>
-      </w:rPr>
-      <w:fldChar w:fldCharType="separate"/>
-    </w:r>
-    <w:r>
-      <w:rPr>
-        <w:rFonts w:hint="eastAsia"/>
-        <w:noProof/>
-      </w:rPr>
-      <w:t>9</w:t>
-    </w:r>
-    <w:r>
-      <w:rPr>
-        <w:noProof/>
-      </w:rPr>
-      <w:fldChar w:fldCharType="end"/>
-    </w:r>
+    <w:fldSimple w:instr=" NUMPAGES ">
+      <w:r>
+        <w:rPr>
+          <w:rFonts w:hint="eastAsia"/>
+          <w:noProof/>
+        </w:rPr>
+        <w:t>9</w:t>
+      </w:r>
+    </w:fldSimple>
   </w:p>
 </w:ftr>
 </file>
@@ -51006,7 +51019,6 @@
   <w:style w:type="character" w:default="1" w:styleId="Fuentedeprrafopredeter">
     <w:name w:val="Default Paragraph Font"/>
     <w:uiPriority w:val="1"/>
-    <w:semiHidden/>
     <w:unhideWhenUsed/>
   </w:style>
   <w:style w:type="table" w:default="1" w:styleId="Tablanormal">
@@ -51776,6 +51788,15 @@
 </file>
 
 <file path=customXml/item1.xml><?xml version="1.0" encoding="utf-8"?>
+<?mso-contentType ?>
+<FormTemplates xmlns="http://schemas.microsoft.com/sharepoint/v3/contenttype/forms">
+  <Display>DocumentLibraryForm</Display>
+  <Edit>DocumentLibraryForm</Edit>
+  <New>DocumentLibraryForm</New>
+</FormTemplates>
+</file>
+
+<file path=customXml/item2.xml><?xml version="1.0" encoding="utf-8"?>
 <ct:contentTypeSchema xmlns:ct="http://schemas.microsoft.com/office/2006/metadata/contentType" xmlns:ma="http://schemas.microsoft.com/office/2006/metadata/properties/metaAttributes" ct:_="" ma:_="" ma:contentTypeName="Documento" ma:contentTypeID="0x010100AF28BDBD65D93F4BA99B6439AFEA320E" ma:contentTypeVersion="10" ma:contentTypeDescription="Crear nuevo documento." ma:contentTypeScope="" ma:versionID="11d45d99e0339591c68aad091688ac92">
   <xsd:schema xmlns:xsd="http://www.w3.org/2001/XMLSchema" xmlns:xs="http://www.w3.org/2001/XMLSchema" xmlns:p="http://schemas.microsoft.com/office/2006/metadata/properties" xmlns:ns2="9b0ef35d-78e7-41bf-847f-3c0497ad5352" xmlns:ns3="3c969135-7855-44e0-a9fe-01d799f07605" targetNamespace="http://schemas.microsoft.com/office/2006/metadata/properties" ma:root="true" ma:fieldsID="0e603a3f7bf67670d682b80385fe4b00" ns2:_="" ns3:_="">
     <xsd:import namespace="9b0ef35d-78e7-41bf-847f-3c0497ad5352"/>
@@ -51976,15 +51997,6 @@
 </ct:contentTypeSchema>
 </file>
 
-<file path=customXml/item2.xml><?xml version="1.0" encoding="utf-8"?>
-<?mso-contentType ?>
-<FormTemplates xmlns="http://schemas.microsoft.com/sharepoint/v3/contenttype/forms">
-  <Display>DocumentLibraryForm</Display>
-  <Edit>DocumentLibraryForm</Edit>
-  <New>DocumentLibraryForm</New>
-</FormTemplates>
-</file>
-
 <file path=customXml/item3.xml><?xml version="1.0" encoding="utf-8"?>
 <p:properties xmlns:p="http://schemas.microsoft.com/office/2006/metadata/properties" xmlns:xsi="http://www.w3.org/2001/XMLSchema-instance" xmlns:pc="http://schemas.microsoft.com/office/infopath/2007/PartnerControls">
   <documentManagement/>
@@ -51992,6 +52004,14 @@
 </file>
 
 <file path=customXml/itemProps1.xml><?xml version="1.0" encoding="utf-8"?>
+<ds:datastoreItem xmlns:ds="http://schemas.openxmlformats.org/officeDocument/2006/customXml" ds:itemID="{72654922-4FCC-494D-93F7-F43064C530AD}">
+  <ds:schemaRefs>
+    <ds:schemaRef ds:uri="http://schemas.microsoft.com/sharepoint/v3/contenttype/forms"/>
+  </ds:schemaRefs>
+</ds:datastoreItem>
+</file>
+
+<file path=customXml/itemProps2.xml><?xml version="1.0" encoding="utf-8"?>
 <ds:datastoreItem xmlns:ds="http://schemas.openxmlformats.org/officeDocument/2006/customXml" ds:itemID="{8A6A4A46-F142-46C7-9854-3FE79CB2998C}">
   <ds:schemaRefs>
     <ds:schemaRef ds:uri="http://schemas.microsoft.com/office/2006/metadata/contentType"/>
@@ -52010,14 +52030,6 @@
 </ds:datastoreItem>
 </file>
 
-<file path=customXml/itemProps2.xml><?xml version="1.0" encoding="utf-8"?>
-<ds:datastoreItem xmlns:ds="http://schemas.openxmlformats.org/officeDocument/2006/customXml" ds:itemID="{72654922-4FCC-494D-93F7-F43064C530AD}">
-  <ds:schemaRefs>
-    <ds:schemaRef ds:uri="http://schemas.microsoft.com/sharepoint/v3/contenttype/forms"/>
-  </ds:schemaRefs>
-</ds:datastoreItem>
-</file>
-
 <file path=customXml/itemProps3.xml><?xml version="1.0" encoding="utf-8"?>
 <ds:datastoreItem xmlns:ds="http://schemas.openxmlformats.org/officeDocument/2006/customXml" ds:itemID="{B203E38B-4023-43A9-9B83-ED9E35A01FB5}">
   <ds:schemaRefs>

</xml_diff>